<commit_message>
fix: remove unprotected client status endpoint
</commit_message>
<xml_diff>
--- a/docs/tech-challenge-3/documento_entrega.docx
+++ b/docs/tech-challenge-3/documento_entrega.docx
@@ -7048,7 +7048,7 @@
                 <w:i w:val="0"/>
                 <w:sz w:val="20"/>
               </w:rPr>
-              <w:t>Revogação de token não é imediata (cache de 300 s)</w:t>
+              <w:t>Revogação de token não é imediata — janela de 15 min</w:t>
             </w:r>
           </w:p>
         </w:tc>
@@ -7068,7 +7068,7 @@
                 <w:i w:val="0"/>
                 <w:sz w:val="20"/>
               </w:rPr>
-              <w:t>Baixa</w:t>
+              <w:t>Média</w:t>
             </w:r>
           </w:p>
         </w:tc>
@@ -7088,7 +7088,7 @@
                 <w:i w:val="0"/>
                 <w:sz w:val="20"/>
               </w:rPr>
-              <w:t>Baixo</w:t>
+              <w:t>Médio</w:t>
             </w:r>
           </w:p>
         </w:tc>

</xml_diff>

<commit_message>
docs: update delivery report and slides
</commit_message>
<xml_diff>
--- a/docs/tech-challenge-3/documento_entrega.docx
+++ b/docs/tech-challenge-3/documento_entrega.docx
@@ -163,7 +163,7 @@
           <w:i w:val="0"/>
           <w:sz w:val="24"/>
         </w:rPr>
-        <w:t>Os quatro repositórios exigidos, o vídeo de demonstração e a documentação arquitetural. Todos com o usuário soat-architecture adicionado como colaborador.</w:t>
+        <w:t>Esta seção reúne os links dos quatro repositórios, do vídeo de demonstração e da documentação arquitetural. O usuário soat-architecture foi adicionado como colaborador em todos os repositórios. A aplicação oficina-api permanece no repositório utilizado nas fases anteriores, tech-challenge-1, de modo a preservar o histórico.</w:t>
       </w:r>
     </w:p>
     <w:tbl>
@@ -263,7 +263,7 @@
                 <w:i w:val="0"/>
                 <w:sz w:val="20"/>
               </w:rPr>
-              <w:t>oficina-api</w:t>
+              <w:t>tech-challenge-1</w:t>
             </w:r>
           </w:p>
         </w:tc>
@@ -283,7 +283,7 @@
                 <w:i w:val="0"/>
                 <w:sz w:val="20"/>
               </w:rPr>
-              <w:t>Aplicação Spring Boot</w:t>
+              <w:t>Aplicação oficina-api (Spring Boot)</w:t>
             </w:r>
           </w:p>
         </w:tc>
@@ -303,7 +303,7 @@
                 <w:i w:val="0"/>
                 <w:sz w:val="20"/>
               </w:rPr>
-              <w:t>github.com/&lt;org&gt;/oficina-api</w:t>
+              <w:t>github.com/Guilherme-Fumagali/tech-challenge-1</w:t>
             </w:r>
           </w:p>
         </w:tc>
@@ -365,7 +365,7 @@
                 <w:i w:val="0"/>
                 <w:sz w:val="20"/>
               </w:rPr>
-              <w:t>github.com/&lt;org&gt;/oficina-auth-lambda</w:t>
+              <w:t>github.com/Guilherme-Fumagali/oficina-auth-lambda</w:t>
             </w:r>
           </w:p>
         </w:tc>
@@ -427,7 +427,7 @@
                 <w:i w:val="0"/>
                 <w:sz w:val="20"/>
               </w:rPr>
-              <w:t>github.com/&lt;org&gt;/oficina-infra-k8s</w:t>
+              <w:t>github.com/Guilherme-Fumagali/oficina-infra-k8s</w:t>
             </w:r>
           </w:p>
         </w:tc>
@@ -489,7 +489,7 @@
                 <w:i w:val="0"/>
                 <w:sz w:val="20"/>
               </w:rPr>
-              <w:t>github.com/&lt;org&gt;/oficina-infra-db</w:t>
+              <w:t>github.com/Guilherme-Fumagali/oficina-infra-db</w:t>
             </w:r>
           </w:p>
         </w:tc>
@@ -574,7 +574,7 @@
                 <w:i w:val="0"/>
                 <w:sz w:val="20"/>
               </w:rPr>
-              <w:t>Vídeo de demonstração (≤ 15 min)</w:t>
+              <w:t>Vídeo de demonstração (até 15 min)</w:t>
             </w:r>
           </w:p>
         </w:tc>
@@ -616,7 +616,7 @@
                 <w:i w:val="0"/>
                 <w:sz w:val="20"/>
               </w:rPr>
-              <w:t>Swagger / OpenAPI</w:t>
+              <w:t>Deploy ativo em homologação (API Gateway)</w:t>
             </w:r>
           </w:p>
         </w:tc>
@@ -636,7 +636,7 @@
                 <w:i w:val="0"/>
                 <w:sz w:val="20"/>
               </w:rPr>
-              <w:t>&lt;url-do-gateway&gt;/swagger-ui.html</w:t>
+              <w:t>&lt;preencher com o output api_gateway_url&gt;</w:t>
             </w:r>
           </w:p>
         </w:tc>
@@ -658,7 +658,7 @@
                 <w:i w:val="0"/>
                 <w:sz w:val="20"/>
               </w:rPr>
-              <w:t>Deploy ativo (API Gateway)</w:t>
+              <w:t>Swagger / OpenAPI</w:t>
             </w:r>
           </w:p>
         </w:tc>
@@ -678,7 +678,7 @@
                 <w:i w:val="0"/>
                 <w:sz w:val="20"/>
               </w:rPr>
-              <w:t>&lt;preencher com o output api_gateway_url&gt;</w:t>
+              <w:t>&lt;api_gateway_url&gt;/swagger-ui.html</w:t>
             </w:r>
           </w:p>
         </w:tc>
@@ -742,7 +742,7 @@
                 <w:i w:val="0"/>
                 <w:sz w:val="20"/>
               </w:rPr>
-              <w:t>RFCs, ADRs e diagramas</w:t>
+              <w:t>RFCs, ADRs, diagramas e débitos técnicos</w:t>
             </w:r>
           </w:p>
         </w:tc>
@@ -762,7 +762,7 @@
                 <w:i w:val="0"/>
                 <w:sz w:val="20"/>
               </w:rPr>
-              <w:t>oficina-api/docs/tech-challenge-3/</w:t>
+              <w:t>github.com/Guilherme-Fumagali/tech-challenge-1/tree/main/docs/tech-challenge-3</w:t>
             </w:r>
           </w:p>
         </w:tc>
@@ -809,7 +809,7 @@
           <w:i w:val="0"/>
           <w:sz w:val="24"/>
         </w:rPr>
-        <w:t>A oficina mecânica que este sistema atende expandiu para múltiplas unidades, e a base de clientes cresce de forma constante. O que era um problema de organização interna — substituir planilhas por um sistema — passou a ser um problema de operação: controlar quem acessa o quê, enxergar o comportamento do sistema em tempo real e sustentar picos sem intervenção manual.</w:t>
+        <w:t>A oficina mecânica atendida por este sistema expandiu sua operação para múltiplas unidades, e a base de clientes está em crescimento. Com isso, as necessidades deixaram de se limitar à organização interna e passaram a envolver aspectos operacionais: controle de acesso, visibilidade do comportamento do sistema em tempo real e capacidade de absorver picos de uso sem intervenção manual.</w:t>
       </w:r>
     </w:p>
     <w:p>
@@ -825,7 +825,7 @@
           <w:i w:val="0"/>
           <w:sz w:val="24"/>
         </w:rPr>
-        <w:t>Esta fase não adiciona funcionalidade de negócio. Todos os requisitos tratam de capacidade operacional: autenticação segura na borda, segregação de responsabilidades entre repositórios, infraestrutura de nuvem declarada em código e observabilidade com plataforma de mercado.</w:t>
+        <w:t>Os requisitos desta fase não acrescentam funcionalidades de negócio. Eles tratam de capacidade operacional: autenticação na borda, segregação de responsabilidades entre repositórios, infraestrutura de nuvem declarada em código e observabilidade com uma plataforma de mercado.</w:t>
       </w:r>
     </w:p>
     <w:p>
@@ -843,7 +843,7 @@
           <w:color w:val="1F3A5F"/>
           <w:sz w:val="24"/>
         </w:rPr>
-        <w:t>1.1 O que a Fase 2 já havia entregue</w:t>
+        <w:t>1.1 Situação ao final da Fase 2</w:t>
       </w:r>
     </w:p>
     <w:p>
@@ -859,7 +859,7 @@
           <w:i w:val="0"/>
           <w:sz w:val="24"/>
         </w:rPr>
-        <w:t>Boa parte da infraestrutura exigida pelo enunciado da Fase 3 já existia. O levantamento do repositório antes de iniciar a implementação mostrou que dois dos cinco requisitos de infraestrutura estavam atendidos:</w:t>
+        <w:t>Parte da infraestrutura exigida já havia sido implementada na Fase 2. O levantamento realizado antes do início da implementação indicou que três dos cinco requisitos de infraestrutura estavam atendidos:</w:t>
       </w:r>
     </w:p>
     <w:tbl>
@@ -956,7 +956,7 @@
                 <w:i w:val="0"/>
                 <w:sz w:val="20"/>
               </w:rPr>
-              <w:t>EKS + HPA por CPU e memória, já provisionados</w:t>
+              <w:t>EKS com HPA por CPU e memória, já provisionados</w:t>
             </w:r>
           </w:p>
         </w:tc>
@@ -998,7 +998,7 @@
                 <w:i w:val="0"/>
                 <w:sz w:val="20"/>
               </w:rPr>
-              <w:t>RDS PostgreSQL 16, publicly_accessible = false</w:t>
+              <w:t>RDS PostgreSQL 16, sem acesso público</w:t>
             </w:r>
           </w:p>
         </w:tc>
@@ -1040,7 +1040,7 @@
                 <w:i w:val="0"/>
                 <w:sz w:val="20"/>
               </w:rPr>
-              <w:t>VPC, EKS, RDS e backend de state em S3 + DynamoDB</w:t>
+              <w:t>VPC, EKS, RDS e backend de state em S3 e DynamoDB</w:t>
             </w:r>
           </w:p>
         </w:tc>
@@ -1082,7 +1082,7 @@
                 <w:i w:val="0"/>
                 <w:sz w:val="20"/>
               </w:rPr>
-              <w:t>Não existia — Spring Security era a única borda</w:t>
+              <w:t>Inexistente; a proteção era feita apenas pelo Spring Security</w:t>
             </w:r>
           </w:p>
         </w:tc>
@@ -1124,7 +1124,7 @@
                 <w:i w:val="0"/>
                 <w:sz w:val="20"/>
               </w:rPr>
-              <w:t>Não existia — o monolito emitia o próprio token</w:t>
+              <w:t>Inexistente; a própria aplicação emitia o token</w:t>
             </w:r>
           </w:p>
         </w:tc>
@@ -1148,7 +1148,79 @@
           <w:i w:val="0"/>
           <w:sz w:val="24"/>
         </w:rPr>
-        <w:t>O trabalho real concentrou-se, portanto, em três frentes: mover a autenticação para fora da aplicação, segregar o monorepo em quatro repositórios com esteiras próprias, e instrumentar o sistema de ponta a ponta.</w:t>
+        <w:t>A implementação concentrou-se, portanto, em três frentes: a transferência da autenticação para fora da aplicação, a divisão do repositório único em quatro repositórios com pipelines próprios e a instrumentação do sistema para observabilidade.</w:t>
+      </w:r>
+    </w:p>
+    <w:p>
+      <w:pPr>
+        <w:keepNext/>
+        <w:spacing w:before="160" w:after="40"/>
+        <w:jc w:val="center"/>
+      </w:pPr>
+      <w:r>
+        <w:rPr>
+          <w:rFonts w:ascii="Times New Roman" w:hAnsi="Times New Roman"/>
+          <w:b/>
+          <w:i w:val="0"/>
+          <w:sz w:val="20"/>
+        </w:rPr>
+        <w:t>Figura 1 — Diagrama de contexto (C4, nível 1)</w:t>
+      </w:r>
+    </w:p>
+    <w:p>
+      <w:pPr>
+        <w:keepNext/>
+        <w:jc w:val="center"/>
+      </w:pPr>
+      <w:r>
+        <w:drawing>
+          <wp:inline xmlns:a="http://schemas.openxmlformats.org/drawingml/2006/main" xmlns:pic="http://schemas.openxmlformats.org/drawingml/2006/picture">
+            <wp:extent cx="4680000" cy="5310000"/>
+            <wp:docPr id="1" name="Picture 1"/>
+            <wp:cNvGraphicFramePr>
+              <a:graphicFrameLocks noChangeAspect="1"/>
+            </wp:cNvGraphicFramePr>
+            <a:graphic>
+              <a:graphicData uri="http://schemas.openxmlformats.org/drawingml/2006/picture">
+                <pic:pic>
+                  <pic:nvPicPr>
+                    <pic:cNvPr id="0" name="c1-contexto.png"/>
+                    <pic:cNvPicPr/>
+                  </pic:nvPicPr>
+                  <pic:blipFill>
+                    <a:blip r:embed="rId9"/>
+                    <a:stretch>
+                      <a:fillRect/>
+                    </a:stretch>
+                  </pic:blipFill>
+                  <pic:spPr>
+                    <a:xfrm>
+                      <a:off x="0" y="0"/>
+                      <a:ext cx="4680000" cy="5310000"/>
+                    </a:xfrm>
+                    <a:prstGeom prst="rect"/>
+                  </pic:spPr>
+                </pic:pic>
+              </a:graphicData>
+            </a:graphic>
+          </wp:inline>
+        </w:drawing>
+      </w:r>
+    </w:p>
+    <w:p>
+      <w:pPr>
+        <w:spacing w:after="200"/>
+        <w:jc w:val="center"/>
+      </w:pPr>
+      <w:r>
+        <w:rPr>
+          <w:rFonts w:ascii="Times New Roman" w:hAnsi="Times New Roman"/>
+          <w:b w:val="0"/>
+          <w:i w:val="0"/>
+          <w:color w:val="555555"/>
+          <w:sz w:val="20"/>
+        </w:rPr>
+        <w:t>Fonte: elaborado pelos autores.</w:t>
       </w:r>
     </w:p>
     <w:p>
@@ -1189,7 +1261,7 @@
           <w:color w:val="1F3A5F"/>
           <w:sz w:val="24"/>
         </w:rPr>
-        <w:t>2.1 A aplicação deixou de emitir tokens</w:t>
+        <w:t>2.1 Emissão de tokens transferida para a função serverless</w:t>
       </w:r>
     </w:p>
     <w:p>
@@ -1205,7 +1277,7 @@
           <w:i w:val="0"/>
           <w:sz w:val="24"/>
         </w:rPr>
-        <w:t>A decisão mais estrutural da fase. Até a Fase 2, o próprio monolito autenticava: um AuthController expunha login, refresh e logout, o JwtService assinava o token, e um único usuário admin vivia em memória.</w:t>
+        <w:t>Até a Fase 2, a autenticação era realizada pela própria aplicação: um AuthController expunha as operações de login, refresh e logout, o JwtService assinava os tokens e um único usuário administrador era mantido em memória.</w:t>
       </w:r>
     </w:p>
     <w:p>
@@ -1221,7 +1293,7 @@
           <w:i w:val="0"/>
           <w:sz w:val="24"/>
         </w:rPr>
-        <w:t>A partir da Fase 3, quem emite é uma função Lambda. A aplicação virou exclusivamente validadora. Foram removidos o AuthController, o UserDetailsConfig, o RefreshTokenService e os três DTOs associados; o JwtService perdeu o método de geração e manteve apenas a verificação de assinatura e a leitura de claims.</w:t>
+        <w:t>Na Fase 3, a emissão do token passou a ser responsabilidade de uma função Lambda, e a aplicação ficou restrita à validação. Foram removidos o AuthController, o UserDetailsConfig, o RefreshTokenService e os três DTOs associados. O JwtService manteve apenas a verificação de assinatura e a leitura de claims.</w:t>
       </w:r>
     </w:p>
     <w:p>
@@ -1237,7 +1309,7 @@
           <w:i w:val="0"/>
           <w:sz w:val="24"/>
         </w:rPr>
-        <w:t>O ganho não é performance — é ter um único emissor: um lugar para rotacionar a chave, uma semântica de claims e um ponto de auditoria. A alternativa de manter dois emissores, um para clientes e outro para administradores, foi descartada por criar dois domínios de confiança sobre a mesma API.</w:t>
+        <w:t>A principal motivação é concentrar a emissão em um único componente, o que simplifica a rotação da chave, padroniza as claims e centraliza a auditoria. A alternativa de manter dois emissores, um para clientes e outro para administradores, foi descartada por criar dois domínios de confiança sobre a mesma API.</w:t>
       </w:r>
     </w:p>
     <w:p>
@@ -1255,7 +1327,7 @@
           <w:color w:val="1F3A5F"/>
           <w:sz w:val="24"/>
         </w:rPr>
-        <w:t>2.2 Métricas de negócio no domínio, sem poluir os casos de uso</w:t>
+        <w:t>2.2 Métricas de negócio emitidas a partir do domínio</w:t>
       </w:r>
     </w:p>
     <w:p>
@@ -1271,7 +1343,7 @@
           <w:i w:val="0"/>
           <w:sz w:val="24"/>
         </w:rPr>
-        <w:t>Os três painéis exigidos pelo enunciado — volume diário de ordens, tempo médio por status e erros de integração — não saem do agente de APM. Ele entrega latência e erro HTTP, mas não sabe o que é uma ordem de serviço.</w:t>
+        <w:t>Os três painéis exigidos pelo enunciado (volume diário de ordens, tempo médio por status e erros de integração) não são fornecidos pelo agente de APM, que coleta latência e erros HTTP, mas não possui informação sobre o ciclo de vida de uma ordem de serviço.</w:t>
       </w:r>
     </w:p>
     <w:p>
@@ -1287,12 +1359,12 @@
           <w:i w:val="0"/>
           <w:sz w:val="24"/>
         </w:rPr>
-        <w:t>A solução óbvia seria injetar o MeterRegistry em cada caso de uso, alterando nove construtores. Em vez disso, o agregado OrdemServico passou a acumular eventos de transição num método único, que já valida a mudança de status e mede a permanência no estado anterior; o adaptador de persistência drena esses eventos no salvar, que é o funil por onde toda transição passa.</w:t>
+        <w:t>Uma alternativa seria injetar o MeterRegistry em cada caso de uso, o que exigiria alterar nove construtores. Optou-se por fazer o agregado OrdemServico registrar eventos de transição em um método único, que também valida a mudança de status e calcula o tempo de permanência no estado anterior. O adaptador de persistência consome esses eventos ao salvar a ordem, ponto pelo qual todas as transições passam.</w:t>
       </w:r>
     </w:p>
     <w:p>
       <w:pPr>
-        <w:spacing w:after="120"/>
+        <w:spacing w:before="0" w:after="120"/>
         <w:ind w:firstLine="709"/>
         <w:jc w:val="both"/>
       </w:pPr>
@@ -1303,25 +1375,151 @@
           <w:i w:val="0"/>
           <w:sz w:val="24"/>
         </w:rPr>
-        <w:t xml:space="preserve">O resultado é que a métrica descreve </w:t>
+        <w:t>Dessa forma, a métrica representa o evento de negócio, e não a requisição HTTP, e permanece correta caso a ordem passe a ser aberta por outro canal. O domínio também não depende do Micrometer.</w:t>
       </w:r>
+    </w:p>
+    <w:p>
+      <w:pPr>
+        <w:keepNext/>
+        <w:spacing w:before="160" w:after="40"/>
+        <w:jc w:val="center"/>
+      </w:pPr>
       <w:r>
         <w:rPr>
           <w:rFonts w:ascii="Times New Roman" w:hAnsi="Times New Roman"/>
           <w:b/>
           <w:i w:val="0"/>
-          <w:sz w:val="24"/>
+          <w:sz w:val="20"/>
         </w:rPr>
-        <w:t>evento de negócio</w:t>
+        <w:t>Figura 2 — Componentes da aplicação oficina-api (C4, nível 3)</w:t>
       </w:r>
+    </w:p>
+    <w:p>
+      <w:pPr>
+        <w:keepNext/>
+        <w:jc w:val="center"/>
+      </w:pPr>
+      <w:r>
+        <w:drawing>
+          <wp:inline xmlns:a="http://schemas.openxmlformats.org/drawingml/2006/main" xmlns:pic="http://schemas.openxmlformats.org/drawingml/2006/picture">
+            <wp:extent cx="4500000" cy="8050371"/>
+            <wp:docPr id="2" name="Picture 2"/>
+            <wp:cNvGraphicFramePr>
+              <a:graphicFrameLocks noChangeAspect="1"/>
+            </wp:cNvGraphicFramePr>
+            <a:graphic>
+              <a:graphicData uri="http://schemas.openxmlformats.org/drawingml/2006/picture">
+                <pic:pic>
+                  <pic:nvPicPr>
+                    <pic:cNvPr id="0" name="c3-componentes.png"/>
+                    <pic:cNvPicPr/>
+                  </pic:nvPicPr>
+                  <pic:blipFill>
+                    <a:blip r:embed="rId10"/>
+                    <a:stretch>
+                      <a:fillRect/>
+                    </a:stretch>
+                  </pic:blipFill>
+                  <pic:spPr>
+                    <a:xfrm>
+                      <a:off x="0" y="0"/>
+                      <a:ext cx="4500000" cy="8050371"/>
+                    </a:xfrm>
+                    <a:prstGeom prst="rect"/>
+                  </pic:spPr>
+                </pic:pic>
+              </a:graphicData>
+            </a:graphic>
+          </wp:inline>
+        </w:drawing>
+      </w:r>
+    </w:p>
+    <w:p>
+      <w:pPr>
+        <w:spacing w:after="200"/>
+        <w:jc w:val="center"/>
+      </w:pPr>
       <w:r>
         <w:rPr>
           <w:rFonts w:ascii="Times New Roman" w:hAnsi="Times New Roman"/>
           <w:b w:val="0"/>
           <w:i w:val="0"/>
-          <w:sz w:val="24"/>
+          <w:color w:val="555555"/>
+          <w:sz w:val="20"/>
         </w:rPr>
-        <w:t>, não requisição HTTP: se amanhã a ordem for aberta por outro canal, a contagem continua correta. E o domínio não conhece Micrometer.</w:t>
+        <w:t>Fonte: elaborado pelos autores.</w:t>
+      </w:r>
+    </w:p>
+    <w:p>
+      <w:pPr>
+        <w:keepNext/>
+        <w:spacing w:before="160" w:after="40"/>
+        <w:jc w:val="center"/>
+      </w:pPr>
+      <w:r>
+        <w:rPr>
+          <w:rFonts w:ascii="Times New Roman" w:hAnsi="Times New Roman"/>
+          <w:b/>
+          <w:i w:val="0"/>
+          <w:sz w:val="20"/>
+        </w:rPr>
+        <w:t>Figura 3 — Sequência de abertura de ordem de serviço</w:t>
+      </w:r>
+    </w:p>
+    <w:p>
+      <w:pPr>
+        <w:keepNext/>
+        <w:jc w:val="center"/>
+      </w:pPr>
+      <w:r>
+        <w:drawing>
+          <wp:inline xmlns:a="http://schemas.openxmlformats.org/drawingml/2006/main" xmlns:pic="http://schemas.openxmlformats.org/drawingml/2006/picture">
+            <wp:extent cx="5760000" cy="3470852"/>
+            <wp:docPr id="3" name="Picture 3"/>
+            <wp:cNvGraphicFramePr>
+              <a:graphicFrameLocks noChangeAspect="1"/>
+            </wp:cNvGraphicFramePr>
+            <a:graphic>
+              <a:graphicData uri="http://schemas.openxmlformats.org/drawingml/2006/picture">
+                <pic:pic>
+                  <pic:nvPicPr>
+                    <pic:cNvPr id="0" name="sequencia-abertura-os.png"/>
+                    <pic:cNvPicPr/>
+                  </pic:nvPicPr>
+                  <pic:blipFill>
+                    <a:blip r:embed="rId11"/>
+                    <a:stretch>
+                      <a:fillRect/>
+                    </a:stretch>
+                  </pic:blipFill>
+                  <pic:spPr>
+                    <a:xfrm>
+                      <a:off x="0" y="0"/>
+                      <a:ext cx="5760000" cy="3470852"/>
+                    </a:xfrm>
+                    <a:prstGeom prst="rect"/>
+                  </pic:spPr>
+                </pic:pic>
+              </a:graphicData>
+            </a:graphic>
+          </wp:inline>
+        </w:drawing>
+      </w:r>
+    </w:p>
+    <w:p>
+      <w:pPr>
+        <w:spacing w:after="200"/>
+        <w:jc w:val="center"/>
+      </w:pPr>
+      <w:r>
+        <w:rPr>
+          <w:rFonts w:ascii="Times New Roman" w:hAnsi="Times New Roman"/>
+          <w:b w:val="0"/>
+          <w:i w:val="0"/>
+          <w:color w:val="555555"/>
+          <w:sz w:val="20"/>
+        </w:rPr>
+        <w:t>Fonte: elaborado pelos autores.</w:t>
       </w:r>
     </w:p>
     <w:p>
@@ -1355,7 +1553,7 @@
           <w:i w:val="0"/>
           <w:sz w:val="24"/>
         </w:rPr>
-        <w:t>Duas migrations, ambas motivadas por requisito e não por conveniência:</w:t>
+        <w:t>Foram criadas duas migrations, ambas motivadas por requisitos da fase:</w:t>
       </w:r>
     </w:p>
     <w:tbl>
@@ -1475,7 +1673,7 @@
                 <w:i w:val="0"/>
                 <w:sz w:val="20"/>
               </w:rPr>
-              <w:t>clientes.status + constraint</w:t>
+              <w:t>clientes.status e constraint</w:t>
             </w:r>
           </w:p>
         </w:tc>
@@ -1495,7 +1693,7 @@
                 <w:i w:val="0"/>
                 <w:sz w:val="20"/>
               </w:rPr>
-              <w:t>A Lambda consulta a existência E o status do cliente</w:t>
+              <w:t>A Lambda consulta a existência e o status do cliente</w:t>
             </w:r>
           </w:p>
         </w:tc>
@@ -1681,7 +1879,7 @@
                 <w:i w:val="0"/>
                 <w:sz w:val="20"/>
               </w:rPr>
-              <w:t>Sem ela não há como medir permanência por status</w:t>
+              <w:t>Necessária para medir a permanência por status</w:t>
             </w:r>
           </w:p>
         </w:tc>
@@ -1705,7 +1903,7 @@
           <w:i w:val="0"/>
           <w:sz w:val="24"/>
         </w:rPr>
-        <w:t>O DEFAULT 'ATIVO' na coluna de status garante que os registros existentes continuem autenticando após o deploy. O backfill da V7 usa COALESCE sobre as datas existentes — a melhor aproximação disponível para ordens antigas.</w:t>
+        <w:t>O valor padrão 'ATIVO' na coluna de status mantém a autenticação dos registros existentes após o deploy. O preenchimento da V7 utiliza COALESCE sobre as datas já registradas, que é a melhor aproximação disponível para as ordens antigas.</w:t>
       </w:r>
     </w:p>
     <w:p>
@@ -1723,7 +1921,7 @@
           <w:color w:val="1F3A5F"/>
           <w:sz w:val="24"/>
         </w:rPr>
-        <w:t>2.4 Débitos técnicos da Fase 2 — situação</w:t>
+        <w:t>2.4 Débitos técnicos da Fase 2</w:t>
       </w:r>
     </w:p>
     <w:p>
@@ -1739,7 +1937,7 @@
           <w:i w:val="0"/>
           <w:sz w:val="24"/>
         </w:rPr>
-        <w:t>A Fase 2 encerrou com um débito aberto, o DT-01: o e-mail de aprovação de orçamento exibe apenas o valor total, sem detalhar quais serviços e peças compõem o valor.</w:t>
+        <w:t>A Fase 2 foi encerrada com um débito aberto, o DT-01: o e-mail de aprovação de orçamento apresenta apenas o valor total, sem detalhar os serviços e as peças que o compõem.</w:t>
       </w:r>
     </w:p>
     <w:p>
@@ -1755,7 +1953,7 @@
           <w:i w:val="0"/>
           <w:sz w:val="24"/>
         </w:rPr>
-        <w:t>Ele permanece aberto. O escopo da Fase 3 é infraestrutura, segurança e observabilidade — nenhum requisito toca o conteúdo da notificação. Quitá-lo junto com uma eventual migração da notificação para SNS/SES é a oportunidade natural, e segue adiado enquanto essa migração não estiver no escopo.</w:t>
+        <w:t>O débito permanece aberto, pois o escopo da Fase 3 é infraestrutura, segurança e observabilidade, e nenhum requisito envolve o conteúdo da notificação. A correção está prevista para quando a notificação for migrada para SNS/SES.</w:t>
       </w:r>
     </w:p>
     <w:p>
@@ -1796,7 +1994,7 @@
           <w:color w:val="1F3A5F"/>
           <w:sz w:val="24"/>
         </w:rPr>
-        <w:t>3.1 O fluxo</w:t>
+        <w:t>3.1 Fluxo de autenticação</w:t>
       </w:r>
     </w:p>
     <w:p>
@@ -1812,7 +2010,7 @@
           <w:i w:val="0"/>
           <w:sz w:val="24"/>
         </w:rPr>
-        <w:t>O cliente informa o CPF ao API Gateway, que encaminha para a função Lambda. Ela normaliza o CPF e valida o dígito verificador antes de qualquer acesso ao banco; consulta a existência e o status do cliente; e, se estiver ativo, assina um JWT de quinze minutos. Nas requisições seguintes, um Lambda authorizer valida a assinatura na borda, com cache de trezentos segundos.</w:t>
+        <w:t>O cliente envia o CPF ao API Gateway, que encaminha a requisição para a função Lambda. A função normaliza o CPF e valida o dígito verificador antes de consultar o banco de dados; em seguida, verifica a existência e o status do cliente e, se ele estiver ativo, assina um JWT com validade de quinze minutos. Nas requisições seguintes, um Lambda authorizer valida a assinatura na borda, com cache de trezentos segundos.</w:t>
       </w:r>
     </w:p>
     <w:p>
@@ -1833,7 +2031,7 @@
         <w:br/>
         <w:t xml:space="preserve">  → 200  { accessToken, tokenType: "Bearer", expiresIn: 900 }</w:t>
         <w:br/>
-        <w:t xml:space="preserve">  → 400  CPF_INVALIDO           (sem tocar no banco)</w:t>
+        <w:t xml:space="preserve">  → 400  CPF_INVALIDO           (sem consulta ao banco)</w:t>
         <w:br/>
         <w:t xml:space="preserve">  → 404  CLIENTE_NAO_ENCONTRADO</w:t>
         <w:br/>
@@ -1842,7 +2040,7 @@
     </w:p>
     <w:p>
       <w:pPr>
-        <w:spacing w:after="120"/>
+        <w:spacing w:before="0" w:after="120"/>
         <w:ind w:firstLine="709"/>
         <w:jc w:val="both"/>
       </w:pPr>
@@ -1853,17 +2051,15 @@
           <w:i w:val="0"/>
           <w:sz w:val="24"/>
         </w:rPr>
-        <w:t xml:space="preserve">As respostas de 404 e 403 carregam </w:t>
+        <w:t>As respostas 404 e 403 retornam a mesma mensagem. O código específico é mantido nos logs para fins de suporte, enquanto o corpo da resposta é genérico, para impedir que o endpoint seja usado para descobrir quais CPFs estão cadastrados.</w:t>
       </w:r>
-      <w:r>
-        <w:rPr>
-          <w:rFonts w:ascii="Times New Roman" w:hAnsi="Times New Roman"/>
-          <w:b/>
-          <w:i w:val="0"/>
-          <w:sz w:val="24"/>
-        </w:rPr>
-        <w:t>a mesma mensagem</w:t>
-      </w:r>
+    </w:p>
+    <w:p>
+      <w:pPr>
+        <w:spacing w:before="0" w:after="120"/>
+        <w:ind w:firstLine="709"/>
+        <w:jc w:val="both"/>
+      </w:pPr>
       <w:r>
         <w:rPr>
           <w:rFonts w:ascii="Times New Roman" w:hAnsi="Times New Roman"/>
@@ -1871,23 +2067,79 @@
           <w:i w:val="0"/>
           <w:sz w:val="24"/>
         </w:rPr>
-        <w:t>. O código específico existe para o log e para o suporte; o corpo é genérico de propósito, para que ninguém use o endpoint como oráculo para descobrir quais CPFs existem na base.</w:t>
+        <w:t>O subject do token é o UUID do cliente, e não o CPF, para evitar que esse dado apareça nos logs das requisições subsequentes.</w:t>
       </w:r>
     </w:p>
     <w:p>
       <w:pPr>
-        <w:spacing w:before="0" w:after="120"/>
-        <w:ind w:firstLine="709"/>
-        <w:jc w:val="both"/>
+        <w:keepNext/>
+        <w:spacing w:before="160" w:after="40"/>
+        <w:jc w:val="center"/>
+      </w:pPr>
+      <w:r>
+        <w:rPr>
+          <w:rFonts w:ascii="Times New Roman" w:hAnsi="Times New Roman"/>
+          <w:b/>
+          <w:i w:val="0"/>
+          <w:sz w:val="20"/>
+        </w:rPr>
+        <w:t>Figura 4 — Sequência de autenticação por CPF e consumo de rota protegida</w:t>
+      </w:r>
+    </w:p>
+    <w:p>
+      <w:pPr>
+        <w:keepNext/>
+        <w:jc w:val="center"/>
+      </w:pPr>
+      <w:r>
+        <w:drawing>
+          <wp:inline xmlns:a="http://schemas.openxmlformats.org/drawingml/2006/main" xmlns:pic="http://schemas.openxmlformats.org/drawingml/2006/picture">
+            <wp:extent cx="5760000" cy="5524305"/>
+            <wp:docPr id="4" name="Picture 4"/>
+            <wp:cNvGraphicFramePr>
+              <a:graphicFrameLocks noChangeAspect="1"/>
+            </wp:cNvGraphicFramePr>
+            <a:graphic>
+              <a:graphicData uri="http://schemas.openxmlformats.org/drawingml/2006/picture">
+                <pic:pic>
+                  <pic:nvPicPr>
+                    <pic:cNvPr id="0" name="sequencia-autenticacao.png"/>
+                    <pic:cNvPicPr/>
+                  </pic:nvPicPr>
+                  <pic:blipFill>
+                    <a:blip r:embed="rId12"/>
+                    <a:stretch>
+                      <a:fillRect/>
+                    </a:stretch>
+                  </pic:blipFill>
+                  <pic:spPr>
+                    <a:xfrm>
+                      <a:off x="0" y="0"/>
+                      <a:ext cx="5760000" cy="5524305"/>
+                    </a:xfrm>
+                    <a:prstGeom prst="rect"/>
+                  </pic:spPr>
+                </pic:pic>
+              </a:graphicData>
+            </a:graphic>
+          </wp:inline>
+        </w:drawing>
+      </w:r>
+    </w:p>
+    <w:p>
+      <w:pPr>
+        <w:spacing w:after="200"/>
+        <w:jc w:val="center"/>
       </w:pPr>
       <w:r>
         <w:rPr>
           <w:rFonts w:ascii="Times New Roman" w:hAnsi="Times New Roman"/>
           <w:b w:val="0"/>
           <w:i w:val="0"/>
-          <w:sz w:val="24"/>
+          <w:color w:val="555555"/>
+          <w:sz w:val="20"/>
         </w:rPr>
-        <w:t>O subject do token é o UUID do cliente, não o CPF. É uma decisão deliberada: evita que o identificador se espalhe pelos logs de todas as requisições seguintes.</w:t>
+        <w:t>Fonte: elaborado pelos autores.</w:t>
       </w:r>
     </w:p>
     <w:p>
@@ -1905,7 +2157,7 @@
           <w:color w:val="1F3A5F"/>
           <w:sz w:val="24"/>
         </w:rPr>
-        <w:t>3.2 A escolha do gateway</w:t>
+        <w:t>3.2 Escolha do gateway</w:t>
       </w:r>
     </w:p>
     <w:p>
@@ -1921,7 +2173,7 @@
           <w:i w:val="0"/>
           <w:sz w:val="24"/>
         </w:rPr>
-        <w:t>As disciplinas da fase apresentam três caminhos. A comparação, e a razão da escolha:</w:t>
+        <w:t>O material das disciplinas apresenta três opções de gateway. A comparação entre elas é apresentada a seguir:</w:t>
       </w:r>
     </w:p>
     <w:tbl>
@@ -1977,7 +2229,7 @@
                 <w:i w:val="0"/>
                 <w:sz w:val="20"/>
               </w:rPr>
-              <w:t>A favor</w:t>
+              <w:t>Pontos favoráveis</w:t>
             </w:r>
           </w:p>
         </w:tc>
@@ -1999,7 +2251,7 @@
                 <w:i w:val="0"/>
                 <w:sz w:val="20"/>
               </w:rPr>
-              <w:t>Por que não foi escolhida</w:t>
+              <w:t>Motivo da não escolha</w:t>
             </w:r>
           </w:p>
         </w:tc>
@@ -2061,7 +2313,7 @@
                 <w:i w:val="0"/>
                 <w:sz w:val="20"/>
               </w:rPr>
-              <w:t>Exigiria trocar de nuvem e abandonar a infra da Fase 2</w:t>
+              <w:t>Exigiria trocar de provedor e abandonar a infraestrutura da Fase 2</w:t>
             </w:r>
           </w:p>
         </w:tc>
@@ -2103,7 +2355,7 @@
                 <w:i w:val="0"/>
                 <w:sz w:val="20"/>
               </w:rPr>
-              <w:t>Agnóstico de nuvem, plugin JWT com Consumers</w:t>
+              <w:t>Independente de provedor, plugin JWT com Consumers</w:t>
             </w:r>
           </w:p>
         </w:tc>
@@ -2123,7 +2375,7 @@
                 <w:i w:val="0"/>
                 <w:sz w:val="20"/>
               </w:rPr>
-              <w:t>Rodaria dentro do cluster que deveria proteger</w:t>
+              <w:t>Seria executado dentro do cluster que deveria proteger</w:t>
             </w:r>
           </w:p>
         </w:tc>
@@ -2185,7 +2437,7 @@
                 <w:i w:val="0"/>
                 <w:sz w:val="20"/>
               </w:rPr>
-              <w:t>Escolhido</w:t>
+              <w:t>Opção escolhida</w:t>
             </w:r>
           </w:p>
         </w:tc>
@@ -2209,7 +2461,7 @@
           <w:i w:val="0"/>
           <w:sz w:val="24"/>
         </w:rPr>
-        <w:t>Entre os três modos do AWS API Gateway, o HTTP API foi escolhido por custo e latência. A REST API traz chave de API, throttling por cliente e integração com WAF — nenhum deles exigido nesta entrega. Se rate limiting por cliente virar requisito, a decisão deve ser revista.</w:t>
+        <w:t>Entre os modos do AWS API Gateway, optou-se pelo HTTP API em razão do custo e da latência. O modo REST API oferece chave de API, throttling por cliente e integração com WAF, recursos que não são exigidos nesta entrega. Caso o rate limiting por cliente se torne um requisito, essa decisão deverá ser revista.</w:t>
       </w:r>
     </w:p>
     <w:p>
@@ -2227,7 +2479,7 @@
           <w:color w:val="1F3A5F"/>
           <w:sz w:val="24"/>
         </w:rPr>
-        <w:t>3.3 Rotas protegidas e as que ficam de fora</w:t>
+        <w:t>3.3 Rotas fora da autenticação por CPF</w:t>
       </w:r>
     </w:p>
     <w:p>
@@ -2243,7 +2495,7 @@
           <w:i w:val="0"/>
           <w:sz w:val="24"/>
         </w:rPr>
-        <w:t>Três rotas permanecem fora do fluxo de autenticação por CPF, por decisão e não por esquecimento:</w:t>
+        <w:t>Três rotas não passam pela autenticação por CPF:</w:t>
       </w:r>
     </w:p>
     <w:p>
@@ -2260,7 +2512,7 @@
           <w:i w:val="0"/>
           <w:sz w:val="24"/>
         </w:rPr>
-        <w:t xml:space="preserve">GET /api/ordens/{id}/status — </w:t>
+        <w:t xml:space="preserve">GET /api/ordens/{id}/status: </w:t>
       </w:r>
       <w:r>
         <w:rPr>
@@ -2269,7 +2521,7 @@
           <w:i w:val="0"/>
           <w:sz w:val="24"/>
         </w:rPr>
-        <w:t>consulta pública de status de uma ordem, por identificador opaco.</w:t>
+        <w:t>consulta do status de uma ordem por identificador opaco.</w:t>
       </w:r>
     </w:p>
     <w:p>
@@ -2286,7 +2538,7 @@
           <w:i w:val="0"/>
           <w:sz w:val="24"/>
         </w:rPr>
-        <w:t xml:space="preserve">Rotas de aprovação externa — </w:t>
+        <w:t xml:space="preserve">Rotas de aprovação externa: </w:t>
       </w:r>
       <w:r>
         <w:rPr>
@@ -2295,7 +2547,7 @@
           <w:i w:val="0"/>
           <w:sz w:val="24"/>
         </w:rPr>
-        <w:t>recebem a decisão do cliente a partir do link do e-mail, autenticadas por um token de uso único com validade própria.</w:t>
+        <w:t>recebem a decisão do cliente a partir do link enviado por e-mail e são autenticadas por um token de uso único com validade própria.</w:t>
       </w:r>
     </w:p>
     <w:p>
@@ -2311,8 +2563,423 @@
           <w:i w:val="0"/>
           <w:sz w:val="24"/>
         </w:rPr>
-        <w:t>Submetê-las ao authorizer de CPF quebraria a integração: quem chama é um sistema externo que não possui token JWT. A decisão está registrada no diagrama de sequência e na especificação do gateway.</w:t>
+        <w:t>Essas rotas são chamadas por um sistema externo que não possui token JWT, e submetê-las ao authorizer inviabilizaria a integração. A decisão está registrada no diagrama de sequência e na especificação do gateway.</w:t>
       </w:r>
+    </w:p>
+    <w:p>
+      <w:pPr>
+        <w:spacing w:before="0" w:after="120"/>
+        <w:ind w:firstLine="709"/>
+        <w:jc w:val="both"/>
+      </w:pPr>
+      <w:r>
+        <w:rPr>
+          <w:rFonts w:ascii="Times New Roman" w:hAnsi="Times New Roman"/>
+          <w:b w:val="0"/>
+          <w:i w:val="0"/>
+          <w:sz w:val="24"/>
+        </w:rPr>
+        <w:t>As rotas de aprovação externa são protegidas pelo token gerado junto com o orçamento:</w:t>
+      </w:r>
+    </w:p>
+    <w:tbl>
+      <w:tblPr>
+        <w:tblStyle w:val="TableGrid"/>
+        <w:tblW w:type="auto" w:w="0"/>
+        <w:jc w:val="center"/>
+        <w:tblLook w:firstColumn="1" w:firstRow="1" w:lastColumn="0" w:lastRow="0" w:noHBand="0" w:noVBand="1" w:val="04A0"/>
+      </w:tblPr>
+      <w:tblGrid>
+        <w:gridCol w:w="4535"/>
+        <w:gridCol w:w="4535"/>
+      </w:tblGrid>
+      <w:tr>
+        <w:tc>
+          <w:tcPr>
+            <w:tcW w:type="dxa" w:w="1984"/>
+          </w:tcPr>
+          <w:p>
+            <w:pPr>
+              <w:spacing w:after="40"/>
+              <w:jc w:val="center"/>
+              <w:shd w:val="clear" w:fill="E8EDF3"/>
+            </w:pPr>
+            <w:r/>
+            <w:r>
+              <w:rPr>
+                <w:rFonts w:ascii="Times New Roman" w:hAnsi="Times New Roman"/>
+                <w:b/>
+                <w:i w:val="0"/>
+                <w:sz w:val="20"/>
+              </w:rPr>
+              <w:t>Aspecto</w:t>
+            </w:r>
+          </w:p>
+        </w:tc>
+        <w:tc>
+          <w:tcPr>
+            <w:tcW w:type="dxa" w:w="7087"/>
+          </w:tcPr>
+          <w:p>
+            <w:pPr>
+              <w:spacing w:after="40"/>
+              <w:jc w:val="center"/>
+              <w:shd w:val="clear" w:fill="E8EDF3"/>
+            </w:pPr>
+            <w:r/>
+            <w:r>
+              <w:rPr>
+                <w:rFonts w:ascii="Times New Roman" w:hAnsi="Times New Roman"/>
+                <w:b/>
+                <w:i w:val="0"/>
+                <w:sz w:val="20"/>
+              </w:rPr>
+              <w:t>Implementação</w:t>
+            </w:r>
+          </w:p>
+        </w:tc>
+      </w:tr>
+      <w:tr>
+        <w:tc>
+          <w:tcPr>
+            <w:tcW w:type="dxa" w:w="1984"/>
+          </w:tcPr>
+          <w:p>
+            <w:pPr>
+              <w:spacing w:after="40"/>
+            </w:pPr>
+            <w:r/>
+            <w:r>
+              <w:rPr>
+                <w:rFonts w:ascii="Times New Roman" w:hAnsi="Times New Roman"/>
+                <w:b w:val="0"/>
+                <w:i w:val="0"/>
+                <w:sz w:val="20"/>
+              </w:rPr>
+              <w:t>Geração</w:t>
+            </w:r>
+          </w:p>
+        </w:tc>
+        <w:tc>
+          <w:tcPr>
+            <w:tcW w:type="dxa" w:w="7087"/>
+          </w:tcPr>
+          <w:p>
+            <w:pPr>
+              <w:spacing w:after="40"/>
+            </w:pPr>
+            <w:r/>
+            <w:r>
+              <w:rPr>
+                <w:rFonts w:ascii="Times New Roman" w:hAnsi="Times New Roman"/>
+                <w:b w:val="0"/>
+                <w:i w:val="0"/>
+                <w:sz w:val="20"/>
+              </w:rPr>
+              <w:t>32 bytes de SecureRandom em Base64 URL-safe (256 bits)</w:t>
+            </w:r>
+          </w:p>
+        </w:tc>
+      </w:tr>
+      <w:tr>
+        <w:tc>
+          <w:tcPr>
+            <w:tcW w:type="dxa" w:w="1984"/>
+          </w:tcPr>
+          <w:p>
+            <w:pPr>
+              <w:spacing w:after="40"/>
+            </w:pPr>
+            <w:r/>
+            <w:r>
+              <w:rPr>
+                <w:rFonts w:ascii="Times New Roman" w:hAnsi="Times New Roman"/>
+                <w:b w:val="0"/>
+                <w:i w:val="0"/>
+                <w:sz w:val="20"/>
+              </w:rPr>
+              <w:t>Vínculo</w:t>
+            </w:r>
+          </w:p>
+        </w:tc>
+        <w:tc>
+          <w:tcPr>
+            <w:tcW w:type="dxa" w:w="7087"/>
+          </w:tcPr>
+          <w:p>
+            <w:pPr>
+              <w:spacing w:after="40"/>
+            </w:pPr>
+            <w:r/>
+            <w:r>
+              <w:rPr>
+                <w:rFonts w:ascii="Times New Roman" w:hAnsi="Times New Roman"/>
+                <w:b w:val="0"/>
+                <w:i w:val="0"/>
+                <w:sz w:val="20"/>
+              </w:rPr>
+              <w:t>armazenado na própria ordem; aceito somente na rota dessa ordem</w:t>
+            </w:r>
+          </w:p>
+        </w:tc>
+      </w:tr>
+      <w:tr>
+        <w:tc>
+          <w:tcPr>
+            <w:tcW w:type="dxa" w:w="1984"/>
+          </w:tcPr>
+          <w:p>
+            <w:pPr>
+              <w:spacing w:after="40"/>
+            </w:pPr>
+            <w:r/>
+            <w:r>
+              <w:rPr>
+                <w:rFonts w:ascii="Times New Roman" w:hAnsi="Times New Roman"/>
+                <w:b w:val="0"/>
+                <w:i w:val="0"/>
+                <w:sz w:val="20"/>
+              </w:rPr>
+              <w:t>Validade</w:t>
+            </w:r>
+          </w:p>
+        </w:tc>
+        <w:tc>
+          <w:tcPr>
+            <w:tcW w:type="dxa" w:w="7087"/>
+          </w:tcPr>
+          <w:p>
+            <w:pPr>
+              <w:spacing w:after="40"/>
+            </w:pPr>
+            <w:r/>
+            <w:r>
+              <w:rPr>
+                <w:rFonts w:ascii="Times New Roman" w:hAnsi="Times New Roman"/>
+                <w:b w:val="0"/>
+                <w:i w:val="0"/>
+                <w:sz w:val="20"/>
+              </w:rPr>
+              <w:t>168 horas a partir da geração do orçamento, configurável</w:t>
+            </w:r>
+          </w:p>
+        </w:tc>
+      </w:tr>
+      <w:tr>
+        <w:tc>
+          <w:tcPr>
+            <w:tcW w:type="dxa" w:w="1984"/>
+          </w:tcPr>
+          <w:p>
+            <w:pPr>
+              <w:spacing w:after="40"/>
+            </w:pPr>
+            <w:r/>
+            <w:r>
+              <w:rPr>
+                <w:rFonts w:ascii="Times New Roman" w:hAnsi="Times New Roman"/>
+                <w:b w:val="0"/>
+                <w:i w:val="0"/>
+                <w:sz w:val="20"/>
+              </w:rPr>
+              <w:t>Uso único</w:t>
+            </w:r>
+          </w:p>
+        </w:tc>
+        <w:tc>
+          <w:tcPr>
+            <w:tcW w:type="dxa" w:w="7087"/>
+          </w:tcPr>
+          <w:p>
+            <w:pPr>
+              <w:spacing w:after="40"/>
+            </w:pPr>
+            <w:r/>
+            <w:r>
+              <w:rPr>
+                <w:rFonts w:ascii="Times New Roman" w:hAnsi="Times New Roman"/>
+                <w:b w:val="0"/>
+                <w:i w:val="0"/>
+                <w:sz w:val="20"/>
+              </w:rPr>
+              <w:t>removido da ordem após a aprovação ou a reprovação</w:t>
+            </w:r>
+          </w:p>
+        </w:tc>
+      </w:tr>
+      <w:tr>
+        <w:tc>
+          <w:tcPr>
+            <w:tcW w:type="dxa" w:w="1984"/>
+          </w:tcPr>
+          <w:p>
+            <w:pPr>
+              <w:spacing w:after="40"/>
+            </w:pPr>
+            <w:r/>
+            <w:r>
+              <w:rPr>
+                <w:rFonts w:ascii="Times New Roman" w:hAnsi="Times New Roman"/>
+                <w:b w:val="0"/>
+                <w:i w:val="0"/>
+                <w:sz w:val="20"/>
+              </w:rPr>
+              <w:t>Erro</w:t>
+            </w:r>
+          </w:p>
+        </w:tc>
+        <w:tc>
+          <w:tcPr>
+            <w:tcW w:type="dxa" w:w="7087"/>
+          </w:tcPr>
+          <w:p>
+            <w:pPr>
+              <w:spacing w:after="40"/>
+            </w:pPr>
+            <w:r/>
+            <w:r>
+              <w:rPr>
+                <w:rFonts w:ascii="Times New Roman" w:hAnsi="Times New Roman"/>
+                <w:b w:val="0"/>
+                <w:i w:val="0"/>
+                <w:sz w:val="20"/>
+              </w:rPr>
+              <w:t>token divergente, expirado ou já utilizado é recusado com 401</w:t>
+            </w:r>
+          </w:p>
+        </w:tc>
+      </w:tr>
+      <w:tr>
+        <w:tc>
+          <w:tcPr>
+            <w:tcW w:type="dxa" w:w="1984"/>
+          </w:tcPr>
+          <w:p>
+            <w:pPr>
+              <w:spacing w:after="40"/>
+            </w:pPr>
+            <w:r/>
+            <w:r>
+              <w:rPr>
+                <w:rFonts w:ascii="Times New Roman" w:hAnsi="Times New Roman"/>
+                <w:b w:val="0"/>
+                <w:i w:val="0"/>
+                <w:sz w:val="20"/>
+              </w:rPr>
+              <w:t>Links do e-mail</w:t>
+            </w:r>
+          </w:p>
+        </w:tc>
+        <w:tc>
+          <w:tcPr>
+            <w:tcW w:type="dxa" w:w="7087"/>
+          </w:tcPr>
+          <w:p>
+            <w:pPr>
+              <w:spacing w:after="40"/>
+            </w:pPr>
+            <w:r/>
+            <w:r>
+              <w:rPr>
+                <w:rFonts w:ascii="Times New Roman" w:hAnsi="Times New Roman"/>
+                <w:b w:val="0"/>
+                <w:i w:val="0"/>
+                <w:sz w:val="20"/>
+              </w:rPr>
+              <w:t>o GET exibe uma página de confirmação e não altera a ordem; a decisão é registrada pelo POST enviado pela página</w:t>
+            </w:r>
+          </w:p>
+        </w:tc>
+      </w:tr>
+      <w:tr>
+        <w:tc>
+          <w:tcPr>
+            <w:tcW w:type="dxa" w:w="1984"/>
+          </w:tcPr>
+          <w:p>
+            <w:pPr>
+              <w:spacing w:after="40"/>
+            </w:pPr>
+            <w:r/>
+            <w:r>
+              <w:rPr>
+                <w:rFonts w:ascii="Times New Roman" w:hAnsi="Times New Roman"/>
+                <w:b w:val="0"/>
+                <w:i w:val="0"/>
+                <w:sz w:val="20"/>
+              </w:rPr>
+              <w:t>Distribuição</w:t>
+            </w:r>
+          </w:p>
+        </w:tc>
+        <w:tc>
+          <w:tcPr>
+            <w:tcW w:type="dxa" w:w="7087"/>
+          </w:tcPr>
+          <w:p>
+            <w:pPr>
+              <w:spacing w:after="40"/>
+            </w:pPr>
+            <w:r/>
+            <w:r>
+              <w:rPr>
+                <w:rFonts w:ascii="Times New Roman" w:hAnsi="Times New Roman"/>
+                <w:b w:val="0"/>
+                <w:i w:val="0"/>
+                <w:sz w:val="20"/>
+              </w:rPr>
+              <w:t>enviado apenas no e-mail do cliente; o access log do gateway não registra a query string</w:t>
+            </w:r>
+          </w:p>
+        </w:tc>
+      </w:tr>
+      <w:tr>
+        <w:tc>
+          <w:tcPr>
+            <w:tcW w:type="dxa" w:w="1984"/>
+          </w:tcPr>
+          <w:p>
+            <w:pPr>
+              <w:spacing w:after="40"/>
+            </w:pPr>
+            <w:r/>
+            <w:r>
+              <w:rPr>
+                <w:rFonts w:ascii="Times New Roman" w:hAnsi="Times New Roman"/>
+                <w:b w:val="0"/>
+                <w:i w:val="0"/>
+                <w:sz w:val="20"/>
+              </w:rPr>
+              <w:t>Testes</w:t>
+            </w:r>
+          </w:p>
+        </w:tc>
+        <w:tc>
+          <w:tcPr>
+            <w:tcW w:type="dxa" w:w="7087"/>
+          </w:tcPr>
+          <w:p>
+            <w:pPr>
+              <w:spacing w:after="40"/>
+            </w:pPr>
+            <w:r/>
+            <w:r>
+              <w:rPr>
+                <w:rFonts w:ascii="Times New Roman" w:hAnsi="Times New Roman"/>
+                <w:b w:val="0"/>
+                <w:i w:val="0"/>
+                <w:sz w:val="20"/>
+              </w:rPr>
+              <w:t>OrdemServicoTest, OrdemServicoUseCasesTest, ReprovarOrcamentoUseCaseTest e OrdemServicoIntegrationTest</w:t>
+            </w:r>
+          </w:p>
+        </w:tc>
+      </w:tr>
+    </w:tbl>
+    <w:p>
+      <w:pPr>
+        <w:spacing w:after="80"/>
+      </w:pPr>
     </w:p>
     <w:p>
       <w:pPr>
@@ -2329,7 +2996,7 @@
           <w:color w:val="1F3A5F"/>
           <w:sz w:val="24"/>
         </w:rPr>
-        <w:t>3.4 Por que um Lambda authorizer, e não o nativo</w:t>
+        <w:t>3.4 Papéis de acesso</w:t>
       </w:r>
     </w:p>
     <w:p>
@@ -2345,8 +3012,218 @@
           <w:i w:val="0"/>
           <w:sz w:val="24"/>
         </w:rPr>
-        <w:t>O JWT authorizer nativo do HTTP API é compatível com OIDC: exige emissor, audiência e um endpoint JWKS com chaves públicas. Ele não valida HMAC, porque não há chave pública a publicar quando a assinatura é simétrica.</w:t>
+        <w:t>A Lambda emite dois papéis, ambos com autenticação por CPF, e a aplicação aplica as permissões correspondentes (ADR-014):</w:t>
       </w:r>
+    </w:p>
+    <w:tbl>
+      <w:tblPr>
+        <w:tblStyle w:val="TableGrid"/>
+        <w:tblW w:type="auto" w:w="0"/>
+        <w:jc w:val="center"/>
+        <w:tblLook w:firstColumn="1" w:firstRow="1" w:lastColumn="0" w:lastRow="0" w:noHBand="0" w:noVBand="1" w:val="04A0"/>
+      </w:tblPr>
+      <w:tblGrid>
+        <w:gridCol w:w="3024"/>
+        <w:gridCol w:w="3024"/>
+        <w:gridCol w:w="3024"/>
+      </w:tblGrid>
+      <w:tr>
+        <w:tc>
+          <w:tcPr>
+            <w:tcW w:type="dxa" w:w="1701"/>
+          </w:tcPr>
+          <w:p>
+            <w:pPr>
+              <w:spacing w:after="40"/>
+              <w:jc w:val="center"/>
+              <w:shd w:val="clear" w:fill="E8EDF3"/>
+            </w:pPr>
+            <w:r/>
+            <w:r>
+              <w:rPr>
+                <w:rFonts w:ascii="Times New Roman" w:hAnsi="Times New Roman"/>
+                <w:b/>
+                <w:i w:val="0"/>
+                <w:sz w:val="20"/>
+              </w:rPr>
+              <w:t>Papel</w:t>
+            </w:r>
+          </w:p>
+        </w:tc>
+        <w:tc>
+          <w:tcPr>
+            <w:tcW w:type="dxa" w:w="2551"/>
+          </w:tcPr>
+          <w:p>
+            <w:pPr>
+              <w:spacing w:after="40"/>
+              <w:jc w:val="center"/>
+              <w:shd w:val="clear" w:fill="E8EDF3"/>
+            </w:pPr>
+            <w:r/>
+            <w:r>
+              <w:rPr>
+                <w:rFonts w:ascii="Times New Roman" w:hAnsi="Times New Roman"/>
+                <w:b/>
+                <w:i w:val="0"/>
+                <w:sz w:val="20"/>
+              </w:rPr>
+              <w:t>Rota de autenticação</w:t>
+            </w:r>
+          </w:p>
+        </w:tc>
+        <w:tc>
+          <w:tcPr>
+            <w:tcW w:type="dxa" w:w="4819"/>
+          </w:tcPr>
+          <w:p>
+            <w:pPr>
+              <w:spacing w:after="40"/>
+              <w:jc w:val="center"/>
+              <w:shd w:val="clear" w:fill="E8EDF3"/>
+            </w:pPr>
+            <w:r/>
+            <w:r>
+              <w:rPr>
+                <w:rFonts w:ascii="Times New Roman" w:hAnsi="Times New Roman"/>
+                <w:b/>
+                <w:i w:val="0"/>
+                <w:sz w:val="20"/>
+              </w:rPr>
+              <w:t>Acesso na aplicação</w:t>
+            </w:r>
+          </w:p>
+        </w:tc>
+      </w:tr>
+      <w:tr>
+        <w:tc>
+          <w:tcPr>
+            <w:tcW w:type="dxa" w:w="1701"/>
+          </w:tcPr>
+          <w:p>
+            <w:pPr>
+              <w:spacing w:after="40"/>
+            </w:pPr>
+            <w:r/>
+            <w:r>
+              <w:rPr>
+                <w:rFonts w:ascii="Times New Roman" w:hAnsi="Times New Roman"/>
+                <w:b w:val="0"/>
+                <w:i w:val="0"/>
+                <w:sz w:val="20"/>
+              </w:rPr>
+              <w:t>FUNCIONARIO</w:t>
+            </w:r>
+          </w:p>
+        </w:tc>
+        <w:tc>
+          <w:tcPr>
+            <w:tcW w:type="dxa" w:w="2551"/>
+          </w:tcPr>
+          <w:p>
+            <w:pPr>
+              <w:spacing w:after="40"/>
+            </w:pPr>
+            <w:r/>
+            <w:r>
+              <w:rPr>
+                <w:rFonts w:ascii="Times New Roman" w:hAnsi="Times New Roman"/>
+                <w:b w:val="0"/>
+                <w:i w:val="0"/>
+                <w:sz w:val="20"/>
+              </w:rPr>
+              <w:t>POST /auth/funcionarios</w:t>
+            </w:r>
+          </w:p>
+        </w:tc>
+        <w:tc>
+          <w:tcPr>
+            <w:tcW w:type="dxa" w:w="4819"/>
+          </w:tcPr>
+          <w:p>
+            <w:pPr>
+              <w:spacing w:after="40"/>
+            </w:pPr>
+            <w:r/>
+            <w:r>
+              <w:rPr>
+                <w:rFonts w:ascii="Times New Roman" w:hAnsi="Times New Roman"/>
+                <w:b w:val="0"/>
+                <w:i w:val="0"/>
+                <w:sz w:val="20"/>
+              </w:rPr>
+              <w:t>todas as rotas de gestão: clientes, veículos, catálogo, estoque, ciclo da OS e relatório</w:t>
+            </w:r>
+          </w:p>
+        </w:tc>
+      </w:tr>
+      <w:tr>
+        <w:tc>
+          <w:tcPr>
+            <w:tcW w:type="dxa" w:w="1701"/>
+          </w:tcPr>
+          <w:p>
+            <w:pPr>
+              <w:spacing w:after="40"/>
+            </w:pPr>
+            <w:r/>
+            <w:r>
+              <w:rPr>
+                <w:rFonts w:ascii="Times New Roman" w:hAnsi="Times New Roman"/>
+                <w:b w:val="0"/>
+                <w:i w:val="0"/>
+                <w:sz w:val="20"/>
+              </w:rPr>
+              <w:t>CLIENTE</w:t>
+            </w:r>
+          </w:p>
+        </w:tc>
+        <w:tc>
+          <w:tcPr>
+            <w:tcW w:type="dxa" w:w="2551"/>
+          </w:tcPr>
+          <w:p>
+            <w:pPr>
+              <w:spacing w:after="40"/>
+            </w:pPr>
+            <w:r/>
+            <w:r>
+              <w:rPr>
+                <w:rFonts w:ascii="Times New Roman" w:hAnsi="Times New Roman"/>
+                <w:b w:val="0"/>
+                <w:i w:val="0"/>
+                <w:sz w:val="20"/>
+              </w:rPr>
+              <w:t>POST /auth</w:t>
+            </w:r>
+          </w:p>
+        </w:tc>
+        <w:tc>
+          <w:tcPr>
+            <w:tcW w:type="dxa" w:w="4819"/>
+          </w:tcPr>
+          <w:p>
+            <w:pPr>
+              <w:spacing w:after="40"/>
+            </w:pPr>
+            <w:r/>
+            <w:r>
+              <w:rPr>
+                <w:rFonts w:ascii="Times New Roman" w:hAnsi="Times New Roman"/>
+                <w:b w:val="0"/>
+                <w:i w:val="0"/>
+                <w:sz w:val="20"/>
+              </w:rPr>
+              <w:t>leitura das próprias ordens de serviço e dos próprios veículos; recursos de outros clientes retornam 404</w:t>
+            </w:r>
+          </w:p>
+        </w:tc>
+      </w:tr>
+    </w:tbl>
+    <w:p>
+      <w:pPr>
+        <w:spacing w:after="80"/>
+      </w:pPr>
     </w:p>
     <w:p>
       <w:pPr>
@@ -2361,7 +3238,57 @@
           <w:i w:val="0"/>
           <w:sz w:val="24"/>
         </w:rPr>
-        <w:t>Manter HMAC foi a decisão de menor atrito sobre o JwtService que já existia e funcionava. O custo — um segredo compartilhado entre três componentes — está declarado como débito técnico, com a migração para RS256 e JWKS registrada como evolução natural.</w:t>
+        <w:t>O primeiro funcionário de homologação é cadastrado por uma migration, com o CPF informado por um secret do pipeline de infraestrutura, sem registro no repositório.</w:t>
+      </w:r>
+    </w:p>
+    <w:p>
+      <w:pPr>
+        <w:pStyle w:val="Heading3"/>
+        <w:keepNext/>
+        <w:spacing w:before="240" w:after="160"/>
+        <w:jc w:val="left"/>
+      </w:pPr>
+      <w:r>
+        <w:rPr>
+          <w:rFonts w:ascii="Times New Roman" w:hAnsi="Times New Roman"/>
+          <w:b/>
+          <w:i w:val="0"/>
+          <w:color w:val="1F3A5F"/>
+          <w:sz w:val="24"/>
+        </w:rPr>
+        <w:t>3.5 Uso de Lambda authorizer em vez do authorizer nativo</w:t>
+      </w:r>
+    </w:p>
+    <w:p>
+      <w:pPr>
+        <w:spacing w:before="0" w:after="120"/>
+        <w:ind w:firstLine="709"/>
+        <w:jc w:val="both"/>
+      </w:pPr>
+      <w:r>
+        <w:rPr>
+          <w:rFonts w:ascii="Times New Roman" w:hAnsi="Times New Roman"/>
+          <w:b w:val="0"/>
+          <w:i w:val="0"/>
+          <w:sz w:val="24"/>
+        </w:rPr>
+        <w:t>O JWT authorizer nativo do HTTP API é compatível com OIDC e exige emissor, audiência e um endpoint JWKS com chaves públicas. Ele não valida tokens assinados com HMAC, pois a assinatura simétrica não possui chave pública a ser publicada.</w:t>
+      </w:r>
+    </w:p>
+    <w:p>
+      <w:pPr>
+        <w:spacing w:before="0" w:after="120"/>
+        <w:ind w:firstLine="709"/>
+        <w:jc w:val="both"/>
+      </w:pPr>
+      <w:r>
+        <w:rPr>
+          <w:rFonts w:ascii="Times New Roman" w:hAnsi="Times New Roman"/>
+          <w:b w:val="0"/>
+          <w:i w:val="0"/>
+          <w:sz w:val="24"/>
+        </w:rPr>
+        <w:t>A manutenção do HMAC reduziu as alterações no JwtService existente. Como consequência, o segredo é compartilhado entre três componentes; esse ponto está registrado como débito técnico, e a migração para RS256 com JWKS é a evolução prevista.</w:t>
       </w:r>
     </w:p>
     <w:p>
@@ -2400,7 +3327,79 @@
           <w:i w:val="0"/>
           <w:sz w:val="24"/>
         </w:rPr>
-        <w:t>O diagrama de componentes completo, no nível de contêineres do modelo C4, está em docs/tech-challenge-3/diagramas/c2-containers.md. Esta seção cobre as decisões que o diagrama não explica sozinho.</w:t>
+        <w:t>A Figura 5 apresenta o diagrama de contêineres do modelo C4, com os componentes de nuvem, as APIs, o banco de dados e o monitoramento. A fonte versionada está em docs/tech-challenge-3/diagramas/c2-containers.md. As subseções seguintes descrevem as decisões que não estão explícitas no diagrama.</w:t>
+      </w:r>
+    </w:p>
+    <w:p>
+      <w:pPr>
+        <w:keepNext/>
+        <w:spacing w:before="160" w:after="40"/>
+        <w:jc w:val="center"/>
+      </w:pPr>
+      <w:r>
+        <w:rPr>
+          <w:rFonts w:ascii="Times New Roman" w:hAnsi="Times New Roman"/>
+          <w:b/>
+          <w:i w:val="0"/>
+          <w:sz w:val="20"/>
+        </w:rPr>
+        <w:t>Figura 5 — Diagrama de contêineres (C4, nível 2)</w:t>
+      </w:r>
+    </w:p>
+    <w:p>
+      <w:pPr>
+        <w:keepNext/>
+        <w:jc w:val="center"/>
+      </w:pPr>
+      <w:r>
+        <w:drawing>
+          <wp:inline xmlns:a="http://schemas.openxmlformats.org/drawingml/2006/main" xmlns:pic="http://schemas.openxmlformats.org/drawingml/2006/picture">
+            <wp:extent cx="4860000" cy="7821888"/>
+            <wp:docPr id="5" name="Picture 5"/>
+            <wp:cNvGraphicFramePr>
+              <a:graphicFrameLocks noChangeAspect="1"/>
+            </wp:cNvGraphicFramePr>
+            <a:graphic>
+              <a:graphicData uri="http://schemas.openxmlformats.org/drawingml/2006/picture">
+                <pic:pic>
+                  <pic:nvPicPr>
+                    <pic:cNvPr id="0" name="c2-containers.png"/>
+                    <pic:cNvPicPr/>
+                  </pic:nvPicPr>
+                  <pic:blipFill>
+                    <a:blip r:embed="rId13"/>
+                    <a:stretch>
+                      <a:fillRect/>
+                    </a:stretch>
+                  </pic:blipFill>
+                  <pic:spPr>
+                    <a:xfrm>
+                      <a:off x="0" y="0"/>
+                      <a:ext cx="4860000" cy="7821888"/>
+                    </a:xfrm>
+                    <a:prstGeom prst="rect"/>
+                  </pic:spPr>
+                </pic:pic>
+              </a:graphicData>
+            </a:graphic>
+          </wp:inline>
+        </w:drawing>
+      </w:r>
+    </w:p>
+    <w:p>
+      <w:pPr>
+        <w:spacing w:after="200"/>
+        <w:jc w:val="center"/>
+      </w:pPr>
+      <w:r>
+        <w:rPr>
+          <w:rFonts w:ascii="Times New Roman" w:hAnsi="Times New Roman"/>
+          <w:b w:val="0"/>
+          <w:i w:val="0"/>
+          <w:color w:val="555555"/>
+          <w:sz w:val="20"/>
+        </w:rPr>
+        <w:t>Fonte: elaborado pelos autores.</w:t>
       </w:r>
     </w:p>
     <w:p>
@@ -2418,7 +3417,7 @@
           <w:color w:val="1F3A5F"/>
           <w:sz w:val="24"/>
         </w:rPr>
-        <w:t>4.1 A rede saiu das subnets públicas</w:t>
+        <w:t>4.1 Rede privada</w:t>
       </w:r>
     </w:p>
     <w:p>
@@ -2434,7 +3433,7 @@
           <w:i w:val="0"/>
           <w:sz w:val="24"/>
         </w:rPr>
-        <w:t>Na Fase 2, nós do cluster e banco viviam em subnets públicas, protegidos por security group. A Aula 04 de Serverless é explícita: banco exposto publicamente é risco grave mesmo com senha forte, e uma API sem autenticação em subnet pública pode ter o IP descoberto e ser atacada.</w:t>
+        <w:t>Na Fase 2, os nós do cluster e o banco de dados estavam em subnets públicas, protegidos por security groups. O material da disciplina de Serverless (Aula 04) aponta que um banco de dados exposto publicamente representa risco relevante, mesmo com senha forte, e que uma API em subnet pública pode ter o endereço descoberto e ser alvo de ataques.</w:t>
       </w:r>
     </w:p>
     <w:p>
@@ -2450,7 +3449,7 @@
           <w:i w:val="0"/>
           <w:sz w:val="24"/>
         </w:rPr>
-        <w:t>Migrar exigiu escolher como dar saída de internet a recursos privados. Três caminhos, com preços de lista em us-east-1 e duas zonas de disponibilidade:</w:t>
+        <w:t>A migração para subnets privadas exigiu definir como os recursos acessariam a internet. Foram avaliadas três opções, com preços de lista em us-east-1 e duas zonas de disponibilidade:</w:t>
       </w:r>
     </w:p>
     <w:tbl>
@@ -2506,7 +3505,7 @@
                 <w:i w:val="0"/>
                 <w:sz w:val="20"/>
               </w:rPr>
-              <w:t>Conta</w:t>
+              <w:t>Cálculo</w:t>
             </w:r>
           </w:p>
         </w:tc>
@@ -2727,7 +3726,7 @@
     </w:p>
     <w:p>
       <w:pPr>
-        <w:spacing w:after="120"/>
+        <w:spacing w:before="0" w:after="120"/>
         <w:ind w:firstLine="709"/>
         <w:jc w:val="both"/>
       </w:pPr>
@@ -2738,17 +3737,15 @@
           <w:i w:val="0"/>
           <w:sz w:val="24"/>
         </w:rPr>
-        <w:t xml:space="preserve">O resultado contraria a intuição: </w:t>
+        <w:t>Os VPC interface endpoints apresentaram o maior custo, pois são cobrados por endpoint e por zona de disponibilidade. Além disso, não atenderiam à telemetria do New Relic, que é enviada para um endpoint público.</w:t>
       </w:r>
-      <w:r>
-        <w:rPr>
-          <w:rFonts w:ascii="Times New Roman" w:hAnsi="Times New Roman"/>
-          <w:b/>
-          <w:i w:val="0"/>
-          <w:sz w:val="24"/>
-        </w:rPr>
-        <w:t>VPC endpoints saem mais caros que o NAT Gateway</w:t>
-      </w:r>
+    </w:p>
+    <w:p>
+      <w:pPr>
+        <w:spacing w:before="0" w:after="120"/>
+        <w:ind w:firstLine="709"/>
+        <w:jc w:val="both"/>
+      </w:pPr>
       <w:r>
         <w:rPr>
           <w:rFonts w:ascii="Times New Roman" w:hAnsi="Times New Roman"/>
@@ -2756,17 +3753,15 @@
           <w:i w:val="0"/>
           <w:sz w:val="24"/>
         </w:rPr>
-        <w:t xml:space="preserve">, porque endpoint de interface é cobrado por endpoint </w:t>
+        <w:t>Optou-se pela NAT instance. Como efeito adicional, os nós em subnet privada deixam de utilizar IPv4 público, cobrado pela AWS desde fevereiro de 2024, o que representa uma economia de US$ 7,30 por mês.</w:t>
       </w:r>
-      <w:r>
-        <w:rPr>
-          <w:rFonts w:ascii="Times New Roman" w:hAnsi="Times New Roman"/>
-          <w:b w:val="0"/>
-          <w:i/>
-          <w:sz w:val="24"/>
-        </w:rPr>
-        <w:t>e</w:t>
-      </w:r>
+    </w:p>
+    <w:p>
+      <w:pPr>
+        <w:spacing w:before="0" w:after="120"/>
+        <w:ind w:firstLine="709"/>
+        <w:jc w:val="both"/>
+      </w:pPr>
       <w:r>
         <w:rPr>
           <w:rFonts w:ascii="Times New Roman" w:hAnsi="Times New Roman"/>
@@ -2774,39 +3769,7 @@
           <w:i w:val="0"/>
           <w:sz w:val="24"/>
         </w:rPr>
-        <w:t xml:space="preserve"> por zona de disponibilidade. E não resolveriam o problema: a telemetria do New Relic vai para um endpoint público, que nenhum interface endpoint atende.</w:t>
-      </w:r>
-    </w:p>
-    <w:p>
-      <w:pPr>
-        <w:spacing w:before="0" w:after="120"/>
-        <w:ind w:firstLine="709"/>
-        <w:jc w:val="both"/>
-      </w:pPr>
-      <w:r>
-        <w:rPr>
-          <w:rFonts w:ascii="Times New Roman" w:hAnsi="Times New Roman"/>
-          <w:b w:val="0"/>
-          <w:i w:val="0"/>
-          <w:sz w:val="24"/>
-        </w:rPr>
-        <w:t>A escolha foi a NAT instance. Há um efeito colateral que economiza mais: em subnet privada os nós deixam de ter IPv4 público, cobrado pela AWS desde fevereiro de 2024 — sete dólares e trinta por mês que estavam sendo gastos sem necessidade.</w:t>
-      </w:r>
-    </w:p>
-    <w:p>
-      <w:pPr>
-        <w:spacing w:before="0" w:after="120"/>
-        <w:ind w:firstLine="709"/>
-        <w:jc w:val="both"/>
-      </w:pPr>
-      <w:r>
-        <w:rPr>
-          <w:rFonts w:ascii="Times New Roman" w:hAnsi="Times New Roman"/>
-          <w:b w:val="0"/>
-          <w:i w:val="0"/>
-          <w:sz w:val="24"/>
-        </w:rPr>
-        <w:t>A limitação está declarada: a NAT instance é ponto único de falha em uma zona. O impacto de uma queda é perda de telemetria e falha de pull de imagem, não indisponibilidade da API.</w:t>
+        <w:t>A NAT instance é um ponto único de falha em uma zona de disponibilidade. Em caso de indisponibilidade, o impacto é a perda de telemetria e a falha no download de imagens, sem indisponibilidade da API.</w:t>
       </w:r>
     </w:p>
     <w:p>
@@ -2824,7 +3787,7 @@
           <w:color w:val="1F3A5F"/>
           <w:sz w:val="24"/>
         </w:rPr>
-        <w:t>4.2 Registry migrado para o ECR</w:t>
+        <w:t>4.2 Registry de imagens no ECR</w:t>
       </w:r>
     </w:p>
     <w:p>
@@ -2840,7 +3803,7 @@
           <w:i w:val="0"/>
           <w:sz w:val="24"/>
         </w:rPr>
-        <w:t>Com os nós em subnet privada, todo pull de imagem passaria pela NAT instance, que é burstable e de banda limitada — exatamente o cenário que satura durante um scale-out. Com ECR mais o gateway endpoint de S3, que é gratuito, as camadas vêm pelo backbone da AWS sem tocar a NAT.</w:t>
+        <w:t>Com os nós em subnets privadas, o download de imagens do registry anterior passaria pela NAT instance, que possui banda limitada e poderia se tornar um gargalo durante o escalonamento. Com o ECR e o gateway endpoint de S3, que não tem custo, as camadas das imagens são obtidas pela rede interna da AWS, sem passar pela NAT.</w:t>
       </w:r>
     </w:p>
     <w:p>
@@ -2856,7 +3819,7 @@
           <w:i w:val="0"/>
           <w:sz w:val="24"/>
         </w:rPr>
-        <w:t>A permissão já existia: o role dos nós carregava AmazonEC2ContainerRegistryReadOnly desde a Fase 2, herança nunca exercida.</w:t>
+        <w:t>A role dos nós já possuía a política AmazonEC2ContainerRegistryReadOnly desde a Fase 2, embora ela não fosse utilizada.</w:t>
       </w:r>
     </w:p>
     <w:p>
@@ -2874,7 +3837,7 @@
           <w:color w:val="1F3A5F"/>
           <w:sz w:val="24"/>
         </w:rPr>
-        <w:t>4.3 O caminho até a aplicação</w:t>
+        <w:t>4.3 Caminho até a aplicação</w:t>
       </w:r>
     </w:p>
     <w:p>
@@ -2890,7 +3853,7 @@
           <w:i w:val="0"/>
           <w:sz w:val="24"/>
         </w:rPr>
-        <w:t>O API Gateway alcança o cluster por VPC Link, que aponta para um Network Load Balancer interno, que por sua vez encaminha para um NodePort fixo dos nós. O balanceador é criado pelo Terraform, e não por um Service do tipo LoadBalancer, para evitar dependência de ordem entre Terraform e Kubernetes — o alvo existe no mesmo apply.</w:t>
+        <w:t>O API Gateway acessa o cluster por meio de um VPC Link, que aponta para um Network Load Balancer interno, responsável por encaminhar o tráfego para um NodePort fixo dos nós. O balanceador é criado pelo Terraform, e não por um Service do tipo LoadBalancer, para evitar dependência de ordem de execução entre Terraform e Kubernetes.</w:t>
       </w:r>
     </w:p>
     <w:p>
@@ -2947,7 +3910,7 @@
           <w:i w:val="0"/>
           <w:sz w:val="24"/>
         </w:rPr>
-        <w:t>O monorepo da Fase 2 foi segregado em quatro. O repositório da aplicação foi preservado com todo o histórico das fases anteriores; os outros três nasceram nesta fase, recebendo o conteúdo movido.</w:t>
+        <w:t>O repositório único da Fase 2 foi dividido em quatro. O repositório da aplicação foi mantido com o histórico das fases anteriores, e os outros três foram criados nesta fase a partir do conteúdo transferido.</w:t>
       </w:r>
     </w:p>
     <w:tbl>
@@ -3047,7 +4010,7 @@
                 <w:i w:val="0"/>
                 <w:sz w:val="20"/>
               </w:rPr>
-              <w:t>oficina-api</w:t>
+              <w:t>tech-challenge-1</w:t>
             </w:r>
           </w:p>
         </w:tc>
@@ -3067,7 +4030,7 @@
                 <w:i w:val="0"/>
                 <w:sz w:val="20"/>
               </w:rPr>
-              <w:t>Spring Boot, Dockerfile, testes</w:t>
+              <w:t>oficina-api: Spring Boot, Dockerfile, testes</w:t>
             </w:r>
           </w:p>
         </w:tc>
@@ -3087,7 +4050,7 @@
                 <w:i w:val="0"/>
                 <w:sz w:val="20"/>
               </w:rPr>
-              <w:t>build → testes → Sonar → imagem no ECR → deploy no EKS</w:t>
+              <w:t>build → testes → Sonar (main) → imagem no ECR do ambiente → deploy no EKS</w:t>
             </w:r>
           </w:p>
         </w:tc>
@@ -3149,7 +4112,7 @@
                 <w:i w:val="0"/>
                 <w:sz w:val="20"/>
               </w:rPr>
-              <w:t>build → testes → sam deploy → publica ARNs no SSM</w:t>
+              <w:t>build → testes → verificação do cluster → sam deploy → ARNs no SSM</w:t>
             </w:r>
           </w:p>
         </w:tc>
@@ -3211,7 +4174,7 @@
                 <w:i w:val="0"/>
                 <w:sz w:val="20"/>
               </w:rPr>
-              <w:t>fmt → validate → plan → apply aprovado</w:t>
+              <w:t>fmt → validate → plan → apply da base; cluster por disparo manual</w:t>
             </w:r>
           </w:p>
         </w:tc>
@@ -3273,7 +4236,7 @@
                 <w:i w:val="0"/>
                 <w:sz w:val="20"/>
               </w:rPr>
-              <w:t>fmt → validate → plan → apply aprovado</w:t>
+              <w:t>fmt → validate → plan; apply por disparo manual</w:t>
             </w:r>
           </w:p>
         </w:tc>
@@ -3299,7 +4262,7 @@
           <w:color w:val="1F3A5F"/>
           <w:sz w:val="24"/>
         </w:rPr>
-        <w:t>5.2 O contrato entre eles</w:t>
+        <w:t>5.2 Integração entre repositórios</w:t>
       </w:r>
     </w:p>
     <w:p>
@@ -3315,7 +4278,7 @@
           <w:i w:val="0"/>
           <w:sz w:val="24"/>
         </w:rPr>
-        <w:t>Segregar repositórios cria o risco de desalinhamento. O acoplamento foi reduzido a um único mecanismo: o SSM Parameter Store, sob o prefixo /oficina/&lt;ambiente&gt;/. Cada repositório publica seus outputs e consome os dos outros por data source.</w:t>
+        <w:t>Para reduzir o acoplamento entre os repositórios, a troca de informações foi concentrada no SSM Parameter Store, sob o prefixo /oficina/&lt;ambiente&gt;/. Cada repositório publica seus outputs e consome os dos demais por meio de data sources.</w:t>
       </w:r>
     </w:p>
     <w:p>
@@ -3331,7 +4294,7 @@
           <w:i w:val="0"/>
           <w:sz w:val="24"/>
         </w:rPr>
-        <w:t>A escolha de SSM em vez de terraform_remote_state é deliberada: assim nenhum repositório precisa de permissão de leitura no state do outro.</w:t>
+        <w:t>Optou-se pelo SSM em vez de terraform_remote_state para que nenhum repositório precise de permissão de leitura sobre o state de outro.</w:t>
       </w:r>
     </w:p>
     <w:p>
@@ -3349,7 +4312,7 @@
           <w:color w:val="1F3A5F"/>
           <w:sz w:val="24"/>
         </w:rPr>
-        <w:t>5.3 A dependência circular, e como foi resolvida</w:t>
+        <w:t>5.3 Ordem de provisionamento</w:t>
       </w:r>
     </w:p>
     <w:p>
@@ -3365,7 +4328,7 @@
           <w:i w:val="0"/>
           <w:sz w:val="24"/>
         </w:rPr>
-        <w:t>O API Gateway precisa do ARN da Lambda para montar as rotas; a Lambda precisa da rede criada pelo repositório de infraestrutura. Resolvido em duas passagens, controladas por uma variável:</w:t>
+        <w:t>O API Gateway depende do ARN da Lambda para configurar as rotas, e a Lambda depende da rede criada pelo repositório de infraestrutura. A dependência foi resolvida com dois applies do cluster, controlados por variáveis:</w:t>
       </w:r>
     </w:p>
     <w:p>
@@ -3382,15 +4345,17 @@
           <w:color w:val="555555"/>
           <w:sz w:val="19"/>
         </w:rPr>
-        <w:t>1. oficina-infra-k8s   apply 1 — rede, EKS, ECR, gateway sem as rotas da Lambda</w:t>
+        <w:t>0. oficina-infra-k8s   base: ECR e parâmetros; a imagem da aplicação já é publicada</w:t>
+        <w:br/>
+        <w:t>1. oficina-infra-k8s   cluster, apply 1: rede, EKS e gateway sem as rotas da Lambda</w:t>
         <w:br/>
         <w:t>2. oficina-infra-db    RDS nas subnets privadas</w:t>
         <w:br/>
-        <w:t>3. oficina-api         imagem no ECR + Flyway aplica V6 e V7</w:t>
+        <w:t>3. oficina-auth-lambda funções e publicação dos ARNs no SSM</w:t>
         <w:br/>
-        <w:t>4. oficina-auth-lambda funções + publica ARNs no SSM</w:t>
+        <w:t>4. oficina-infra-k8s   cluster, apply 2: rotas da Lambda e manifests da aplicação;</w:t>
         <w:br/>
-        <w:t>5. oficina-infra-k8s   apply 2 — enable_lambda_routes = true</w:t>
+        <w:t xml:space="preserve">                       o pod é iniciado e o Flyway aplica V6 e V7</w:t>
       </w:r>
     </w:p>
     <w:p>
@@ -3406,7 +4371,23 @@
           <w:i w:val="0"/>
           <w:sz w:val="24"/>
         </w:rPr>
-        <w:t>O passo 3 antes do 4 é obrigatório: a Lambda consulta a coluna de status criada pela migration V6. A ordem está documentada no README de cada repositório.</w:t>
+        <w:t>Os manifests da aplicação são aplicados apenas no passo 4, pois dependem do endereço do banco de dados. Até esse passo, a Lambda está implantada, mas não recebe chamadas: sua rota é criada no mesmo apply em que a migration V6 adiciona a coluna de status consultada por ela.</w:t>
+      </w:r>
+    </w:p>
+    <w:p>
+      <w:pPr>
+        <w:spacing w:before="0" w:after="120"/>
+        <w:ind w:firstLine="709"/>
+        <w:jc w:val="both"/>
+      </w:pPr>
+      <w:r>
+        <w:rPr>
+          <w:rFonts w:ascii="Times New Roman" w:hAnsi="Times New Roman"/>
+          <w:b w:val="0"/>
+          <w:i w:val="0"/>
+          <w:sz w:val="24"/>
+        </w:rPr>
+        <w:t>A sequência se aplica a cada ambiente, com os workflows disparados na branch correspondente, e a destruição segue a ordem inversa. O workflow de destruição do cluster não prossegue enquanto o banco ou a Lambda do mesmo ambiente existirem. A ordem está documentada no README de cada repositório.</w:t>
       </w:r>
     </w:p>
     <w:p>
@@ -3424,14 +4405,13 @@
           <w:color w:val="1F3A5F"/>
           <w:sz w:val="24"/>
         </w:rPr>
-        <w:t>5.4 Proteção e ambientes</w:t>
+        <w:t>5.4 Ambientes de homologação e produção</w:t>
       </w:r>
     </w:p>
     <w:p>
       <w:pPr>
-        <w:pStyle w:val="ListBullet"/>
-        <w:spacing w:after="60"/>
-        <w:ind w:left="567"/>
+        <w:spacing w:before="0" w:after="120"/>
+        <w:ind w:firstLine="709"/>
         <w:jc w:val="both"/>
       </w:pPr>
       <w:r>
@@ -3441,14 +4421,13 @@
           <w:i w:val="0"/>
           <w:sz w:val="24"/>
         </w:rPr>
-        <w:t>branch main protegida, sem push direto, inclusive para administradores.</w:t>
+        <w:t>O enunciado exige deploy automático para homologação e produção. A versão inicial do planejamento previa os dois ambientes em um único cluster e em uma única instância de banco, separados por namespace e database. Essa abordagem tem custo menor, mas não isola falhas: um teste de carga em homologação, por exemplo, consumiria recursos compartilhados com produção.</w:t>
       </w:r>
     </w:p>
     <w:p>
       <w:pPr>
-        <w:pStyle w:val="ListBullet"/>
-        <w:spacing w:after="60"/>
-        <w:ind w:left="567"/>
+        <w:spacing w:before="0" w:after="120"/>
+        <w:ind w:firstLine="709"/>
         <w:jc w:val="both"/>
       </w:pPr>
       <w:r>
@@ -3458,14 +4437,470 @@
           <w:i w:val="0"/>
           <w:sz w:val="24"/>
         </w:rPr>
-        <w:t>merge exclusivamente por Pull Request, com status checks verdes.</w:t>
+        <w:t>Considerando que um ambiente declarado em código, com state, pipeline e proteção próprios, não gera custo enquanto não é provisionado, os dois ambientes foram definidos de forma completa e independente (ADR-012):</w:t>
       </w:r>
     </w:p>
+    <w:tbl>
+      <w:tblPr>
+        <w:tblStyle w:val="TableGrid"/>
+        <w:tblW w:type="auto" w:w="0"/>
+        <w:jc w:val="center"/>
+        <w:tblLook w:firstColumn="1" w:firstRow="1" w:lastColumn="0" w:lastRow="0" w:noHBand="0" w:noVBand="1" w:val="04A0"/>
+      </w:tblPr>
+      <w:tblGrid>
+        <w:gridCol w:w="3024"/>
+        <w:gridCol w:w="3024"/>
+        <w:gridCol w:w="3024"/>
+      </w:tblGrid>
+      <w:tr>
+        <w:tc>
+          <w:tcPr>
+            <w:tcW w:type="dxa" w:w="2268"/>
+          </w:tcPr>
+          <w:p>
+            <w:pPr>
+              <w:spacing w:after="40"/>
+              <w:jc w:val="center"/>
+              <w:shd w:val="clear" w:fill="E8EDF3"/>
+            </w:pPr>
+            <w:r/>
+            <w:r>
+              <w:rPr>
+                <w:rFonts w:ascii="Times New Roman" w:hAnsi="Times New Roman"/>
+                <w:b/>
+                <w:i w:val="0"/>
+                <w:sz w:val="20"/>
+              </w:rPr>
+            </w:r>
+          </w:p>
+        </w:tc>
+        <w:tc>
+          <w:tcPr>
+            <w:tcW w:type="dxa" w:w="3402"/>
+          </w:tcPr>
+          <w:p>
+            <w:pPr>
+              <w:spacing w:after="40"/>
+              <w:jc w:val="center"/>
+              <w:shd w:val="clear" w:fill="E8EDF3"/>
+            </w:pPr>
+            <w:r/>
+            <w:r>
+              <w:rPr>
+                <w:rFonts w:ascii="Times New Roman" w:hAnsi="Times New Roman"/>
+                <w:b/>
+                <w:i w:val="0"/>
+                <w:sz w:val="20"/>
+              </w:rPr>
+              <w:t>Homologação</w:t>
+            </w:r>
+          </w:p>
+        </w:tc>
+        <w:tc>
+          <w:tcPr>
+            <w:tcW w:type="dxa" w:w="3402"/>
+          </w:tcPr>
+          <w:p>
+            <w:pPr>
+              <w:spacing w:after="40"/>
+              <w:jc w:val="center"/>
+              <w:shd w:val="clear" w:fill="E8EDF3"/>
+            </w:pPr>
+            <w:r/>
+            <w:r>
+              <w:rPr>
+                <w:rFonts w:ascii="Times New Roman" w:hAnsi="Times New Roman"/>
+                <w:b/>
+                <w:i w:val="0"/>
+                <w:sz w:val="20"/>
+              </w:rPr>
+              <w:t>Produção</w:t>
+            </w:r>
+          </w:p>
+        </w:tc>
+      </w:tr>
+      <w:tr>
+        <w:tc>
+          <w:tcPr>
+            <w:tcW w:type="dxa" w:w="2268"/>
+          </w:tcPr>
+          <w:p>
+            <w:pPr>
+              <w:spacing w:after="40"/>
+            </w:pPr>
+            <w:r/>
+            <w:r>
+              <w:rPr>
+                <w:rFonts w:ascii="Times New Roman" w:hAnsi="Times New Roman"/>
+                <w:b w:val="0"/>
+                <w:i w:val="0"/>
+                <w:sz w:val="20"/>
+              </w:rPr>
+              <w:t>Branch</w:t>
+            </w:r>
+          </w:p>
+        </w:tc>
+        <w:tc>
+          <w:tcPr>
+            <w:tcW w:type="dxa" w:w="3402"/>
+          </w:tcPr>
+          <w:p>
+            <w:pPr>
+              <w:spacing w:after="40"/>
+            </w:pPr>
+            <w:r/>
+            <w:r>
+              <w:rPr>
+                <w:rFonts w:ascii="Times New Roman" w:hAnsi="Times New Roman"/>
+                <w:b w:val="0"/>
+                <w:i w:val="0"/>
+                <w:sz w:val="20"/>
+              </w:rPr>
+              <w:t>develop</w:t>
+            </w:r>
+          </w:p>
+        </w:tc>
+        <w:tc>
+          <w:tcPr>
+            <w:tcW w:type="dxa" w:w="3402"/>
+          </w:tcPr>
+          <w:p>
+            <w:pPr>
+              <w:spacing w:after="40"/>
+            </w:pPr>
+            <w:r/>
+            <w:r>
+              <w:rPr>
+                <w:rFonts w:ascii="Times New Roman" w:hAnsi="Times New Roman"/>
+                <w:b w:val="0"/>
+                <w:i w:val="0"/>
+                <w:sz w:val="20"/>
+              </w:rPr>
+              <w:t>main</w:t>
+            </w:r>
+          </w:p>
+        </w:tc>
+      </w:tr>
+      <w:tr>
+        <w:tc>
+          <w:tcPr>
+            <w:tcW w:type="dxa" w:w="2268"/>
+          </w:tcPr>
+          <w:p>
+            <w:pPr>
+              <w:spacing w:after="40"/>
+            </w:pPr>
+            <w:r/>
+            <w:r>
+              <w:rPr>
+                <w:rFonts w:ascii="Times New Roman" w:hAnsi="Times New Roman"/>
+                <w:b w:val="0"/>
+                <w:i w:val="0"/>
+                <w:sz w:val="20"/>
+              </w:rPr>
+              <w:t>GitHub Environment</w:t>
+            </w:r>
+          </w:p>
+        </w:tc>
+        <w:tc>
+          <w:tcPr>
+            <w:tcW w:type="dxa" w:w="3402"/>
+          </w:tcPr>
+          <w:p>
+            <w:pPr>
+              <w:spacing w:after="40"/>
+            </w:pPr>
+            <w:r/>
+            <w:r>
+              <w:rPr>
+                <w:rFonts w:ascii="Times New Roman" w:hAnsi="Times New Roman"/>
+                <w:b w:val="0"/>
+                <w:i w:val="0"/>
+                <w:sz w:val="20"/>
+              </w:rPr>
+              <w:t>staging, sem aprovação</w:t>
+            </w:r>
+          </w:p>
+        </w:tc>
+        <w:tc>
+          <w:tcPr>
+            <w:tcW w:type="dxa" w:w="3402"/>
+          </w:tcPr>
+          <w:p>
+            <w:pPr>
+              <w:spacing w:after="40"/>
+            </w:pPr>
+            <w:r/>
+            <w:r>
+              <w:rPr>
+                <w:rFonts w:ascii="Times New Roman" w:hAnsi="Times New Roman"/>
+                <w:b w:val="0"/>
+                <w:i w:val="0"/>
+                <w:sz w:val="20"/>
+              </w:rPr>
+              <w:t>prod, com revisor</w:t>
+            </w:r>
+          </w:p>
+        </w:tc>
+      </w:tr>
+      <w:tr>
+        <w:tc>
+          <w:tcPr>
+            <w:tcW w:type="dxa" w:w="2268"/>
+          </w:tcPr>
+          <w:p>
+            <w:pPr>
+              <w:spacing w:after="40"/>
+            </w:pPr>
+            <w:r/>
+            <w:r>
+              <w:rPr>
+                <w:rFonts w:ascii="Times New Roman" w:hAnsi="Times New Roman"/>
+                <w:b w:val="0"/>
+                <w:i w:val="0"/>
+                <w:sz w:val="20"/>
+              </w:rPr>
+              <w:t>Recursos</w:t>
+            </w:r>
+          </w:p>
+        </w:tc>
+        <w:tc>
+          <w:tcPr>
+            <w:tcW w:type="dxa" w:w="3402"/>
+          </w:tcPr>
+          <w:p>
+            <w:pPr>
+              <w:spacing w:after="40"/>
+            </w:pPr>
+            <w:r/>
+            <w:r>
+              <w:rPr>
+                <w:rFonts w:ascii="Times New Roman" w:hAnsi="Times New Roman"/>
+                <w:b w:val="0"/>
+                <w:i w:val="0"/>
+                <w:sz w:val="20"/>
+              </w:rPr>
+              <w:t>oficina-api-staging-*, VPC própria</w:t>
+            </w:r>
+          </w:p>
+        </w:tc>
+        <w:tc>
+          <w:tcPr>
+            <w:tcW w:type="dxa" w:w="3402"/>
+          </w:tcPr>
+          <w:p>
+            <w:pPr>
+              <w:spacing w:after="40"/>
+            </w:pPr>
+            <w:r/>
+            <w:r>
+              <w:rPr>
+                <w:rFonts w:ascii="Times New Roman" w:hAnsi="Times New Roman"/>
+                <w:b w:val="0"/>
+                <w:i w:val="0"/>
+                <w:sz w:val="20"/>
+              </w:rPr>
+              <w:t>oficina-api-prod-*, VPC própria</w:t>
+            </w:r>
+          </w:p>
+        </w:tc>
+      </w:tr>
+      <w:tr>
+        <w:tc>
+          <w:tcPr>
+            <w:tcW w:type="dxa" w:w="2268"/>
+          </w:tcPr>
+          <w:p>
+            <w:pPr>
+              <w:spacing w:after="40"/>
+            </w:pPr>
+            <w:r/>
+            <w:r>
+              <w:rPr>
+                <w:rFonts w:ascii="Times New Roman" w:hAnsi="Times New Roman"/>
+                <w:b w:val="0"/>
+                <w:i w:val="0"/>
+                <w:sz w:val="20"/>
+              </w:rPr>
+              <w:t>State do Terraform</w:t>
+            </w:r>
+          </w:p>
+        </w:tc>
+        <w:tc>
+          <w:tcPr>
+            <w:tcW w:type="dxa" w:w="3402"/>
+          </w:tcPr>
+          <w:p>
+            <w:pPr>
+              <w:spacing w:after="40"/>
+            </w:pPr>
+            <w:r/>
+            <w:r>
+              <w:rPr>
+                <w:rFonts w:ascii="Times New Roman" w:hAnsi="Times New Roman"/>
+                <w:b w:val="0"/>
+                <w:i w:val="0"/>
+                <w:sz w:val="20"/>
+              </w:rPr>
+              <w:t>infra-k8s/staging/…, infra-db/staging</w:t>
+            </w:r>
+          </w:p>
+        </w:tc>
+        <w:tc>
+          <w:tcPr>
+            <w:tcW w:type="dxa" w:w="3402"/>
+          </w:tcPr>
+          <w:p>
+            <w:pPr>
+              <w:spacing w:after="40"/>
+            </w:pPr>
+            <w:r/>
+            <w:r>
+              <w:rPr>
+                <w:rFonts w:ascii="Times New Roman" w:hAnsi="Times New Roman"/>
+                <w:b w:val="0"/>
+                <w:i w:val="0"/>
+                <w:sz w:val="20"/>
+              </w:rPr>
+              <w:t>infra-k8s/prod/…, infra-db/prod</w:t>
+            </w:r>
+          </w:p>
+        </w:tc>
+      </w:tr>
+      <w:tr>
+        <w:tc>
+          <w:tcPr>
+            <w:tcW w:type="dxa" w:w="2268"/>
+          </w:tcPr>
+          <w:p>
+            <w:pPr>
+              <w:spacing w:after="40"/>
+            </w:pPr>
+            <w:r/>
+            <w:r>
+              <w:rPr>
+                <w:rFonts w:ascii="Times New Roman" w:hAnsi="Times New Roman"/>
+                <w:b w:val="0"/>
+                <w:i w:val="0"/>
+                <w:sz w:val="20"/>
+              </w:rPr>
+              <w:t>Parâmetros no SSM</w:t>
+            </w:r>
+          </w:p>
+        </w:tc>
+        <w:tc>
+          <w:tcPr>
+            <w:tcW w:type="dxa" w:w="3402"/>
+          </w:tcPr>
+          <w:p>
+            <w:pPr>
+              <w:spacing w:after="40"/>
+            </w:pPr>
+            <w:r/>
+            <w:r>
+              <w:rPr>
+                <w:rFonts w:ascii="Times New Roman" w:hAnsi="Times New Roman"/>
+                <w:b w:val="0"/>
+                <w:i w:val="0"/>
+                <w:sz w:val="20"/>
+              </w:rPr>
+              <w:t>/oficina/staging/…</w:t>
+            </w:r>
+          </w:p>
+        </w:tc>
+        <w:tc>
+          <w:tcPr>
+            <w:tcW w:type="dxa" w:w="3402"/>
+          </w:tcPr>
+          <w:p>
+            <w:pPr>
+              <w:spacing w:after="40"/>
+            </w:pPr>
+            <w:r/>
+            <w:r>
+              <w:rPr>
+                <w:rFonts w:ascii="Times New Roman" w:hAnsi="Times New Roman"/>
+                <w:b w:val="0"/>
+                <w:i w:val="0"/>
+                <w:sz w:val="20"/>
+              </w:rPr>
+              <w:t>/oficina/prod/…</w:t>
+            </w:r>
+          </w:p>
+        </w:tc>
+      </w:tr>
+      <w:tr>
+        <w:tc>
+          <w:tcPr>
+            <w:tcW w:type="dxa" w:w="2268"/>
+          </w:tcPr>
+          <w:p>
+            <w:pPr>
+              <w:spacing w:after="40"/>
+            </w:pPr>
+            <w:r/>
+            <w:r>
+              <w:rPr>
+                <w:rFonts w:ascii="Times New Roman" w:hAnsi="Times New Roman"/>
+                <w:b w:val="0"/>
+                <w:i w:val="0"/>
+                <w:sz w:val="20"/>
+              </w:rPr>
+              <w:t>Segredos</w:t>
+            </w:r>
+          </w:p>
+        </w:tc>
+        <w:tc>
+          <w:tcPr>
+            <w:tcW w:type="dxa" w:w="3402"/>
+          </w:tcPr>
+          <w:p>
+            <w:pPr>
+              <w:spacing w:after="40"/>
+            </w:pPr>
+            <w:r/>
+            <w:r>
+              <w:rPr>
+                <w:rFonts w:ascii="Times New Roman" w:hAnsi="Times New Roman"/>
+                <w:b w:val="0"/>
+                <w:i w:val="0"/>
+                <w:sz w:val="20"/>
+              </w:rPr>
+              <w:t>gerados pelo Terraform</w:t>
+            </w:r>
+          </w:p>
+        </w:tc>
+        <w:tc>
+          <w:tcPr>
+            <w:tcW w:type="dxa" w:w="3402"/>
+          </w:tcPr>
+          <w:p>
+            <w:pPr>
+              <w:spacing w:after="40"/>
+            </w:pPr>
+            <w:r/>
+            <w:r>
+              <w:rPr>
+                <w:rFonts w:ascii="Times New Roman" w:hAnsi="Times New Roman"/>
+                <w:b w:val="0"/>
+                <w:i w:val="0"/>
+                <w:sz w:val="20"/>
+              </w:rPr>
+              <w:t>gerados pelo Terraform</w:t>
+            </w:r>
+          </w:p>
+        </w:tc>
+      </w:tr>
+    </w:tbl>
     <w:p>
       <w:pPr>
-        <w:pStyle w:val="ListBullet"/>
-        <w:spacing w:after="60"/>
-        <w:ind w:left="567"/>
+        <w:spacing w:after="80"/>
+      </w:pPr>
+    </w:p>
+    <w:p>
+      <w:pPr>
+        <w:spacing w:before="0" w:after="120"/>
+        <w:ind w:firstLine="709"/>
         <w:jc w:val="both"/>
       </w:pPr>
       <w:r>
@@ -3475,7 +4910,25 @@
           <w:i w:val="0"/>
           <w:sz w:val="24"/>
         </w:rPr>
-        <w:t>develop entrega em homologação e main em produção, ambos automáticos.</w:t>
+        <w:t>Os testes e a demonstração são realizados em homologação. O ambiente de produção está preparado e protegido, com o mesmo código e os mesmos pipelines, mas não foi provisionado, de modo que o custo de operação corresponde ao de um único ambiente.</w:t>
+      </w:r>
+    </w:p>
+    <w:p>
+      <w:pPr>
+        <w:pStyle w:val="Heading3"/>
+        <w:keepNext/>
+        <w:spacing w:before="240" w:after="160"/>
+        <w:jc w:val="left"/>
+      </w:pPr>
+      <w:r>
+        <w:rPr>
+          <w:rFonts w:ascii="Times New Roman" w:hAnsi="Times New Roman"/>
+          <w:b/>
+          <w:i w:val="0"/>
+          <w:color w:val="1F3A5F"/>
+          <w:sz w:val="24"/>
+        </w:rPr>
+        <w:t>5.5 Proteção das branches e dos pipelines</w:t>
       </w:r>
     </w:p>
     <w:p>
@@ -3492,7 +4945,7 @@
           <w:i w:val="0"/>
           <w:sz w:val="24"/>
         </w:rPr>
-        <w:t>o apply em produção exige aprovação humana no GitHub Environment.</w:t>
+        <w:t>branches develop e main protegidas contra push direto, inclusive para administradores;</w:t>
       </w:r>
     </w:p>
     <w:p>
@@ -3509,13 +4962,14 @@
           <w:i w:val="0"/>
           <w:sz w:val="24"/>
         </w:rPr>
-        <w:t>autenticação com a AWS por OIDC nos quatro repositórios — nenhum secret de chave de acesso de longa duração.</w:t>
+        <w:t>merge somente por Pull Request, com uma aprovação e status checks aprovados;</w:t>
       </w:r>
     </w:p>
     <w:p>
       <w:pPr>
-        <w:spacing w:before="0" w:after="120"/>
-        <w:ind w:firstLine="709"/>
+        <w:pStyle w:val="ListBullet"/>
+        <w:spacing w:after="60"/>
+        <w:ind w:left="567"/>
         <w:jc w:val="both"/>
       </w:pPr>
       <w:r>
@@ -3525,7 +4979,41 @@
           <w:i w:val="0"/>
           <w:sz w:val="24"/>
         </w:rPr>
-        <w:t>Homologação e produção compartilham cluster e instância de banco, separados por namespace e database. Duplicar a infraestrutura custaria mais setenta e três dólares mensais só de control plane. É um compromisso de orçamento, declarado como débito técnico e não apresentado como boa prática.</w:t>
+        <w:t>aplicação e Lambda implantadas automaticamente após o merge; na infraestrutura, a stack de menor custo (ECR e parâmetros) é aplicada no merge, enquanto cluster e banco são provisionados por disparo manual;</w:t>
+      </w:r>
+    </w:p>
+    <w:p>
+      <w:pPr>
+        <w:pStyle w:val="ListBullet"/>
+        <w:spacing w:after="60"/>
+        <w:ind w:left="567"/>
+        <w:jc w:val="both"/>
+      </w:pPr>
+      <w:r>
+        <w:rPr>
+          <w:rFonts w:ascii="Times New Roman" w:hAnsi="Times New Roman"/>
+          <w:b w:val="0"/>
+          <w:i w:val="0"/>
+          <w:sz w:val="24"/>
+        </w:rPr>
+        <w:t>jobs de deploy verificam previamente a existência do ambiente e, na ausência de cluster ou ECR, são ignorados com aviso, sem falha e sem solicitar aprovação;</w:t>
+      </w:r>
+    </w:p>
+    <w:p>
+      <w:pPr>
+        <w:pStyle w:val="ListBullet"/>
+        <w:spacing w:after="60"/>
+        <w:ind w:left="567"/>
+        <w:jc w:val="both"/>
+      </w:pPr>
+      <w:r>
+        <w:rPr>
+          <w:rFonts w:ascii="Times New Roman" w:hAnsi="Times New Roman"/>
+          <w:b w:val="0"/>
+          <w:i w:val="0"/>
+          <w:sz w:val="24"/>
+        </w:rPr>
+        <w:t>o workflow de destruição de cada repositório não prossegue fora da ordem de dependências.</w:t>
       </w:r>
     </w:p>
     <w:p>
@@ -3566,7 +5054,7 @@
           <w:color w:val="1F3A5F"/>
           <w:sz w:val="24"/>
         </w:rPr>
-        <w:t>6.1 Justificativa formal da escolha</w:t>
+        <w:t>6.1 Justificativa da escolha</w:t>
       </w:r>
     </w:p>
     <w:p>
@@ -3582,7 +5070,7 @@
           <w:i w:val="0"/>
           <w:sz w:val="24"/>
         </w:rPr>
-        <w:t>A escolha é de continuidade: PostgreSQL 16 em Amazon RDS, mantido da Fase 2. A justificativa não é inércia, e as alternativas foram avaliadas formalmente na RFC-002.</w:t>
+        <w:t>Foi mantido o PostgreSQL 16 no Amazon RDS, utilizado desde a Fase 2. As alternativas foram avaliadas na RFC-002.</w:t>
       </w:r>
     </w:p>
     <w:p>
@@ -3598,7 +5086,7 @@
           <w:i w:val="0"/>
           <w:sz w:val="24"/>
         </w:rPr>
-        <w:t>O domínio é fortemente relacional. Há integridade referencial entre cinco tabelas e junção em toda consulta de ordem de serviço. O schema depende de recursos específicos do PostgreSQL: a extensão pgcrypto, geração de UUID no servidor, tipo numérico exato para valores monetários e constraints CHECK nomeadas que espelham as invariantes do domínio.</w:t>
+        <w:t>O domínio é relacional, com integridade referencial entre cinco tabelas e junções nas consultas de ordens de serviço. O schema utiliza recursos específicos do PostgreSQL: a extensão pgcrypto, a geração de UUID no servidor, o tipo numérico exato para valores monetários e constraints CHECK que representam invariantes do domínio.</w:t>
       </w:r>
     </w:p>
     <w:tbl>
@@ -3654,7 +5142,7 @@
                 <w:i w:val="0"/>
                 <w:sz w:val="20"/>
               </w:rPr>
-              <w:t>A favor</w:t>
+              <w:t>Pontos favoráveis</w:t>
             </w:r>
           </w:p>
         </w:tc>
@@ -3676,7 +5164,7 @@
                 <w:i w:val="0"/>
                 <w:sz w:val="20"/>
               </w:rPr>
-              <w:t>Por que não</w:t>
+              <w:t>Motivo da não escolha</w:t>
             </w:r>
           </w:p>
         </w:tc>
@@ -3738,7 +5226,7 @@
                 <w:i w:val="0"/>
                 <w:sz w:val="20"/>
               </w:rPr>
-              <w:t>Exigiria desnormalizar e reescrever a persistência inteira</w:t>
+              <w:t>Exigiria desnormalizar e reescrever a camada de persistência</w:t>
             </w:r>
           </w:p>
         </w:tc>
@@ -3780,7 +5268,7 @@
                 <w:i w:val="0"/>
                 <w:sz w:val="20"/>
               </w:rPr>
-              <w:t>Compatível com PostgreSQL, escala a zero</w:t>
+              <w:t>Compatível com PostgreSQL, com escala automática</w:t>
             </w:r>
           </w:p>
         </w:tc>
@@ -3800,7 +5288,7 @@
                 <w:i w:val="0"/>
                 <w:sz w:val="20"/>
               </w:rPr>
-              <w:t>Capacidade mínima custa mais que a instância atual</w:t>
+              <w:t>A capacidade mínima custa mais que a instância utilizada</w:t>
             </w:r>
           </w:p>
         </w:tc>
@@ -3842,7 +5330,7 @@
                 <w:i w:val="0"/>
                 <w:sz w:val="20"/>
               </w:rPr>
-              <w:t>Nenhuma vantagem técnica no caso</w:t>
+              <w:t>Sem vantagem técnica para o caso</w:t>
             </w:r>
           </w:p>
         </w:tc>
@@ -3862,7 +5350,7 @@
                 <w:i w:val="0"/>
                 <w:sz w:val="20"/>
               </w:rPr>
-              <w:t>Schema já depende de recursos do PostgreSQL</w:t>
+              <w:t>O schema depende de recursos do PostgreSQL</w:t>
             </w:r>
           </w:p>
         </w:tc>
@@ -3904,7 +5392,7 @@
                 <w:i w:val="0"/>
                 <w:sz w:val="20"/>
               </w:rPr>
-              <w:t>Zero migração, zero reescrita, integridade preservada</w:t>
+              <w:t>Sem migração de dados nem reescrita, integridade preservada</w:t>
             </w:r>
           </w:p>
         </w:tc>
@@ -3924,7 +5412,7 @@
                 <w:i w:val="0"/>
                 <w:sz w:val="20"/>
               </w:rPr>
-              <w:t>Escolhido</w:t>
+              <w:t>Opção escolhida</w:t>
             </w:r>
           </w:p>
         </w:tc>
@@ -3950,7 +5438,7 @@
           <w:color w:val="1F3A5F"/>
           <w:sz w:val="24"/>
         </w:rPr>
-        <w:t>6.2 Explicação dos relacionamentos</w:t>
+        <w:t>6.2 Relacionamentos</w:t>
       </w:r>
     </w:p>
     <w:p>
@@ -3966,7 +5454,79 @@
           <w:i w:val="0"/>
           <w:sz w:val="24"/>
         </w:rPr>
-        <w:t>O diagrama entidade-relacionamento completo está em docs/tech-challenge-3/diagramas/der-modelo-relacional.md. Os relacionamentos e o raciocínio por trás de cada um:</w:t>
+        <w:t>A Figura 6 apresenta o diagrama entidade-relacionamento, cuja fonte versionada está em docs/tech-challenge-3/diagramas/der-modelo-relacional.md. Os relacionamentos são descritos a seguir:</w:t>
+      </w:r>
+    </w:p>
+    <w:p>
+      <w:pPr>
+        <w:keepNext/>
+        <w:spacing w:before="160" w:after="40"/>
+        <w:jc w:val="center"/>
+      </w:pPr>
+      <w:r>
+        <w:rPr>
+          <w:rFonts w:ascii="Times New Roman" w:hAnsi="Times New Roman"/>
+          <w:b/>
+          <w:i w:val="0"/>
+          <w:sz w:val="20"/>
+        </w:rPr>
+        <w:t>Figura 6 — Diagrama entidade-relacionamento</w:t>
+      </w:r>
+    </w:p>
+    <w:p>
+      <w:pPr>
+        <w:keepNext/>
+        <w:jc w:val="center"/>
+      </w:pPr>
+      <w:r>
+        <w:drawing>
+          <wp:inline xmlns:a="http://schemas.openxmlformats.org/drawingml/2006/main" xmlns:pic="http://schemas.openxmlformats.org/drawingml/2006/picture">
+            <wp:extent cx="5760000" cy="5682511"/>
+            <wp:docPr id="6" name="Picture 6"/>
+            <wp:cNvGraphicFramePr>
+              <a:graphicFrameLocks noChangeAspect="1"/>
+            </wp:cNvGraphicFramePr>
+            <a:graphic>
+              <a:graphicData uri="http://schemas.openxmlformats.org/drawingml/2006/picture">
+                <pic:pic>
+                  <pic:nvPicPr>
+                    <pic:cNvPr id="0" name="der-modelo-relacional.png"/>
+                    <pic:cNvPicPr/>
+                  </pic:nvPicPr>
+                  <pic:blipFill>
+                    <a:blip r:embed="rId14"/>
+                    <a:stretch>
+                      <a:fillRect/>
+                    </a:stretch>
+                  </pic:blipFill>
+                  <pic:spPr>
+                    <a:xfrm>
+                      <a:off x="0" y="0"/>
+                      <a:ext cx="5760000" cy="5682511"/>
+                    </a:xfrm>
+                    <a:prstGeom prst="rect"/>
+                  </pic:spPr>
+                </pic:pic>
+              </a:graphicData>
+            </a:graphic>
+          </wp:inline>
+        </w:drawing>
+      </w:r>
+    </w:p>
+    <w:p>
+      <w:pPr>
+        <w:spacing w:after="200"/>
+        <w:jc w:val="center"/>
+      </w:pPr>
+      <w:r>
+        <w:rPr>
+          <w:rFonts w:ascii="Times New Roman" w:hAnsi="Times New Roman"/>
+          <w:b w:val="0"/>
+          <w:i w:val="0"/>
+          <w:color w:val="555555"/>
+          <w:sz w:val="20"/>
+        </w:rPr>
+        <w:t>Fonte: elaborado pelos autores.</w:t>
       </w:r>
     </w:p>
     <w:p>
@@ -3992,7 +5552,7 @@
           <w:i w:val="0"/>
           <w:sz w:val="24"/>
         </w:rPr>
-        <w:t>um cliente possui zero ou mais veículos, e todo veículo pertence a exatamente um cliente. Não existe veículo órfão no modelo, e a placa é única globalmente.</w:t>
+        <w:t>um cliente possui zero ou mais veículos, e cada veículo pertence a um único cliente. A placa é única.</w:t>
       </w:r>
     </w:p>
     <w:p>
@@ -4018,7 +5578,7 @@
           <w:i w:val="0"/>
           <w:sz w:val="24"/>
         </w:rPr>
-        <w:t>a ordem carrega duas chaves estrangeiras — cliente e veículo — ainda que o cliente pudesse ser derivado do veículo. É desnormalização deliberada: o titular pode mudar, e a ordem precisa preservar quem era o cliente na abertura.</w:t>
+        <w:t>a ordem referencia o cliente e o veículo, ainda que o cliente pudesse ser obtido a partir do veículo. A desnormalização é intencional: como a titularidade do veículo pode mudar, a ordem preserva o cliente registrado na abertura.</w:t>
       </w:r>
     </w:p>
     <w:p>
@@ -4044,7 +5604,7 @@
           <w:i w:val="0"/>
           <w:sz w:val="24"/>
         </w:rPr>
-        <w:t>composição, não agregação. Os itens não existem sem a ordem, o que o ON DELETE CASCADE reflete. É a fronteira do agregado no domínio.</w:t>
+        <w:t>relação de composição, na qual os itens não existem sem a ordem. O ON DELETE CASCADE reflete essa relação, que corresponde à fronteira do agregado no domínio.</w:t>
       </w:r>
     </w:p>
     <w:p>
@@ -4070,7 +5630,7 @@
           <w:i w:val="0"/>
           <w:sz w:val="24"/>
         </w:rPr>
-        <w:t>relacionamento N—N resolvido pelas tabelas de itens, que não são meras tabelas de junção: carregam quantidade e snapshot de preço.</w:t>
+        <w:t>relacionamento N—N resolvido pelas tabelas de itens, que armazenam também a quantidade e o preço vigente no momento da inclusão.</w:t>
       </w:r>
     </w:p>
     <w:p>
@@ -4086,7 +5646,7 @@
           <w:i w:val="0"/>
           <w:sz w:val="24"/>
         </w:rPr>
-        <w:t>O padrão de snapshot merece destaque porque parece redundância acidental e não é: um orçamento aprovado precisa continuar valendo o que valia quando foi aprovado. Se o preço de uma peça subir depois, a ordem já fechada não pode mudar de valor retroativamente. A chave estrangeira para o catálogo permanece para rastreabilidade; o valor cobrado vem do snapshot.</w:t>
+        <w:t>O armazenamento do preço no item garante que um orçamento aprovado mantenha o valor original, mesmo que o preço do serviço ou da peça seja alterado posteriormente. A chave estrangeira para o catálogo é mantida para rastreabilidade, e o valor cobrado é obtido do item.</w:t>
       </w:r>
     </w:p>
     <w:p>
@@ -4120,7 +5680,7 @@
           <w:i w:val="0"/>
           <w:sz w:val="24"/>
         </w:rPr>
-        <w:t>As constraints funcionam como segunda linha de defesa das regras de domínio: se algum caminho de escrita escapar da aplicação, o banco ainda recusa. chk_status espelha os sete estados da ordem; chk_cliente_status, os três de situação cadastral; chk_estoque_nao_negativo impede estoque negativo; e as unicidades de CPF e placa impedem duplicação.</w:t>
+        <w:t>As constraints atuam como segunda camada de proteção das regras de domínio, recusando escritas inválidas que não passem pela aplicação. A constraint chk_status restringe os sete estados da ordem; chk_cliente_status, as três situações cadastrais; chk_estoque_nao_negativo impede estoque negativo; e as restrições de unicidade de CPF e placa impedem duplicidade.</w:t>
       </w:r>
     </w:p>
     <w:p>
@@ -4138,7 +5698,7 @@
           <w:color w:val="1F3A5F"/>
           <w:sz w:val="24"/>
         </w:rPr>
-        <w:t>6.4 Limitações aceitas</w:t>
+        <w:t>6.4 Limitações</w:t>
       </w:r>
     </w:p>
     <w:p>
@@ -4154,7 +5714,7 @@
           <w:i w:val="0"/>
           <w:sz w:val="24"/>
         </w:rPr>
-        <w:t>A instância é Single-AZ, sem failover automático, e o destroy não gera snapshot final. São decisões conscientes de custo para ambiente de estudo, coerentes com a estratégia de destruir o ambiente entre sessões de trabalho.</w:t>
+        <w:t>A instância é Single-AZ, sem failover automático, e a destruição não gera snapshot final. Essas escolhas foram feitas em função do custo em ambiente de estudo, considerando que o ambiente é destruído ao fim de cada sessão de trabalho.</w:t>
       </w:r>
     </w:p>
     <w:p>
@@ -4170,7 +5730,7 @@
           <w:i w:val="0"/>
           <w:sz w:val="24"/>
         </w:rPr>
-        <w:t>O limite de aproximadamente oitenta e cinco conexões simultâneas da classe utilizada é o ponto que mais exigiu atenção nesta fase, porque a Lambda escala por invocação. A contenção foi explícita: concorrência reservada em dez, uma conexão por container de execução guardada em campo estático, sem pool, e timeouts curtos no driver. Se a concorrência precisar crescer, a resposta é o RDS Proxy, não elevar o limite.</w:t>
+        <w:t>A classe utilizada suporta aproximadamente oitenta e cinco conexões simultâneas, o que exigiu atenção, pois a Lambda escala por invocação. Foram adotadas concorrência reservada de dez execuções, uma conexão por container de execução mantida em campo estático, sem pool, e timeouts curtos no driver. Caso seja necessário aumentar a concorrência, a alternativa indicada é o RDS Proxy.</w:t>
       </w:r>
     </w:p>
     <w:p>
@@ -4211,7 +5771,7 @@
           <w:color w:val="1F3A5F"/>
           <w:sz w:val="24"/>
         </w:rPr>
-        <w:t>7.1 A escolha da plataforma</w:t>
+        <w:t>7.1 Escolha da plataforma</w:t>
       </w:r>
     </w:p>
     <w:p>
@@ -4227,7 +5787,7 @@
           <w:i w:val="0"/>
           <w:sz w:val="24"/>
         </w:rPr>
-        <w:t>O enunciado permite Datadog ou New Relic, e as disciplinas cobrem as duas com profundidade equivalente. A escolha foi New Relic, por uma razão prática: o free tier é perpétuo, com cem gigabytes mensais de ingestão. O do Datadog é trial de catorze dias, o que obrigaria a cronometrar a janela para coincidir com a gravação do vídeo — risco desnecessário numa entrega com prazo.</w:t>
+        <w:t>O enunciado permite Datadog ou New Relic, e ambos são abordados pelas disciplinas. Optou-se pelo New Relic porque seu plano gratuito é permanente, com cem gigabytes mensais de ingestão, enquanto o do Datadog é um período de avaliação de catorze dias, o que exigiria sincronizar esse período com a gravação do vídeo.</w:t>
       </w:r>
     </w:p>
     <w:p>
@@ -4245,7 +5805,7 @@
           <w:color w:val="1F3A5F"/>
           <w:sz w:val="24"/>
         </w:rPr>
-        <w:t>7.2 Os cinco sinais exigidos</w:t>
+        <w:t>7.2 Sinais monitorados</w:t>
       </w:r>
     </w:p>
     <w:tbl>
@@ -4300,7 +5860,7 @@
                 <w:i w:val="0"/>
                 <w:sz w:val="20"/>
               </w:rPr>
-              <w:t>Como é atendido</w:t>
+              <w:t>Implementação</w:t>
             </w:r>
           </w:p>
         </w:tc>
@@ -4384,7 +5944,7 @@
                 <w:i w:val="0"/>
                 <w:sz w:val="20"/>
               </w:rPr>
-              <w:t>Integração Kubernetes por DaemonSet, filtrável por pod</w:t>
+              <w:t>Integração Kubernetes por DaemonSet, com filtro por pod</w:t>
             </w:r>
           </w:p>
         </w:tc>
@@ -4426,7 +5986,7 @@
                 <w:i w:val="0"/>
                 <w:sz w:val="20"/>
               </w:rPr>
-              <w:t>Monitor sintético contra /actuator/health, 3 localizações</w:t>
+              <w:t>Monitor sintético contra /actuator/health, em 3 localizações</w:t>
             </w:r>
           </w:p>
         </w:tc>
@@ -4536,7 +6096,7 @@
           <w:color w:val="1F3A5F"/>
           <w:sz w:val="24"/>
         </w:rPr>
-        <w:t>7.3 Logs estruturados e a armadilha da cobrança dupla</w:t>
+        <w:t>7.3 Logs estruturados</w:t>
       </w:r>
     </w:p>
     <w:p>
@@ -4552,12 +6112,12 @@
           <w:i w:val="0"/>
           <w:sz w:val="24"/>
         </w:rPr>
-        <w:t>O Spring Boot 3.4 traz structured logging nativo — não foi preciso adicionar biblioteca nem escrever configuração de logback. O formato ECS foi escolhido porque usa os nomes de campo trace.id e span.id, exatamente os que a plataforma procura para ligar uma linha de log ao trace distribuído correspondente.</w:t>
+        <w:t>O Spring Boot 3.4 oferece structured logging nativo, sem necessidade de biblioteca adicional ou de configuração do logback. Foi adotado o formato ECS, que utiliza os campos trace.id e span.id, reconhecidos pela plataforma para associar cada linha de log ao trace correspondente.</w:t>
       </w:r>
     </w:p>
     <w:p>
       <w:pPr>
-        <w:spacing w:after="120"/>
+        <w:spacing w:before="0" w:after="120"/>
         <w:ind w:firstLine="709"/>
         <w:jc w:val="both"/>
       </w:pPr>
@@ -4568,25 +6128,7 @@
           <w:i w:val="0"/>
           <w:sz w:val="24"/>
         </w:rPr>
-        <w:t xml:space="preserve">Um detalhe da Aula 08 evitou um erro caro: o encaminhamento de log pelo agente de APM foi </w:t>
-      </w:r>
-      <w:r>
-        <w:rPr>
-          <w:rFonts w:ascii="Times New Roman" w:hAnsi="Times New Roman"/>
-          <w:b/>
-          <w:i w:val="0"/>
-          <w:sz w:val="24"/>
-        </w:rPr>
-        <w:t>desligado</w:t>
-      </w:r>
-      <w:r>
-        <w:rPr>
-          <w:rFonts w:ascii="Times New Roman" w:hAnsi="Times New Roman"/>
-          <w:b w:val="0"/>
-          <w:i w:val="0"/>
-          <w:sz w:val="24"/>
-        </w:rPr>
-        <w:t>. Quem envia log é o Fluent Bit da integração Kubernetes. Manter os dois ligados envia cada linha duas vezes e, com free tier medido em gigabytes, queimaria a cota pela metade.</w:t>
+        <w:t>Conforme orientação da Aula 08, o encaminhamento de logs pelo agente de APM foi desativado, pois o envio é feito pelo Fluent Bit da integração Kubernetes. Com os dois mecanismos ativos, cada linha seria enviada duas vezes, dobrando o consumo da cota do plano gratuito.</w:t>
       </w:r>
     </w:p>
     <w:p>
@@ -4604,7 +6146,7 @@
           <w:color w:val="1F3A5F"/>
           <w:sz w:val="24"/>
         </w:rPr>
-        <w:t>7.4 Os três dashboards de negócio</w:t>
+        <w:t>7.4 Dashboards de negócio</w:t>
       </w:r>
     </w:p>
     <w:p>
@@ -4620,7 +6162,7 @@
           <w:i w:val="0"/>
           <w:sz w:val="24"/>
         </w:rPr>
-        <w:t>Nenhum dos três sai do agente. São métricas customizadas emitidas pela aplicação, instrumentadas nos casos de uso e não nos controllers:</w:t>
+        <w:t>Os três painéis são alimentados por métricas customizadas emitidas pela aplicação, instrumentadas nos casos de uso e não nos controllers:</w:t>
       </w:r>
     </w:p>
     <w:tbl>
@@ -4908,7 +6450,7 @@
           <w:i w:val="0"/>
           <w:sz w:val="24"/>
         </w:rPr>
-        <w:t>Um dashboard técnico complementar acompanha latência por percentil, taxa de erro separada entre 4xx e 5xx, recursos por pod, réplicas ativas do HPA e o Apdex. As consultas usam variável de template para que o mesmo painel sirva homologação e produção sem duplicação.</w:t>
+        <w:t>Um dashboard técnico complementar apresenta latência por percentil, taxa de erros separada entre 4xx e 5xx, uso de recursos por pod, réplicas ativas do HPA e Apdex. Cada ambiente possui seus próprios dashboards, criados pelo mesmo código e filtrados pelo nome da aplicação e pela tag de ambiente.</w:t>
       </w:r>
     </w:p>
     <w:p>
@@ -4926,7 +6468,7 @@
           <w:color w:val="1F3A5F"/>
           <w:sz w:val="24"/>
         </w:rPr>
-        <w:t>7.5 Alertas com runbook</w:t>
+        <w:t>7.5 Alertas e runbooks</w:t>
       </w:r>
     </w:p>
     <w:p>
@@ -4942,7 +6484,7 @@
           <w:i w:val="0"/>
           <w:sz w:val="24"/>
         </w:rPr>
-        <w:t>Seis condições de alerta, criadas por Terraform e não pelo console — como recomenda a Aula 10, isso evita alteração não documentada e transforma o próprio código em documentação. A nomenclatura segue o padrão ensinado, em que o nome já entrega conta, ambiente, recurso e sintoma:</w:t>
+        <w:t>Foram definidas seis condições de alerta por meio do Terraform, e não pelo console, conforme recomendado na Aula 10, o que evita alterações não documentadas. A nomenclatura segue o padrão apresentado na disciplina, indicando conta, ambiente, recurso, sintoma e severidade:</w:t>
       </w:r>
     </w:p>
     <w:p>
@@ -4959,22 +6501,22 @@
           <w:color w:val="555555"/>
           <w:sz w:val="19"/>
         </w:rPr>
-        <w:t>AWS-OficinaAPI-Prod-OS-FalhaTransicao-Critical</w:t>
+        <w:t>AWS-OficinaAPI-Staging-OS-FalhaTransicao-Critical</w:t>
         <w:br/>
-        <w:t>AWS-OficinaAPI-Prod-API-LatenciaP95-Warning</w:t>
+        <w:t>AWS-OficinaAPI-Staging-API-LatenciaP95-Warning</w:t>
         <w:br/>
-        <w:t>AWS-OficinaAPI-Prod-API-TaxaErro5xx-Critical</w:t>
+        <w:t>AWS-OficinaAPI-Staging-API-TaxaErro5xx-Critical</w:t>
         <w:br/>
-        <w:t>AWS-OficinaAPI-Prod-K8s-MemoriaPod-Warning</w:t>
+        <w:t>AWS-OficinaAPI-Staging-K8s-MemoriaPod-Warning</w:t>
         <w:br/>
-        <w:t>AWS-OficinaAPI-Prod-Integracao-Falhas-Warning</w:t>
+        <w:t>AWS-OficinaAPI-Staging-Integracao-Falhas-Warning</w:t>
         <w:br/>
-        <w:t>AWS-OficinaAPI-Prod-Health-Uptime-Critical</w:t>
+        <w:t>AWS-OficinaAPI-Staging-Health-Uptime-Critical</w:t>
       </w:r>
     </w:p>
     <w:p>
       <w:pPr>
-        <w:spacing w:after="120"/>
+        <w:spacing w:before="0" w:after="120"/>
         <w:ind w:firstLine="709"/>
         <w:jc w:val="both"/>
       </w:pPr>
@@ -4985,17 +6527,15 @@
           <w:i w:val="0"/>
           <w:sz w:val="24"/>
         </w:rPr>
-        <w:t xml:space="preserve">Cada alerta carrega link para um runbook que </w:t>
+        <w:t>Cada alerta inclui o link para um runbook, conforme a orientação da Aula 05 de que um alerta deve estar associado a uma ação definida. Os seis runbooks estão em docs/runbooks e descrevem, para cada alerta, o significado, o impacto, o diagnóstico com comandos, a mitigação e o critério de escalonamento.</w:t>
       </w:r>
-      <w:r>
-        <w:rPr>
-          <w:rFonts w:ascii="Times New Roman" w:hAnsi="Times New Roman"/>
-          <w:b/>
-          <w:i w:val="0"/>
-          <w:sz w:val="24"/>
-        </w:rPr>
-        <w:t>existe</w:t>
-      </w:r>
+    </w:p>
+    <w:p>
+      <w:pPr>
+        <w:spacing w:before="0" w:after="120"/>
+        <w:ind w:firstLine="709"/>
+        <w:jc w:val="both"/>
+      </w:pPr>
       <w:r>
         <w:rPr>
           <w:rFonts w:ascii="Times New Roman" w:hAnsi="Times New Roman"/>
@@ -5003,23 +6543,7 @@
           <w:i w:val="0"/>
           <w:sz w:val="24"/>
         </w:rPr>
-        <w:t>. A Aula 05 é categórica que alerta sem ação clara associada não é útil, e a pergunta-teste é o que se espera que alguém faça com aquela informação. Os seis runbooks estão em docs/runbooks e respondem, cada um, o que o alerta significa, o impacto, o diagnóstico com comandos, a mitigação e quando escalar.</w:t>
-      </w:r>
-    </w:p>
-    <w:p>
-      <w:pPr>
-        <w:spacing w:before="0" w:after="120"/>
-        <w:ind w:firstLine="709"/>
-        <w:jc w:val="both"/>
-      </w:pPr>
-      <w:r>
-        <w:rPr>
-          <w:rFonts w:ascii="Times New Roman" w:hAnsi="Times New Roman"/>
-          <w:b w:val="0"/>
-          <w:i w:val="0"/>
-          <w:sz w:val="24"/>
-        </w:rPr>
-        <w:t>Nenhuma janela de avaliação é menor que cinco minutos, para evitar disparo por flutuação momentânea — outra recomendação direta da disciplina.</w:t>
+        <w:t>Nenhuma janela de avaliação é inferior a cinco minutos, para evitar disparos causados por variações momentâneas.</w:t>
       </w:r>
     </w:p>
     <w:p>
@@ -5058,7 +6582,7 @@
           <w:i w:val="0"/>
           <w:sz w:val="24"/>
         </w:rPr>
-        <w:t>Toda a documentação vive versionada em docs/tech-challenge-3, junto do código, e não em ferramenta externa.</w:t>
+        <w:t>A documentação está versionada em docs/tech-challenge-3, junto ao código da aplicação.</w:t>
       </w:r>
     </w:p>
     <w:tbl>
@@ -5136,7 +6660,7 @@
                 <w:i w:val="0"/>
                 <w:sz w:val="20"/>
               </w:rPr>
-              <w:t>Onde</w:t>
+              <w:t>Local</w:t>
             </w:r>
           </w:p>
         </w:tc>
@@ -5240,7 +6764,7 @@
                 <w:i w:val="0"/>
                 <w:sz w:val="20"/>
               </w:rPr>
-              <w:t>11</w:t>
+              <w:t>14</w:t>
             </w:r>
           </w:p>
         </w:tc>
@@ -5534,12 +7058,12 @@
           <w:color w:val="1F3A5F"/>
           <w:sz w:val="24"/>
         </w:rPr>
-        <w:t>8.1 RFC e ADR — a distinção adotada</w:t>
+        <w:t>8.1 RFC e ADR</w:t>
       </w:r>
     </w:p>
     <w:p>
       <w:pPr>
-        <w:spacing w:after="120"/>
+        <w:spacing w:before="0" w:after="120"/>
         <w:ind w:firstLine="709"/>
         <w:jc w:val="both"/>
       </w:pPr>
@@ -5550,17 +7074,15 @@
           <w:i w:val="0"/>
           <w:sz w:val="24"/>
         </w:rPr>
-        <w:t xml:space="preserve">Uma observação honesta sobre o material: </w:t>
+        <w:t>O material da fase aborda ADR, DAS, HLD, LLD, C4 e requisitos funcionais e não funcionais, mas não trata de RFC, que é exigida pelo enunciado.</w:t>
       </w:r>
-      <w:r>
-        <w:rPr>
-          <w:rFonts w:ascii="Times New Roman" w:hAnsi="Times New Roman"/>
-          <w:b/>
-          <w:i w:val="0"/>
-          <w:sz w:val="24"/>
-        </w:rPr>
-        <w:t>nenhuma aula da fase cobre RFC</w:t>
-      </w:r>
+    </w:p>
+    <w:p>
+      <w:pPr>
+        <w:spacing w:before="0" w:after="120"/>
+        <w:ind w:firstLine="709"/>
+        <w:jc w:val="both"/>
+      </w:pPr>
       <w:r>
         <w:rPr>
           <w:rFonts w:ascii="Times New Roman" w:hAnsi="Times New Roman"/>
@@ -5568,23 +7090,7 @@
           <w:i w:val="0"/>
           <w:sz w:val="24"/>
         </w:rPr>
-        <w:t>. A disciplina de Documentação de Arquitetura de Soluções cobre ADR, DAS, HLD, LLD, C4 e requisitos funcionais e não funcionais. O enunciado, porém, exige RFCs.</w:t>
-      </w:r>
-    </w:p>
-    <w:p>
-      <w:pPr>
-        <w:spacing w:before="0" w:after="120"/>
-        <w:ind w:firstLine="709"/>
-        <w:jc w:val="both"/>
-      </w:pPr>
-      <w:r>
-        <w:rPr>
-          <w:rFonts w:ascii="Times New Roman" w:hAnsi="Times New Roman"/>
-          <w:b w:val="0"/>
-          <w:i w:val="0"/>
-          <w:sz w:val="24"/>
-        </w:rPr>
-        <w:t>Tratamos como extensão consciente, adotando a convenção usual e documentando-a: a RFC vem antes da decisão e coleta comentários; a ADR vem depois e é imutável. A RFC preserva a discussão, incluindo os comentários dos revisores e sua resolução; a ADR preserva a conclusão. As três RFCs cobrem exatamente o que o enunciado nomeia — escolha da nuvem, do banco e da estratégia de autenticação.</w:t>
+        <w:t>Adotou-se a seguinte convenção: a RFC é elaborada antes da decisão e registra a proposta, os comentários dos revisores e sua resolução; a ADR é elaborada após a decisão, registra a conclusão e não é alterada depois de aceita. As três RFCs tratam dos temas indicados no enunciado: escolha da nuvem, do banco de dados e da estratégia de autenticação.</w:t>
       </w:r>
     </w:p>
     <w:p>
@@ -5602,7 +7108,7 @@
           <w:color w:val="1F3A5F"/>
           <w:sz w:val="24"/>
         </w:rPr>
-        <w:t>8.2 O ciclo de vida das ADRs</w:t>
+        <w:t>8.2 Ciclo de vida das ADRs</w:t>
       </w:r>
     </w:p>
     <w:p>
@@ -5618,7 +7124,7 @@
           <w:i w:val="0"/>
           <w:sz w:val="24"/>
         </w:rPr>
-        <w:t>Seguimos o processo da Aula 05: a ADR nasce em Proposta, passa por revisão, e ao ser aceita torna-se imutável. Mudança de rumo exige nova ADR, que ao ser aceita marca a anterior como Superada. A imutabilidade é o ponto que mais se erra na prática — ADR aceita não se edita, se supera, porque o histórico é o valor.</w:t>
+        <w:t>O ciclo de vida das ADRs segue o processo apresentado na Aula 05: a ADR é criada com status Proposta, passa por revisão e, quando aceita, não é mais editada. Uma mudança de decisão é registrada em nova ADR, que marca a anterior como Superada.</w:t>
       </w:r>
     </w:p>
     <w:p>
@@ -5634,7 +7140,7 @@
           <w:i w:val="0"/>
           <w:sz w:val="24"/>
         </w:rPr>
-        <w:t>Uma das onze é retroativa: a ADR-011 documenta o uso de HPA, implementado na Fase 2 sem registro. O enunciado cita HPA como exemplo de decisão que merece ADR, e escrevê-la revelou um desencontro real — o HPA pedia até quatro réplicas enquanto o node group estava limitado a três nós. Corrigido nesta fase.</w:t>
+        <w:t>A ADR-011 é retroativa e documenta o uso de HPA, implementado na Fase 2 sem registro. O enunciado cita o HPA como exemplo de decisão a ser documentada, e a elaboração da ADR identificou uma inconsistência: o HPA permitia até quatro réplicas, enquanto o node group estava limitado a três nós. A inconsistência foi corrigida nesta fase.</w:t>
       </w:r>
     </w:p>
     <w:p>
@@ -5735,7 +7241,7 @@
                 <w:i w:val="0"/>
                 <w:sz w:val="20"/>
               </w:rPr>
-              <w:t>Onde roda</w:t>
+              <w:t>Execução</w:t>
             </w:r>
           </w:p>
         </w:tc>
@@ -5859,7 +7365,7 @@
                 <w:i w:val="0"/>
                 <w:sz w:val="20"/>
               </w:rPr>
-              <w:t>Pipeline, artefato publicado</w:t>
+              <w:t>Pipeline, relatório publicado</w:t>
             </w:r>
           </w:p>
         </w:tc>
@@ -5921,7 +7427,7 @@
                 <w:i w:val="0"/>
                 <w:sz w:val="20"/>
               </w:rPr>
-              <w:t>Pipeline, a cada push e PR</w:t>
+              <w:t>Pipeline, a cada merge na main</w:t>
             </w:r>
           </w:p>
         </w:tc>
@@ -5983,7 +7489,7 @@
                 <w:i w:val="0"/>
                 <w:sz w:val="20"/>
               </w:rPr>
-              <w:t>Pipeline</w:t>
+              <w:t>Sob demanda, mvn dependency-check:check</w:t>
             </w:r>
           </w:p>
         </w:tc>
@@ -6005,7 +7511,7 @@
                 <w:i w:val="0"/>
                 <w:sz w:val="20"/>
               </w:rPr>
-              <w:t>Formatação de infraestrutura</w:t>
+              <w:t>Políticas IAM</w:t>
             </w:r>
           </w:p>
         </w:tc>
@@ -6025,7 +7531,7 @@
                 <w:i w:val="0"/>
                 <w:sz w:val="20"/>
               </w:rPr>
-              <w:t>terraform fmt -check</w:t>
+              <w:t>IAM Access Analyzer e simulação de policy</w:t>
             </w:r>
           </w:p>
         </w:tc>
@@ -6045,7 +7551,193 @@
                 <w:i w:val="0"/>
                 <w:sz w:val="20"/>
               </w:rPr>
-              <w:t>Pipeline dos repos de infra</w:t>
+              <w:t>Antes de aplicar cada alteração</w:t>
+            </w:r>
+          </w:p>
+        </w:tc>
+      </w:tr>
+      <w:tr>
+        <w:tc>
+          <w:tcPr>
+            <w:tcW w:type="dxa" w:w="2835"/>
+          </w:tcPr>
+          <w:p>
+            <w:pPr>
+              <w:spacing w:after="40"/>
+            </w:pPr>
+            <w:r/>
+            <w:r>
+              <w:rPr>
+                <w:rFonts w:ascii="Times New Roman" w:hAnsi="Times New Roman"/>
+                <w:b w:val="0"/>
+                <w:i w:val="0"/>
+                <w:sz w:val="20"/>
+              </w:rPr>
+              <w:t>Formatação e lint de infraestrutura</w:t>
+            </w:r>
+          </w:p>
+        </w:tc>
+        <w:tc>
+          <w:tcPr>
+            <w:tcW w:type="dxa" w:w="3402"/>
+          </w:tcPr>
+          <w:p>
+            <w:pPr>
+              <w:spacing w:after="40"/>
+            </w:pPr>
+            <w:r/>
+            <w:r>
+              <w:rPr>
+                <w:rFonts w:ascii="Times New Roman" w:hAnsi="Times New Roman"/>
+                <w:b w:val="0"/>
+                <w:i w:val="0"/>
+                <w:sz w:val="20"/>
+              </w:rPr>
+              <w:t>terraform fmt -check e tflint</w:t>
+            </w:r>
+          </w:p>
+        </w:tc>
+        <w:tc>
+          <w:tcPr>
+            <w:tcW w:type="dxa" w:w="2835"/>
+          </w:tcPr>
+          <w:p>
+            <w:pPr>
+              <w:spacing w:after="40"/>
+            </w:pPr>
+            <w:r/>
+            <w:r>
+              <w:rPr>
+                <w:rFonts w:ascii="Times New Roman" w:hAnsi="Times New Roman"/>
+                <w:b w:val="0"/>
+                <w:i w:val="0"/>
+                <w:sz w:val="20"/>
+              </w:rPr>
+              <w:t>Pipeline dos repositórios de infraestrutura</w:t>
+            </w:r>
+          </w:p>
+        </w:tc>
+      </w:tr>
+      <w:tr>
+        <w:tc>
+          <w:tcPr>
+            <w:tcW w:type="dxa" w:w="2835"/>
+          </w:tcPr>
+          <w:p>
+            <w:pPr>
+              <w:spacing w:after="40"/>
+            </w:pPr>
+            <w:r/>
+            <w:r>
+              <w:rPr>
+                <w:rFonts w:ascii="Times New Roman" w:hAnsi="Times New Roman"/>
+                <w:b w:val="0"/>
+                <w:i w:val="0"/>
+                <w:sz w:val="20"/>
+              </w:rPr>
+              <w:t>Segurança de infraestrutura</w:t>
+            </w:r>
+          </w:p>
+        </w:tc>
+        <w:tc>
+          <w:tcPr>
+            <w:tcW w:type="dxa" w:w="3402"/>
+          </w:tcPr>
+          <w:p>
+            <w:pPr>
+              <w:spacing w:after="40"/>
+            </w:pPr>
+            <w:r/>
+            <w:r>
+              <w:rPr>
+                <w:rFonts w:ascii="Times New Roman" w:hAnsi="Times New Roman"/>
+                <w:b w:val="0"/>
+                <w:i w:val="0"/>
+                <w:sz w:val="20"/>
+              </w:rPr>
+              <w:t>checkov, com supressões justificadas no README</w:t>
+            </w:r>
+          </w:p>
+        </w:tc>
+        <w:tc>
+          <w:tcPr>
+            <w:tcW w:type="dxa" w:w="2835"/>
+          </w:tcPr>
+          <w:p>
+            <w:pPr>
+              <w:spacing w:after="40"/>
+            </w:pPr>
+            <w:r/>
+            <w:r>
+              <w:rPr>
+                <w:rFonts w:ascii="Times New Roman" w:hAnsi="Times New Roman"/>
+                <w:b w:val="0"/>
+                <w:i w:val="0"/>
+                <w:sz w:val="20"/>
+              </w:rPr>
+              <w:t>Pipeline dos repositórios de infraestrutura</w:t>
+            </w:r>
+          </w:p>
+        </w:tc>
+      </w:tr>
+      <w:tr>
+        <w:tc>
+          <w:tcPr>
+            <w:tcW w:type="dxa" w:w="2835"/>
+          </w:tcPr>
+          <w:p>
+            <w:pPr>
+              <w:spacing w:after="40"/>
+            </w:pPr>
+            <w:r/>
+            <w:r>
+              <w:rPr>
+                <w:rFonts w:ascii="Times New Roman" w:hAnsi="Times New Roman"/>
+                <w:b w:val="0"/>
+                <w:i w:val="0"/>
+                <w:sz w:val="20"/>
+              </w:rPr>
+              <w:t>Contrato da API</w:t>
+            </w:r>
+          </w:p>
+        </w:tc>
+        <w:tc>
+          <w:tcPr>
+            <w:tcW w:type="dxa" w:w="3402"/>
+          </w:tcPr>
+          <w:p>
+            <w:pPr>
+              <w:spacing w:after="40"/>
+            </w:pPr>
+            <w:r/>
+            <w:r>
+              <w:rPr>
+                <w:rFonts w:ascii="Times New Roman" w:hAnsi="Times New Roman"/>
+                <w:b w:val="0"/>
+                <w:i w:val="0"/>
+                <w:sz w:val="20"/>
+              </w:rPr>
+              <w:t>docs/openapi.json comparado com a especificação gerada</w:t>
+            </w:r>
+          </w:p>
+        </w:tc>
+        <w:tc>
+          <w:tcPr>
+            <w:tcW w:type="dxa" w:w="2835"/>
+          </w:tcPr>
+          <w:p>
+            <w:pPr>
+              <w:spacing w:after="40"/>
+            </w:pPr>
+            <w:r/>
+            <w:r>
+              <w:rPr>
+                <w:rFonts w:ascii="Times New Roman" w:hAnsi="Times New Roman"/>
+                <w:b w:val="0"/>
+                <w:i w:val="0"/>
+                <w:sz w:val="20"/>
+              </w:rPr>
+              <w:t>Pipeline da aplicação</w:t>
             </w:r>
           </w:p>
         </w:tc>
@@ -6118,6 +7810,443 @@
         <w:spacing w:after="80"/>
       </w:pPr>
     </w:p>
+    <w:tbl>
+      <w:tblPr>
+        <w:tblStyle w:val="TableGrid"/>
+        <w:tblW w:type="auto" w:w="0"/>
+        <w:jc w:val="center"/>
+        <w:tblLook w:firstColumn="1" w:firstRow="1" w:lastColumn="0" w:lastRow="0" w:noHBand="0" w:noVBand="1" w:val="04A0"/>
+      </w:tblPr>
+      <w:tblGrid>
+        <w:gridCol w:w="2268"/>
+        <w:gridCol w:w="2268"/>
+        <w:gridCol w:w="2268"/>
+        <w:gridCol w:w="2268"/>
+      </w:tblGrid>
+      <w:tr>
+        <w:tc>
+          <w:tcPr>
+            <w:tcW w:type="dxa" w:w="2268"/>
+          </w:tcPr>
+          <w:p>
+            <w:pPr>
+              <w:spacing w:after="40"/>
+              <w:jc w:val="center"/>
+              <w:shd w:val="clear" w:fill="E8EDF3"/>
+            </w:pPr>
+            <w:r/>
+            <w:r>
+              <w:rPr>
+                <w:rFonts w:ascii="Times New Roman" w:hAnsi="Times New Roman"/>
+                <w:b/>
+                <w:i w:val="0"/>
+                <w:sz w:val="20"/>
+              </w:rPr>
+              <w:t>Camada da aplicação</w:t>
+            </w:r>
+          </w:p>
+        </w:tc>
+        <w:tc>
+          <w:tcPr>
+            <w:tcW w:type="dxa" w:w="1417"/>
+          </w:tcPr>
+          <w:p>
+            <w:pPr>
+              <w:spacing w:after="40"/>
+              <w:jc w:val="center"/>
+              <w:shd w:val="clear" w:fill="E8EDF3"/>
+            </w:pPr>
+            <w:r/>
+            <w:r>
+              <w:rPr>
+                <w:rFonts w:ascii="Times New Roman" w:hAnsi="Times New Roman"/>
+                <w:b/>
+                <w:i w:val="0"/>
+                <w:sz w:val="20"/>
+              </w:rPr>
+              <w:t>Classes</w:t>
+            </w:r>
+          </w:p>
+        </w:tc>
+        <w:tc>
+          <w:tcPr>
+            <w:tcW w:type="dxa" w:w="1417"/>
+          </w:tcPr>
+          <w:p>
+            <w:pPr>
+              <w:spacing w:after="40"/>
+              <w:jc w:val="center"/>
+              <w:shd w:val="clear" w:fill="E8EDF3"/>
+            </w:pPr>
+            <w:r/>
+            <w:r>
+              <w:rPr>
+                <w:rFonts w:ascii="Times New Roman" w:hAnsi="Times New Roman"/>
+                <w:b/>
+                <w:i w:val="0"/>
+                <w:sz w:val="20"/>
+              </w:rPr>
+              <w:t>Métodos</w:t>
+            </w:r>
+          </w:p>
+        </w:tc>
+        <w:tc>
+          <w:tcPr>
+            <w:tcW w:type="dxa" w:w="3969"/>
+          </w:tcPr>
+          <w:p>
+            <w:pPr>
+              <w:spacing w:after="40"/>
+              <w:jc w:val="center"/>
+              <w:shd w:val="clear" w:fill="E8EDF3"/>
+            </w:pPr>
+            <w:r/>
+            <w:r>
+              <w:rPr>
+                <w:rFonts w:ascii="Times New Roman" w:hAnsi="Times New Roman"/>
+                <w:b/>
+                <w:i w:val="0"/>
+                <w:sz w:val="20"/>
+              </w:rPr>
+              <w:t>Tipo</w:t>
+            </w:r>
+          </w:p>
+        </w:tc>
+      </w:tr>
+      <w:tr>
+        <w:tc>
+          <w:tcPr>
+            <w:tcW w:type="dxa" w:w="2268"/>
+          </w:tcPr>
+          <w:p>
+            <w:pPr>
+              <w:spacing w:after="40"/>
+            </w:pPr>
+            <w:r/>
+            <w:r>
+              <w:rPr>
+                <w:rFonts w:ascii="Times New Roman" w:hAnsi="Times New Roman"/>
+                <w:b w:val="0"/>
+                <w:i w:val="0"/>
+                <w:sz w:val="20"/>
+              </w:rPr>
+              <w:t>Domínio</w:t>
+            </w:r>
+          </w:p>
+        </w:tc>
+        <w:tc>
+          <w:tcPr>
+            <w:tcW w:type="dxa" w:w="1417"/>
+          </w:tcPr>
+          <w:p>
+            <w:pPr>
+              <w:spacing w:after="40"/>
+            </w:pPr>
+            <w:r/>
+            <w:r>
+              <w:rPr>
+                <w:rFonts w:ascii="Times New Roman" w:hAnsi="Times New Roman"/>
+                <w:b w:val="0"/>
+                <w:i w:val="0"/>
+                <w:sz w:val="20"/>
+              </w:rPr>
+              <w:t>5</w:t>
+            </w:r>
+          </w:p>
+        </w:tc>
+        <w:tc>
+          <w:tcPr>
+            <w:tcW w:type="dxa" w:w="1417"/>
+          </w:tcPr>
+          <w:p>
+            <w:pPr>
+              <w:spacing w:after="40"/>
+            </w:pPr>
+            <w:r/>
+            <w:r>
+              <w:rPr>
+                <w:rFonts w:ascii="Times New Roman" w:hAnsi="Times New Roman"/>
+                <w:b w:val="0"/>
+                <w:i w:val="0"/>
+                <w:sz w:val="20"/>
+              </w:rPr>
+              <w:t>34</w:t>
+            </w:r>
+          </w:p>
+        </w:tc>
+        <w:tc>
+          <w:tcPr>
+            <w:tcW w:type="dxa" w:w="3969"/>
+          </w:tcPr>
+          <w:p>
+            <w:pPr>
+              <w:spacing w:after="40"/>
+            </w:pPr>
+            <w:r/>
+            <w:r>
+              <w:rPr>
+                <w:rFonts w:ascii="Times New Roman" w:hAnsi="Times New Roman"/>
+                <w:b w:val="0"/>
+                <w:i w:val="0"/>
+                <w:sz w:val="20"/>
+              </w:rPr>
+              <w:t>unitário, Java puro</w:t>
+            </w:r>
+          </w:p>
+        </w:tc>
+      </w:tr>
+      <w:tr>
+        <w:tc>
+          <w:tcPr>
+            <w:tcW w:type="dxa" w:w="2268"/>
+          </w:tcPr>
+          <w:p>
+            <w:pPr>
+              <w:spacing w:after="40"/>
+            </w:pPr>
+            <w:r/>
+            <w:r>
+              <w:rPr>
+                <w:rFonts w:ascii="Times New Roman" w:hAnsi="Times New Roman"/>
+                <w:b w:val="0"/>
+                <w:i w:val="0"/>
+                <w:sz w:val="20"/>
+              </w:rPr>
+              <w:t>Aplicação</w:t>
+            </w:r>
+          </w:p>
+        </w:tc>
+        <w:tc>
+          <w:tcPr>
+            <w:tcW w:type="dxa" w:w="1417"/>
+          </w:tcPr>
+          <w:p>
+            <w:pPr>
+              <w:spacing w:after="40"/>
+            </w:pPr>
+            <w:r/>
+            <w:r>
+              <w:rPr>
+                <w:rFonts w:ascii="Times New Roman" w:hAnsi="Times New Roman"/>
+                <w:b w:val="0"/>
+                <w:i w:val="0"/>
+                <w:sz w:val="20"/>
+              </w:rPr>
+              <w:t>8</w:t>
+            </w:r>
+          </w:p>
+        </w:tc>
+        <w:tc>
+          <w:tcPr>
+            <w:tcW w:type="dxa" w:w="1417"/>
+          </w:tcPr>
+          <w:p>
+            <w:pPr>
+              <w:spacing w:after="40"/>
+            </w:pPr>
+            <w:r/>
+            <w:r>
+              <w:rPr>
+                <w:rFonts w:ascii="Times New Roman" w:hAnsi="Times New Roman"/>
+                <w:b w:val="0"/>
+                <w:i w:val="0"/>
+                <w:sz w:val="20"/>
+              </w:rPr>
+              <w:t>71</w:t>
+            </w:r>
+          </w:p>
+        </w:tc>
+        <w:tc>
+          <w:tcPr>
+            <w:tcW w:type="dxa" w:w="3969"/>
+          </w:tcPr>
+          <w:p>
+            <w:pPr>
+              <w:spacing w:after="40"/>
+            </w:pPr>
+            <w:r/>
+            <w:r>
+              <w:rPr>
+                <w:rFonts w:ascii="Times New Roman" w:hAnsi="Times New Roman"/>
+                <w:b w:val="0"/>
+                <w:i w:val="0"/>
+                <w:sz w:val="20"/>
+              </w:rPr>
+              <w:t>unitário, com Mockito</w:t>
+            </w:r>
+          </w:p>
+        </w:tc>
+      </w:tr>
+      <w:tr>
+        <w:tc>
+          <w:tcPr>
+            <w:tcW w:type="dxa" w:w="2268"/>
+          </w:tcPr>
+          <w:p>
+            <w:pPr>
+              <w:spacing w:after="40"/>
+            </w:pPr>
+            <w:r/>
+            <w:r>
+              <w:rPr>
+                <w:rFonts w:ascii="Times New Roman" w:hAnsi="Times New Roman"/>
+                <w:b w:val="0"/>
+                <w:i w:val="0"/>
+                <w:sz w:val="20"/>
+              </w:rPr>
+              <w:t>Infraestrutura</w:t>
+            </w:r>
+          </w:p>
+        </w:tc>
+        <w:tc>
+          <w:tcPr>
+            <w:tcW w:type="dxa" w:w="1417"/>
+          </w:tcPr>
+          <w:p>
+            <w:pPr>
+              <w:spacing w:after="40"/>
+            </w:pPr>
+            <w:r/>
+            <w:r>
+              <w:rPr>
+                <w:rFonts w:ascii="Times New Roman" w:hAnsi="Times New Roman"/>
+                <w:b w:val="0"/>
+                <w:i w:val="0"/>
+                <w:sz w:val="20"/>
+              </w:rPr>
+              <w:t>3</w:t>
+            </w:r>
+          </w:p>
+        </w:tc>
+        <w:tc>
+          <w:tcPr>
+            <w:tcW w:type="dxa" w:w="1417"/>
+          </w:tcPr>
+          <w:p>
+            <w:pPr>
+              <w:spacing w:after="40"/>
+            </w:pPr>
+            <w:r/>
+            <w:r>
+              <w:rPr>
+                <w:rFonts w:ascii="Times New Roman" w:hAnsi="Times New Roman"/>
+                <w:b w:val="0"/>
+                <w:i w:val="0"/>
+                <w:sz w:val="20"/>
+              </w:rPr>
+              <w:t>14</w:t>
+            </w:r>
+          </w:p>
+        </w:tc>
+        <w:tc>
+          <w:tcPr>
+            <w:tcW w:type="dxa" w:w="3969"/>
+          </w:tcPr>
+          <w:p>
+            <w:pPr>
+              <w:spacing w:after="40"/>
+            </w:pPr>
+            <w:r/>
+            <w:r>
+              <w:rPr>
+                <w:rFonts w:ascii="Times New Roman" w:hAnsi="Times New Roman"/>
+                <w:b w:val="0"/>
+                <w:i w:val="0"/>
+                <w:sz w:val="20"/>
+              </w:rPr>
+              <w:t>unitário (JWT, métricas, notificação)</w:t>
+            </w:r>
+          </w:p>
+        </w:tc>
+      </w:tr>
+      <w:tr>
+        <w:tc>
+          <w:tcPr>
+            <w:tcW w:type="dxa" w:w="2268"/>
+          </w:tcPr>
+          <w:p>
+            <w:pPr>
+              <w:spacing w:after="40"/>
+            </w:pPr>
+            <w:r/>
+            <w:r>
+              <w:rPr>
+                <w:rFonts w:ascii="Times New Roman" w:hAnsi="Times New Roman"/>
+                <w:b w:val="0"/>
+                <w:i w:val="0"/>
+                <w:sz w:val="20"/>
+              </w:rPr>
+              <w:t>Integração</w:t>
+            </w:r>
+          </w:p>
+        </w:tc>
+        <w:tc>
+          <w:tcPr>
+            <w:tcW w:type="dxa" w:w="1417"/>
+          </w:tcPr>
+          <w:p>
+            <w:pPr>
+              <w:spacing w:after="40"/>
+            </w:pPr>
+            <w:r/>
+            <w:r>
+              <w:rPr>
+                <w:rFonts w:ascii="Times New Roman" w:hAnsi="Times New Roman"/>
+                <w:b w:val="0"/>
+                <w:i w:val="0"/>
+                <w:sz w:val="20"/>
+              </w:rPr>
+              <w:t>1</w:t>
+            </w:r>
+          </w:p>
+        </w:tc>
+        <w:tc>
+          <w:tcPr>
+            <w:tcW w:type="dxa" w:w="1417"/>
+          </w:tcPr>
+          <w:p>
+            <w:pPr>
+              <w:spacing w:after="40"/>
+            </w:pPr>
+            <w:r/>
+            <w:r>
+              <w:rPr>
+                <w:rFonts w:ascii="Times New Roman" w:hAnsi="Times New Roman"/>
+                <w:b w:val="0"/>
+                <w:i w:val="0"/>
+                <w:sz w:val="20"/>
+              </w:rPr>
+              <w:t>12</w:t>
+            </w:r>
+          </w:p>
+        </w:tc>
+        <w:tc>
+          <w:tcPr>
+            <w:tcW w:type="dxa" w:w="3969"/>
+          </w:tcPr>
+          <w:p>
+            <w:pPr>
+              <w:spacing w:after="40"/>
+            </w:pPr>
+            <w:r/>
+            <w:r>
+              <w:rPr>
+                <w:rFonts w:ascii="Times New Roman" w:hAnsi="Times New Roman"/>
+                <w:b w:val="0"/>
+                <w:i w:val="0"/>
+                <w:sz w:val="20"/>
+              </w:rPr>
+              <w:t>Spring completo com PostgreSQL via Testcontainers</w:t>
+            </w:r>
+          </w:p>
+        </w:tc>
+      </w:tr>
+    </w:tbl>
+    <w:p>
+      <w:pPr>
+        <w:spacing w:after="80"/>
+      </w:pPr>
+    </w:p>
     <w:p>
       <w:pPr>
         <w:spacing w:before="0" w:after="120"/>
@@ -6131,7 +8260,23 @@
           <w:i w:val="0"/>
           <w:sz w:val="24"/>
         </w:rPr>
-        <w:t>A aplicação encerra a fase com cento e vinte e um testes passando, incluindo o teste de integração completo com Testcontainers, que exercita as migrations V6 e V7 contra um PostgreSQL real. A Lambda tem trinta e cinco testes próprios.</w:t>
+        <w:t>Os métodos resultam em cento e quarenta e quatro casos executados, com 91% de cobertura de linhas. O build falha abaixo de 85% de linhas e 70% de branches. O teste de integração executa todas as migrations em um PostgreSQL real e compara a especificação OpenAPI gerada pela aplicação com o arquivo versionado docs/openapi.json. A Lambda possui quarenta e cinco casos de teste, incluindo consultas contra PostgreSQL via Testcontainers. A descrição de cada classe está em docs/testes.md, no repositório da aplicação, e no README da Lambda.</w:t>
+      </w:r>
+    </w:p>
+    <w:p>
+      <w:pPr>
+        <w:spacing w:before="0" w:after="120"/>
+        <w:ind w:firstLine="709"/>
+        <w:jc w:val="both"/>
+      </w:pPr>
+      <w:r>
+        <w:rPr>
+          <w:rFonts w:ascii="Times New Roman" w:hAnsi="Times New Roman"/>
+          <w:b w:val="0"/>
+          <w:i w:val="0"/>
+          <w:sz w:val="24"/>
+        </w:rPr>
+        <w:t>Em todos os repositórios, o pipeline executa os testes ou a validação a cada push, em qualquer branch: mvn verify na aplicação, mvnw verify na Lambda e terraform fmt, validate, tflint e checkov nos repositórios de infraestrutura. Esses jobs são status checks obrigatórios para o merge em develop e main.</w:t>
       </w:r>
     </w:p>
     <w:p>
@@ -6149,7 +8294,7 @@
           <w:color w:val="1F3A5F"/>
           <w:sz w:val="24"/>
         </w:rPr>
-        <w:t>9.1 O teste que impede a duplicação de virar divergência</w:t>
+        <w:t>9.1 Validação de CPF em dois repositórios</w:t>
       </w:r>
     </w:p>
     <w:p>
@@ -6165,12 +8310,12 @@
           <w:i w:val="0"/>
           <w:sz w:val="24"/>
         </w:rPr>
-        <w:t>A validação de CPF existe em dois lugares: no value object do domínio da aplicação e na Lambda. A separação em repositórios cortou o acesso ao código compartilhado, e publicar um artefato comum exigiria montar um pipeline de publicação.</w:t>
+        <w:t>A validação de CPF está implementada no value object do domínio da aplicação e na Lambda. A separação em repositórios impede o compartilhamento direto do código, e a publicação de um artefato comum exigiria um pipeline de publicação adicional.</w:t>
       </w:r>
     </w:p>
     <w:p>
       <w:pPr>
-        <w:spacing w:after="120"/>
+        <w:spacing w:before="0" w:after="120"/>
         <w:ind w:firstLine="709"/>
         <w:jc w:val="both"/>
       </w:pPr>
@@ -6181,25 +8326,7 @@
           <w:i w:val="0"/>
           <w:sz w:val="24"/>
         </w:rPr>
-        <w:t xml:space="preserve">A contenção foi explícita: o teste da Lambda </w:t>
-      </w:r>
-      <w:r>
-        <w:rPr>
-          <w:rFonts w:ascii="Times New Roman" w:hAnsi="Times New Roman"/>
-          <w:b/>
-          <w:i w:val="0"/>
-          <w:sz w:val="24"/>
-        </w:rPr>
-        <w:t>espelha exatamente</w:t>
-      </w:r>
-      <w:r>
-        <w:rPr>
-          <w:rFonts w:ascii="Times New Roman" w:hAnsi="Times New Roman"/>
-          <w:b w:val="0"/>
-          <w:i w:val="0"/>
-          <w:sz w:val="24"/>
-        </w:rPr>
-        <w:t xml:space="preserve"> os casos-limite do teste da aplicação — CPF com máscara e sem, dígito verificador inválido, todos os dígitos iguais, tamanho errado. Enquanto a regra estiver duplicada, é esse espelho que impede os dois validadores de divergirem em silêncio. O débito está declarado.</w:t>
+        <w:t>Para evitar divergência entre as duas implementações, o teste da Lambda reproduz os mesmos casos-limite do teste da aplicação: CPF com e sem máscara, dígito verificador inválido, dígitos repetidos e tamanho incorreto. A duplicação está registrada como débito técnico.</w:t>
       </w:r>
     </w:p>
     <w:p>
@@ -6240,7 +8367,7 @@
           <w:color w:val="1F3A5F"/>
           <w:sz w:val="24"/>
         </w:rPr>
-        <w:t>10.1 Postura adotada</w:t>
+        <w:t>10.1 Medidas adotadas</w:t>
       </w:r>
     </w:p>
     <w:p>
@@ -6257,7 +8384,7 @@
           <w:i w:val="0"/>
           <w:sz w:val="24"/>
         </w:rPr>
-        <w:t xml:space="preserve">Rede fechada — </w:t>
+        <w:t xml:space="preserve">Rede privada: </w:t>
       </w:r>
       <w:r>
         <w:rPr>
@@ -6266,7 +8393,7 @@
           <w:i w:val="0"/>
           <w:sz w:val="24"/>
         </w:rPr>
-        <w:t>nenhum nó ou banco tem IP público; a única entrada é o API Gateway e a única saída é a NAT instance.</w:t>
+        <w:t>nós e banco de dados não possuem IP público; a entrada ocorre pelo API Gateway e a saída, pela NAT instance.</w:t>
       </w:r>
     </w:p>
     <w:p>
@@ -6283,7 +8410,7 @@
           <w:i w:val="0"/>
           <w:sz w:val="24"/>
         </w:rPr>
-        <w:t xml:space="preserve">Rejeição na borda — </w:t>
+        <w:t xml:space="preserve">Validação na borda: </w:t>
       </w:r>
       <w:r>
         <w:rPr>
@@ -6292,7 +8419,7 @@
           <w:i w:val="0"/>
           <w:sz w:val="24"/>
         </w:rPr>
-        <w:t>requisição sem token válido é rejeitada no gateway, antes de consumir recurso do cluster.</w:t>
+        <w:t>requisições sem token válido são rejeitadas no gateway, antes de alcançar o cluster.</w:t>
       </w:r>
     </w:p>
     <w:p>
@@ -6309,7 +8436,7 @@
           <w:i w:val="0"/>
           <w:sz w:val="24"/>
         </w:rPr>
-        <w:t xml:space="preserve">Defesa em profundidade — </w:t>
+        <w:t xml:space="preserve">Defesa em profundidade: </w:t>
       </w:r>
       <w:r>
         <w:rPr>
@@ -6318,7 +8445,7 @@
           <w:i w:val="0"/>
           <w:sz w:val="24"/>
         </w:rPr>
-        <w:t>o gateway autentica, e a aplicação valida de novo. Quem decide se este cliente pode ver esta ordem continua sendo a aplicação.</w:t>
+        <w:t>além do gateway, a aplicação valida o token e mantém as regras de autorização sobre os recursos.</w:t>
       </w:r>
     </w:p>
     <w:p>
@@ -6335,7 +8462,7 @@
           <w:i w:val="0"/>
           <w:sz w:val="24"/>
         </w:rPr>
-        <w:t xml:space="preserve">Segredos centralizados — </w:t>
+        <w:t xml:space="preserve">Gestão de segredos: </w:t>
       </w:r>
       <w:r>
         <w:rPr>
@@ -6344,7 +8471,7 @@
           <w:i w:val="0"/>
           <w:sz w:val="24"/>
         </w:rPr>
-        <w:t>segredo do JWT e credenciais do banco em SSM Parameter Store como SecureString, nunca em arquivo versionado.</w:t>
+        <w:t>o segredo do JWT e a senha do banco são gerados pelo Terraform, com valores distintos por ambiente, e armazenados no SSM Parameter Store como SecureString, sem passar pelo GitHub.</w:t>
       </w:r>
     </w:p>
     <w:p>
@@ -6361,7 +8488,7 @@
           <w:i w:val="0"/>
           <w:sz w:val="24"/>
         </w:rPr>
-        <w:t xml:space="preserve">Sem credencial estática — </w:t>
+        <w:t xml:space="preserve">Pipelines com menor privilégio: </w:t>
       </w:r>
       <w:r>
         <w:rPr>
@@ -6370,7 +8497,7 @@
           <w:i w:val="0"/>
           <w:sz w:val="24"/>
         </w:rPr>
-        <w:t>OIDC nos quatro repositórios; nenhuma chave de acesso de longa duração em secret.</w:t>
+        <w:t>autenticação por OIDC, com uma role por repositório restrita aos recursos gerenciados por aquele pipeline (ADR-013). A trust policy aceita apenas as branches develop e main e seus respectivos environments.</w:t>
       </w:r>
     </w:p>
     <w:p>
@@ -6387,7 +8514,7 @@
           <w:i w:val="0"/>
           <w:sz w:val="24"/>
         </w:rPr>
-        <w:t xml:space="preserve">CPF nunca em log — </w:t>
+        <w:t xml:space="preserve">Limite de permissões: </w:t>
       </w:r>
       <w:r>
         <w:rPr>
@@ -6396,7 +8523,59 @@
           <w:i w:val="0"/>
           <w:sz w:val="24"/>
         </w:rPr>
-        <w:t>apenas os três últimos dígitos aparecem em log, e o subject do token é o UUID.</w:t>
+        <w:t>as roles criadas pelo pipeline da Lambda recebem um permissions boundary, que impede a ampliação das permissões da função pelo próprio pipeline.</w:t>
+      </w:r>
+    </w:p>
+    <w:p>
+      <w:pPr>
+        <w:pStyle w:val="ListBullet"/>
+        <w:spacing w:after="60"/>
+        <w:ind w:left="567"/>
+        <w:jc w:val="both"/>
+      </w:pPr>
+      <w:r>
+        <w:rPr>
+          <w:rFonts w:ascii="Times New Roman" w:hAnsi="Times New Roman"/>
+          <w:b/>
+          <w:i w:val="0"/>
+          <w:sz w:val="24"/>
+        </w:rPr>
+        <w:t xml:space="preserve">Papéis de acesso: </w:t>
+      </w:r>
+      <w:r>
+        <w:rPr>
+          <w:rFonts w:ascii="Times New Roman" w:hAnsi="Times New Roman"/>
+          <w:b w:val="0"/>
+          <w:i w:val="0"/>
+          <w:sz w:val="24"/>
+        </w:rPr>
+        <w:t>rotas de gestão restritas ao papel FUNCIONARIO; clientes acessam apenas os próprios dados (ADR-014).</w:t>
+      </w:r>
+    </w:p>
+    <w:p>
+      <w:pPr>
+        <w:pStyle w:val="ListBullet"/>
+        <w:spacing w:after="60"/>
+        <w:ind w:left="567"/>
+        <w:jc w:val="both"/>
+      </w:pPr>
+      <w:r>
+        <w:rPr>
+          <w:rFonts w:ascii="Times New Roman" w:hAnsi="Times New Roman"/>
+          <w:b/>
+          <w:i w:val="0"/>
+          <w:sz w:val="24"/>
+        </w:rPr>
+        <w:t xml:space="preserve">Proteção do CPF: </w:t>
+      </w:r>
+      <w:r>
+        <w:rPr>
+          <w:rFonts w:ascii="Times New Roman" w:hAnsi="Times New Roman"/>
+          <w:b w:val="0"/>
+          <w:i w:val="0"/>
+          <w:sz w:val="24"/>
+        </w:rPr>
+        <w:t>apenas os três últimos dígitos são registrados em log, e o subject do token é o UUID do usuário.</w:t>
       </w:r>
     </w:p>
     <w:p>
@@ -6414,24 +8593,15 @@
           <w:color w:val="1F3A5F"/>
           <w:sz w:val="24"/>
         </w:rPr>
-        <w:t>10.2 A limitação que precisa ser dita</w:t>
+        <w:t>10.2 Autenticação por CPF: limitação conhecida</w:t>
       </w:r>
     </w:p>
     <w:p>
       <w:pPr>
-        <w:spacing w:after="120"/>
+        <w:spacing w:before="0" w:after="120"/>
         <w:ind w:firstLine="709"/>
         <w:jc w:val="both"/>
       </w:pPr>
-      <w:r>
-        <w:rPr>
-          <w:rFonts w:ascii="Times New Roman" w:hAnsi="Times New Roman"/>
-          <w:b/>
-          <w:i w:val="0"/>
-          <w:sz w:val="24"/>
-        </w:rPr>
-        <w:t xml:space="preserve">Autenticar apenas por CPF é fraco. </w:t>
-      </w:r>
       <w:r>
         <w:rPr>
           <w:rFonts w:ascii="Times New Roman" w:hAnsi="Times New Roman"/>
@@ -6439,7 +8609,7 @@
           <w:i w:val="0"/>
           <w:sz w:val="24"/>
         </w:rPr>
-        <w:t>CPF é identificador público, não segredo: quem souber o CPF de um cliente obtém um token válido em nome dele.</w:t>
+        <w:t>A autenticação por CPF segue o que o enunciado especifica. Ela possui, porém, uma limitação conhecida: o CPF é um identificador, e não uma credencial secreta. Em uso real, quem conhecesse o CPF de um cliente conseguiria obter um token em nome dele.</w:t>
       </w:r>
     </w:p>
     <w:p>
@@ -6455,7 +8625,7 @@
           <w:i w:val="0"/>
           <w:sz w:val="24"/>
         </w:rPr>
-        <w:t>É exatamente o que o enunciado especifica, e foi implementado como especificado. Mas entregar isso calados seria pior do que entregar com a ressalva. Uma versão produtiva exigiria segundo fator — e o serviço de notificação por e-mail já existe no sistema, o que tornaria um código de uso único barato de implementar.</w:t>
+        <w:t>A evolução prevista é a adoção de um segundo fator, como um código de uso único enviado por e-mail, aproveitando o serviço de notificação já existente no sistema. Como a mudança do fator de autenticação não faz parte do escopo desta entrega, a melhoria está registrada como débito técnico (DT-06) e planejada para uma etapa futura. A mesma limitação vale para o funcionário, que também se autentica apenas pelo CPF.</w:t>
       </w:r>
     </w:p>
     <w:p>
@@ -6471,7 +8641,7 @@
           <w:i w:val="0"/>
           <w:sz w:val="24"/>
         </w:rPr>
-        <w:t>As mitigações que couberam no escopo, sem alterar o fator de autenticação:</w:t>
+        <w:t>As seguintes mitigações foram aplicadas:</w:t>
       </w:r>
     </w:p>
     <w:tbl>
@@ -6526,7 +8696,7 @@
                 <w:i w:val="0"/>
                 <w:sz w:val="20"/>
               </w:rPr>
-              <w:t>O que impede</w:t>
+              <w:t>Risco reduzido</w:t>
             </w:r>
           </w:p>
         </w:tc>
@@ -6548,7 +8718,7 @@
                 <w:i w:val="0"/>
                 <w:sz w:val="20"/>
               </w:rPr>
-              <w:t>404 e 403 com corpo idêntico</w:t>
+              <w:t>Respostas 404 e 403 com corpo idêntico</w:t>
             </w:r>
           </w:p>
         </w:tc>
@@ -6568,7 +8738,7 @@
                 <w:i w:val="0"/>
                 <w:sz w:val="20"/>
               </w:rPr>
-              <w:t>Enumeração de CPFs válidos pela resposta</w:t>
+              <w:t>Enumeração de CPFs cadastrados</w:t>
             </w:r>
           </w:p>
         </w:tc>
@@ -6590,7 +8760,7 @@
                 <w:i w:val="0"/>
                 <w:sz w:val="20"/>
               </w:rPr>
-              <w:t>Throttle de 10 req/s na rota /auth</w:t>
+              <w:t>Throttling de 10 req/s na rota /auth</w:t>
             </w:r>
           </w:p>
         </w:tc>
@@ -6610,7 +8780,7 @@
                 <w:i w:val="0"/>
                 <w:sz w:val="20"/>
               </w:rPr>
-              <w:t>Varredura em volume</w:t>
+              <w:t>Tentativas em volume</w:t>
             </w:r>
           </w:p>
         </w:tc>
@@ -6632,7 +8802,7 @@
                 <w:i w:val="0"/>
                 <w:sz w:val="20"/>
               </w:rPr>
-              <w:t>Token de 15 minutos, sem refresh</w:t>
+              <w:t>Token com validade de 15 minutos, sem refresh</w:t>
             </w:r>
           </w:p>
         </w:tc>
@@ -6652,7 +8822,7 @@
                 <w:i w:val="0"/>
                 <w:sz w:val="20"/>
               </w:rPr>
-              <w:t>Janela de uso de um token vazado</w:t>
+              <w:t>Uso prolongado de um token vazado</w:t>
             </w:r>
           </w:p>
         </w:tc>
@@ -6674,7 +8844,7 @@
                 <w:i w:val="0"/>
                 <w:sz w:val="20"/>
               </w:rPr>
-              <w:t>CPF fora do log e do subject</w:t>
+              <w:t>CPF fora dos logs e do subject do token</w:t>
             </w:r>
           </w:p>
         </w:tc>
@@ -6694,7 +8864,7 @@
                 <w:i w:val="0"/>
                 <w:sz w:val="20"/>
               </w:rPr>
-              <w:t>Vazamento por telemetria</w:t>
+              <w:t>Exposição do CPF por telemetria</w:t>
             </w:r>
           </w:p>
         </w:tc>
@@ -6741,7 +8911,7 @@
           <w:i w:val="0"/>
           <w:sz w:val="24"/>
         </w:rPr>
-        <w:t>O registro completo, com situação atual, causa raiz, melhoria planejada, justificativa de escopo e impacto de cada item, está versionado em docs/tech-challenge-3/debitos-tecnicos.md. O resumo:</w:t>
+        <w:t>O registro completo, com situação atual, causa raiz, melhoria planejada, justificativa de escopo e impacto de cada item, está em docs/tech-challenge-3/debitos-tecnicos.md. A tabela a seguir resume os débitos:</w:t>
       </w:r>
     </w:p>
     <w:tbl>
@@ -7048,7 +9218,7 @@
                 <w:i w:val="0"/>
                 <w:sz w:val="20"/>
               </w:rPr>
-              <w:t>Revogação de token não é imediata — janela de 15 min</w:t>
+              <w:t>Revogação de token não imediata (janela de 15 minutos)</w:t>
             </w:r>
           </w:p>
         </w:tc>
@@ -7130,7 +9300,7 @@
                 <w:i w:val="0"/>
                 <w:sz w:val="20"/>
               </w:rPr>
-              <w:t>NAT instance é ponto único de falha</w:t>
+              <w:t>NAT instance como ponto único de falha</w:t>
             </w:r>
           </w:p>
         </w:tc>
@@ -7212,7 +9382,7 @@
                 <w:i w:val="0"/>
                 <w:sz w:val="20"/>
               </w:rPr>
-              <w:t>Homologação e produção compartilham cluster e banco</w:t>
+              <w:t>Homologação e produção compartilhavam cluster e banco (quitado, ADR-012)</w:t>
             </w:r>
           </w:p>
         </w:tc>
@@ -7232,7 +9402,7 @@
                 <w:i w:val="0"/>
                 <w:sz w:val="20"/>
               </w:rPr>
-              <w:t>Média</w:t>
+              <w:t>—</w:t>
             </w:r>
           </w:p>
         </w:tc>
@@ -7252,7 +9422,7 @@
                 <w:i w:val="0"/>
                 <w:sz w:val="20"/>
               </w:rPr>
-              <w:t>Médio</w:t>
+              <w:t>—</w:t>
             </w:r>
           </w:p>
         </w:tc>
@@ -7376,7 +9546,7 @@
                 <w:i w:val="0"/>
                 <w:sz w:val="20"/>
               </w:rPr>
-              <w:t>Tabela refresh_tokens órfã no schema</w:t>
+              <w:t>Tabela refresh_tokens sem uso no schema</w:t>
             </w:r>
           </w:p>
         </w:tc>
@@ -7503,6 +9673,170 @@
           </w:p>
         </w:tc>
       </w:tr>
+      <w:tr>
+        <w:tc>
+          <w:tcPr>
+            <w:tcW w:type="dxa" w:w="1020"/>
+          </w:tcPr>
+          <w:p>
+            <w:pPr>
+              <w:spacing w:after="40"/>
+            </w:pPr>
+            <w:r/>
+            <w:r>
+              <w:rPr>
+                <w:rFonts w:ascii="Times New Roman" w:hAnsi="Times New Roman"/>
+                <w:b w:val="0"/>
+                <w:i w:val="0"/>
+                <w:sz w:val="20"/>
+              </w:rPr>
+              <w:t>DT-09</w:t>
+            </w:r>
+          </w:p>
+        </w:tc>
+        <w:tc>
+          <w:tcPr>
+            <w:tcW w:type="dxa" w:w="5216"/>
+          </w:tcPr>
+          <w:p>
+            <w:pPr>
+              <w:spacing w:after="40"/>
+            </w:pPr>
+            <w:r/>
+            <w:r>
+              <w:rPr>
+                <w:rFonts w:ascii="Times New Roman" w:hAnsi="Times New Roman"/>
+                <w:b w:val="0"/>
+                <w:i w:val="0"/>
+                <w:sz w:val="20"/>
+              </w:rPr>
+              <w:t>Ambientes na mesma conta AWS, com role de pipeline compartilhada</w:t>
+            </w:r>
+          </w:p>
+        </w:tc>
+        <w:tc>
+          <w:tcPr>
+            <w:tcW w:type="dxa" w:w="1417"/>
+          </w:tcPr>
+          <w:p>
+            <w:pPr>
+              <w:spacing w:after="40"/>
+            </w:pPr>
+            <w:r/>
+            <w:r>
+              <w:rPr>
+                <w:rFonts w:ascii="Times New Roman" w:hAnsi="Times New Roman"/>
+                <w:b w:val="0"/>
+                <w:i w:val="0"/>
+                <w:sz w:val="20"/>
+              </w:rPr>
+              <w:t>Média</w:t>
+            </w:r>
+          </w:p>
+        </w:tc>
+        <w:tc>
+          <w:tcPr>
+            <w:tcW w:type="dxa" w:w="1417"/>
+          </w:tcPr>
+          <w:p>
+            <w:pPr>
+              <w:spacing w:after="40"/>
+            </w:pPr>
+            <w:r/>
+            <w:r>
+              <w:rPr>
+                <w:rFonts w:ascii="Times New Roman" w:hAnsi="Times New Roman"/>
+                <w:b w:val="0"/>
+                <w:i w:val="0"/>
+                <w:sz w:val="20"/>
+              </w:rPr>
+              <w:t>Médio</w:t>
+            </w:r>
+          </w:p>
+        </w:tc>
+      </w:tr>
+      <w:tr>
+        <w:tc>
+          <w:tcPr>
+            <w:tcW w:type="dxa" w:w="1020"/>
+          </w:tcPr>
+          <w:p>
+            <w:pPr>
+              <w:spacing w:after="40"/>
+            </w:pPr>
+            <w:r/>
+            <w:r>
+              <w:rPr>
+                <w:rFonts w:ascii="Times New Roman" w:hAnsi="Times New Roman"/>
+                <w:b w:val="0"/>
+                <w:i w:val="0"/>
+                <w:sz w:val="20"/>
+              </w:rPr>
+              <w:t>DT-10</w:t>
+            </w:r>
+          </w:p>
+        </w:tc>
+        <w:tc>
+          <w:tcPr>
+            <w:tcW w:type="dxa" w:w="5216"/>
+          </w:tcPr>
+          <w:p>
+            <w:pPr>
+              <w:spacing w:after="40"/>
+            </w:pPr>
+            <w:r/>
+            <w:r>
+              <w:rPr>
+                <w:rFonts w:ascii="Times New Roman" w:hAnsi="Times New Roman"/>
+                <w:b w:val="0"/>
+                <w:i w:val="0"/>
+                <w:sz w:val="20"/>
+              </w:rPr>
+              <w:t>Produção preparada e não provisionada</w:t>
+            </w:r>
+          </w:p>
+        </w:tc>
+        <w:tc>
+          <w:tcPr>
+            <w:tcW w:type="dxa" w:w="1417"/>
+          </w:tcPr>
+          <w:p>
+            <w:pPr>
+              <w:spacing w:after="40"/>
+            </w:pPr>
+            <w:r/>
+            <w:r>
+              <w:rPr>
+                <w:rFonts w:ascii="Times New Roman" w:hAnsi="Times New Roman"/>
+                <w:b w:val="0"/>
+                <w:i w:val="0"/>
+                <w:sz w:val="20"/>
+              </w:rPr>
+              <w:t>Baixa</w:t>
+            </w:r>
+          </w:p>
+        </w:tc>
+        <w:tc>
+          <w:tcPr>
+            <w:tcW w:type="dxa" w:w="1417"/>
+          </w:tcPr>
+          <w:p>
+            <w:pPr>
+              <w:spacing w:after="40"/>
+            </w:pPr>
+            <w:r/>
+            <w:r>
+              <w:rPr>
+                <w:rFonts w:ascii="Times New Roman" w:hAnsi="Times New Roman"/>
+                <w:b w:val="0"/>
+                <w:i w:val="0"/>
+                <w:sz w:val="20"/>
+              </w:rPr>
+              <w:t>Baixo</w:t>
+            </w:r>
+          </w:p>
+        </w:tc>
+      </w:tr>
     </w:tbl>
     <w:p>
       <w:pPr>
@@ -7522,7 +9856,7 @@
           <w:i w:val="0"/>
           <w:sz w:val="24"/>
         </w:rPr>
-        <w:t>Declarar o débito é decisão consciente, não descuido. Cada item acima foi avaliado, teve o custo da correção pesado contra o ganho, e ficou registrado com a melhoria planejada. Débito documentado é dívida com juros conhecidos; débito escondido é surpresa em produção.</w:t>
+        <w:t>Cada item foi avaliado quanto ao custo da correção e ao benefício esperado, e está registrado com a respectiva melhoria planejada.</w:t>
       </w:r>
     </w:p>
     <w:p>
@@ -7561,7 +9895,7 @@
           <w:i w:val="0"/>
           <w:sz w:val="24"/>
         </w:rPr>
-        <w:t>A Fase 3 pediu para elevar o sistema a nível de operação corporativa, e o eixo comum dos requisitos é a passagem de funciona para opera. Nenhuma regra de negócio nova foi adicionada; o que mudou foi a capacidade de operar o sistema com segurança e visibilidade.</w:t>
+        <w:t>A Fase 3 teve como objetivo preparar o sistema para operação em ambiente corporativo. Não foram adicionadas regras de negócio; as alterações concentraram-se na segurança, na operação e na visibilidade do sistema.</w:t>
       </w:r>
     </w:p>
     <w:p>
@@ -7577,7 +9911,7 @@
           <w:i w:val="0"/>
           <w:sz w:val="24"/>
         </w:rPr>
-        <w:t>A autenticação saiu da aplicação e virou função serverless atrás de um gateway, o que deu ao sistema um único emissor de identidade e uma borda real. A rede fechou: nós e banco perderam o IP público, e a escolha de como dar saída de internet foi tomada com a conta na mesa, não por intuição — o caminho aparentemente mais barato era o mais caro. O monorepo virou quatro repositórios com esteiras próprias, acopladas por um único contrato.</w:t>
+        <w:t>A emissão de tokens foi transferida para uma função serverless protegida por um API Gateway, o que centralizou a identidade em um único emissor. Os nós e o banco de dados passaram a operar em subnets privadas, e a forma de acesso à internet foi definida a partir da comparação de custos entre as alternativas. O repositório único foi dividido em quatro, com pipelines próprios e integração pelo SSM Parameter Store, e os ambientes de homologação e produção foram segregados sem aumento do custo de operação.</w:t>
       </w:r>
     </w:p>
     <w:p>
@@ -7593,7 +9927,7 @@
           <w:i w:val="0"/>
           <w:sz w:val="24"/>
         </w:rPr>
-        <w:t>E o sistema passou a ser observável de verdade: não apenas gráficos de infraestrutura, mas métricas que respondem perguntas de negócio, logs que abrem o trace da requisição com um clique, e alertas que apontam para um procedimento em vez de para um painel.</w:t>
+        <w:t>No aspecto de observabilidade, o sistema passou a contar com métricas de negócio, logs estruturados correlacionados aos traces e alertas associados a runbooks.</w:t>
       </w:r>
     </w:p>
     <w:p>
@@ -7609,7 +9943,7 @@
           <w:i w:val="0"/>
           <w:sz w:val="24"/>
         </w:rPr>
-        <w:t>A arquitetura em Clean Architecture, estabelecida na Fase 1 e refinada na Fase 2, sustentou a mudança: trocar o emissor do token e adicionar métricas de negócio não exigiu tocar em regra de domínio. As alterações concentraram-se na camada de infraestrutura, que é exatamente onde deveriam estar.</w:t>
+        <w:t>A Clean Architecture adotada desde a Fase 1 permitiu que a troca do emissor do token e a inclusão das métricas de negócio fossem realizadas sem alterações nas regras de domínio, com as mudanças concentradas na camada de infraestrutura.</w:t>
       </w:r>
     </w:p>
     <w:p>
@@ -7625,7 +9959,7 @@
           <w:i w:val="0"/>
           <w:sz w:val="24"/>
         </w:rPr>
-        <w:t>Encerramos a fase com oito débitos técnicos declarados. Não é sinal de trabalho incompleto, e sim do contrário: cada um foi identificado, avaliado e registrado com a melhoria planejada e a justificativa do adiamento. O que mais preocupa está dito com todas as letras — autenticar apenas por CPF é fraco, e o sistema entrega isso porque foi o que se pediu, com as mitigações que couberam e a ressalva registrada.</w:t>
+        <w:t>A fase foi encerrada com nove débitos técnicos abertos e um quitado. Cada um está registrado com a melhoria planejada e a justificativa do adiamento. O principal deles, a autenticação apenas por CPF, atende ao que o enunciado especifica, conta com mitigações e tem a adoção de um segundo fator prevista para uma etapa futura.</w:t>
       </w:r>
     </w:p>
     <w:p>

</xml_diff>

<commit_message>
docs: update report and slides for authentication response
</commit_message>
<xml_diff>
--- a/docs/tech-challenge-3/documento_entrega.docx
+++ b/docs/tech-challenge-3/documento_entrega.docx
@@ -2033,9 +2033,7 @@
         <w:br/>
         <w:t xml:space="preserve">  → 400  CPF_INVALIDO           (sem consulta ao banco)</w:t>
         <w:br/>
-        <w:t xml:space="preserve">  → 404  CLIENTE_NAO_ENCONTRADO</w:t>
-        <w:br/>
-        <w:t xml:space="preserve">  → 403  CLIENTE_INATIVO</w:t>
+        <w:t xml:space="preserve">  → 401  AUTENTICACAO_RECUSADA  (CPF sem cadastro, cliente inativo ou bloqueado)</w:t>
       </w:r>
     </w:p>
     <w:p>
@@ -2051,7 +2049,7 @@
           <w:i w:val="0"/>
           <w:sz w:val="24"/>
         </w:rPr>
-        <w:t>As respostas 404 e 403 retornam a mesma mensagem. O código específico é mantido nos logs para fins de suporte, enquanto o corpo da resposta é genérico, para impedir que o endpoint seja usado para descobrir quais CPFs estão cadastrados.</w:t>
+        <w:t>CPF sem cadastro e cadastro sem permissão recebem a mesma resposta, com status 401, cabeçalhos e corpo idênticos. O motivo específico é registrado apenas no log, de modo que o endpoint não permita descobrir quais CPFs estão cadastrados.</w:t>
       </w:r>
     </w:p>
     <w:p>
@@ -2094,7 +2092,7 @@
       <w:r>
         <w:drawing>
           <wp:inline xmlns:a="http://schemas.openxmlformats.org/drawingml/2006/main" xmlns:pic="http://schemas.openxmlformats.org/drawingml/2006/picture">
-            <wp:extent cx="5760000" cy="5524305"/>
+            <wp:extent cx="5760000" cy="5256323"/>
             <wp:docPr id="4" name="Picture 4"/>
             <wp:cNvGraphicFramePr>
               <a:graphicFrameLocks noChangeAspect="1"/>
@@ -2115,7 +2113,7 @@
                   <pic:spPr>
                     <a:xfrm>
                       <a:off x="0" y="0"/>
-                      <a:ext cx="5760000" cy="5524305"/>
+                      <a:ext cx="5760000" cy="5256323"/>
                     </a:xfrm>
                     <a:prstGeom prst="rect"/>
                   </pic:spPr>
@@ -8260,7 +8258,7 @@
           <w:i w:val="0"/>
           <w:sz w:val="24"/>
         </w:rPr>
-        <w:t>Os métodos resultam em cento e quarenta e quatro casos executados, com 91% de cobertura de linhas. O build falha abaixo de 85% de linhas e 70% de branches. O teste de integração executa todas as migrations em um PostgreSQL real e compara a especificação OpenAPI gerada pela aplicação com o arquivo versionado docs/openapi.json. A Lambda possui quarenta e cinco casos de teste, incluindo consultas contra PostgreSQL via Testcontainers. A descrição de cada classe está em docs/testes.md, no repositório da aplicação, e no README da Lambda.</w:t>
+        <w:t>Os métodos resultam em cento e quarenta e quatro casos executados, com 91% de cobertura de linhas. O build falha abaixo de 85% de linhas e 70% de branches. O teste de integração executa todas as migrations em um PostgreSQL real e compara a especificação OpenAPI gerada pela aplicação com o arquivo versionado docs/openapi.json. A Lambda possui quarenta e quatro casos de teste, incluindo consultas contra PostgreSQL via Testcontainers. A descrição de cada classe está em docs/testes.md, no repositório da aplicação, e no README da Lambda.</w:t>
       </w:r>
     </w:p>
     <w:p>
@@ -8718,7 +8716,7 @@
                 <w:i w:val="0"/>
                 <w:sz w:val="20"/>
               </w:rPr>
-              <w:t>Respostas 404 e 403 com corpo idêntico</w:t>
+              <w:t>Resposta 401 idêntica para CPF sem cadastro e cadastro inativo</w:t>
             </w:r>
           </w:p>
         </w:tc>

</xml_diff>

<commit_message>
docs: describe log forwarding through new relic agent
</commit_message>
<xml_diff>
--- a/docs/tech-challenge-3/documento_entrega.docx
+++ b/docs/tech-challenge-3/documento_entrega.docx
@@ -6068,7 +6068,7 @@
                 <w:i w:val="0"/>
                 <w:sz w:val="20"/>
               </w:rPr>
-              <w:t>Structured logging nativo do Spring Boot 3.4, formato ECS</w:t>
+              <w:t>Structured logging do Spring Boot 3.4 (ECS), enviado pelo agente com trace.id</w:t>
             </w:r>
           </w:p>
         </w:tc>
@@ -6110,7 +6110,7 @@
           <w:i w:val="0"/>
           <w:sz w:val="24"/>
         </w:rPr>
-        <w:t>O Spring Boot 3.4 oferece structured logging nativo, sem necessidade de biblioteca adicional ou de configuração do logback. Foi adotado o formato ECS, que utiliza os campos trace.id e span.id, reconhecidos pela plataforma para associar cada linha de log ao trace correspondente.</w:t>
+        <w:t>O Spring Boot 3.4 oferece structured logging nativo, sem necessidade de biblioteca adicional ou de configuração do logback. Foi adotado o formato ECS na saída do container, com campos padronizados de nível, logger, mensagem e contexto.</w:t>
       </w:r>
     </w:p>
     <w:p>
@@ -6126,7 +6126,7 @@
           <w:i w:val="0"/>
           <w:sz w:val="24"/>
         </w:rPr>
-        <w:t>Conforme orientação da Aula 08, o encaminhamento de logs pelo agente de APM foi desativado, pois o envio é feito pelo Fluent Bit da integração Kubernetes. Com os dois mecanismos ativos, cada linha seria enviada duas vezes, dobrando o consumo da cota do plano gratuito.</w:t>
+        <w:t>O envio ao New Relic é feito pelo agente de APM, que anexa a cada linha o trace.id e o span.id da transação em andamento e permite abrir o trace a partir do log. O Fluent Bit da integração Kubernetes permanece desativado: conforme orientação da Aula 08, com os dois mecanismos ativos cada linha seria enviada duas vezes, dobrando o consumo da cota do plano gratuito.</w:t>
       </w:r>
     </w:p>
     <w:p>

</xml_diff>

<commit_message>
docs: regenerate report and slides
</commit_message>
<xml_diff>
--- a/docs/tech-challenge-3/documento_entrega.docx
+++ b/docs/tech-challenge-3/documento_entrega.docx
@@ -6762,7 +6762,7 @@
                 <w:i w:val="0"/>
                 <w:sz w:val="20"/>
               </w:rPr>
-              <w:t>14</w:t>
+              <w:t>15</w:t>
             </w:r>
           </w:p>
         </w:tc>
@@ -7139,6 +7139,22 @@
           <w:sz w:val="24"/>
         </w:rPr>
         <w:t>A ADR-011 é retroativa e documenta o uso de HPA, implementado na Fase 2 sem registro. O enunciado cita o HPA como exemplo de decisão a ser documentada, e a elaboração da ADR identificou uma inconsistência: o HPA permitia até quatro réplicas, enquanto o node group estava limitado a três nós. A inconsistência foi corrigida nesta fase.</w:t>
+      </w:r>
+    </w:p>
+    <w:p>
+      <w:pPr>
+        <w:spacing w:before="0" w:after="120"/>
+        <w:ind w:firstLine="709"/>
+        <w:jc w:val="both"/>
+      </w:pPr>
+      <w:r>
+        <w:rPr>
+          <w:rFonts w:ascii="Times New Roman" w:hAnsi="Times New Roman"/>
+          <w:b w:val="0"/>
+          <w:i w:val="0"/>
+          <w:sz w:val="24"/>
+        </w:rPr>
+        <w:t>A mesma ADR registrou como risco a escala prematura pela métrica de memória e recomendou validá-la com teste de carga. O teste em homologação confirmou o risco: a memória permanecia acima do alvo mesmo com a aplicação ociosa, porque a JVM retém o heap alocado, e o autoscaler não retornava ao número mínimo de réplicas. A ADR-015 registra a correção, com a escala passando a considerar apenas CPU, e supera a ADR-011 nesse ponto. O caso exemplifica o ciclo de vida descrito acima: uma decisão não é editada, e a mudança de rumo é registrada em nova ADR.</w:t>
       </w:r>
     </w:p>
     <w:p>

</xml_diff>

<commit_message>
docs: add environment validation to report and slides
</commit_message>
<xml_diff>
--- a/docs/tech-challenge-3/documento_entrega.docx
+++ b/docs/tech-challenge-3/documento_entrega.docx
@@ -8148,7 +8148,7 @@
                 <w:i w:val="0"/>
                 <w:sz w:val="20"/>
               </w:rPr>
-              <w:t>14</w:t>
+              <w:t>15</w:t>
             </w:r>
           </w:p>
         </w:tc>
@@ -8230,7 +8230,7 @@
                 <w:i w:val="0"/>
                 <w:sz w:val="20"/>
               </w:rPr>
-              <w:t>12</w:t>
+              <w:t>14</w:t>
             </w:r>
           </w:p>
         </w:tc>
@@ -8274,7 +8274,7 @@
           <w:i w:val="0"/>
           <w:sz w:val="24"/>
         </w:rPr>
-        <w:t>Os métodos resultam em cento e quarenta e quatro casos executados, com 91% de cobertura de linhas. O build falha abaixo de 85% de linhas e 70% de branches. O teste de integração executa todas as migrations em um PostgreSQL real e compara a especificação OpenAPI gerada pela aplicação com o arquivo versionado docs/openapi.json. A Lambda possui quarenta e quatro casos de teste, incluindo consultas contra PostgreSQL via Testcontainers. A descrição de cada classe está em docs/testes.md, no repositório da aplicação, e no README da Lambda.</w:t>
+        <w:t>Os métodos resultam em cento e quarenta e sete casos executados, com 91% de cobertura de linhas. O build falha abaixo de 85% de linhas e 70% de branches. O teste de integração executa todas as migrations em um PostgreSQL real e compara a especificação OpenAPI gerada pela aplicação com o arquivo versionado docs/openapi.json. A Lambda possui quarenta e quatro casos de teste, incluindo consultas contra PostgreSQL via Testcontainers. A descrição de cada classe está em docs/testes.md, no repositório da aplicação, e no README da Lambda.</w:t>
       </w:r>
     </w:p>
     <w:p>
@@ -8308,7 +8308,582 @@
           <w:color w:val="1F3A5F"/>
           <w:sz w:val="24"/>
         </w:rPr>
-        <w:t>9.1 Validação de CPF em dois repositórios</w:t>
+        <w:t>9.1 Validação do ambiente provisionado</w:t>
+      </w:r>
+    </w:p>
+    <w:p>
+      <w:pPr>
+        <w:spacing w:before="0" w:after="120"/>
+        <w:ind w:firstLine="709"/>
+        <w:jc w:val="both"/>
+      </w:pPr>
+      <w:r>
+        <w:rPr>
+          <w:rFonts w:ascii="Times New Roman" w:hAnsi="Times New Roman"/>
+          <w:b w:val="0"/>
+          <w:i w:val="0"/>
+          <w:sz w:val="24"/>
+        </w:rPr>
+        <w:t>Os testes automatizados cobrem o código, mas não a integração entre os quatro repositórios na nuvem. Para verificá-la, o ambiente de homologação foi provisionado e destruído por completo, pelos workflows, com a demonstração executada no meio do ciclo.</w:t>
+      </w:r>
+    </w:p>
+    <w:tbl>
+      <w:tblPr>
+        <w:tblStyle w:val="TableGrid"/>
+        <w:tblW w:type="auto" w:w="0"/>
+        <w:jc w:val="center"/>
+        <w:tblLook w:firstColumn="1" w:firstRow="1" w:lastColumn="0" w:lastRow="0" w:noHBand="0" w:noVBand="1" w:val="04A0"/>
+      </w:tblPr>
+      <w:tblGrid>
+        <w:gridCol w:w="3024"/>
+        <w:gridCol w:w="3024"/>
+        <w:gridCol w:w="3024"/>
+      </w:tblGrid>
+      <w:tr>
+        <w:tc>
+          <w:tcPr>
+            <w:tcW w:type="dxa" w:w="2551"/>
+          </w:tcPr>
+          <w:p>
+            <w:pPr>
+              <w:spacing w:after="40"/>
+              <w:jc w:val="center"/>
+              <w:shd w:val="clear" w:fill="E8EDF3"/>
+            </w:pPr>
+            <w:r/>
+            <w:r>
+              <w:rPr>
+                <w:rFonts w:ascii="Times New Roman" w:hAnsi="Times New Roman"/>
+                <w:b/>
+                <w:i w:val="0"/>
+                <w:sz w:val="20"/>
+              </w:rPr>
+              <w:t>Etapa</w:t>
+            </w:r>
+          </w:p>
+        </w:tc>
+        <w:tc>
+          <w:tcPr>
+            <w:tcW w:type="dxa" w:w="1417"/>
+          </w:tcPr>
+          <w:p>
+            <w:pPr>
+              <w:spacing w:after="40"/>
+              <w:jc w:val="center"/>
+              <w:shd w:val="clear" w:fill="E8EDF3"/>
+            </w:pPr>
+            <w:r/>
+            <w:r>
+              <w:rPr>
+                <w:rFonts w:ascii="Times New Roman" w:hAnsi="Times New Roman"/>
+                <w:b/>
+                <w:i w:val="0"/>
+                <w:sz w:val="20"/>
+              </w:rPr>
+              <w:t>Duração</w:t>
+            </w:r>
+          </w:p>
+        </w:tc>
+        <w:tc>
+          <w:tcPr>
+            <w:tcW w:type="dxa" w:w="5102"/>
+          </w:tcPr>
+          <w:p>
+            <w:pPr>
+              <w:spacing w:after="40"/>
+              <w:jc w:val="center"/>
+              <w:shd w:val="clear" w:fill="E8EDF3"/>
+            </w:pPr>
+            <w:r/>
+            <w:r>
+              <w:rPr>
+                <w:rFonts w:ascii="Times New Roman" w:hAnsi="Times New Roman"/>
+                <w:b/>
+                <w:i w:val="0"/>
+                <w:sz w:val="20"/>
+              </w:rPr>
+              <w:t>Verificação</w:t>
+            </w:r>
+          </w:p>
+        </w:tc>
+      </w:tr>
+      <w:tr>
+        <w:tc>
+          <w:tcPr>
+            <w:tcW w:type="dxa" w:w="2551"/>
+          </w:tcPr>
+          <w:p>
+            <w:pPr>
+              <w:spacing w:after="40"/>
+            </w:pPr>
+            <w:r/>
+            <w:r>
+              <w:rPr>
+                <w:rFonts w:ascii="Times New Roman" w:hAnsi="Times New Roman"/>
+                <w:b w:val="0"/>
+                <w:i w:val="0"/>
+                <w:sz w:val="20"/>
+              </w:rPr>
+              <w:t>Provisionamento</w:t>
+            </w:r>
+          </w:p>
+        </w:tc>
+        <w:tc>
+          <w:tcPr>
+            <w:tcW w:type="dxa" w:w="1417"/>
+          </w:tcPr>
+          <w:p>
+            <w:pPr>
+              <w:spacing w:after="40"/>
+            </w:pPr>
+            <w:r/>
+            <w:r>
+              <w:rPr>
+                <w:rFonts w:ascii="Times New Roman" w:hAnsi="Times New Roman"/>
+                <w:b w:val="0"/>
+                <w:i w:val="0"/>
+                <w:sz w:val="20"/>
+              </w:rPr>
+              <w:t>34 min</w:t>
+            </w:r>
+          </w:p>
+        </w:tc>
+        <w:tc>
+          <w:tcPr>
+            <w:tcW w:type="dxa" w:w="5102"/>
+          </w:tcPr>
+          <w:p>
+            <w:pPr>
+              <w:spacing w:after="40"/>
+            </w:pPr>
+            <w:r/>
+            <w:r>
+              <w:rPr>
+                <w:rFonts w:ascii="Times New Roman" w:hAnsi="Times New Roman"/>
+                <w:b w:val="0"/>
+                <w:i w:val="0"/>
+                <w:sz w:val="20"/>
+              </w:rPr>
+              <w:t>Rede, EKS, RDS, Lambda, rotas do gateway e manifests</w:t>
+            </w:r>
+          </w:p>
+        </w:tc>
+      </w:tr>
+      <w:tr>
+        <w:tc>
+          <w:tcPr>
+            <w:tcW w:type="dxa" w:w="2551"/>
+          </w:tcPr>
+          <w:p>
+            <w:pPr>
+              <w:spacing w:after="40"/>
+            </w:pPr>
+            <w:r/>
+            <w:r>
+              <w:rPr>
+                <w:rFonts w:ascii="Times New Roman" w:hAnsi="Times New Roman"/>
+                <w:b w:val="0"/>
+                <w:i w:val="0"/>
+                <w:sz w:val="20"/>
+              </w:rPr>
+              <w:t>Autenticação</w:t>
+            </w:r>
+          </w:p>
+        </w:tc>
+        <w:tc>
+          <w:tcPr>
+            <w:tcW w:type="dxa" w:w="1417"/>
+          </w:tcPr>
+          <w:p>
+            <w:pPr>
+              <w:spacing w:after="40"/>
+            </w:pPr>
+            <w:r/>
+            <w:r>
+              <w:rPr>
+                <w:rFonts w:ascii="Times New Roman" w:hAnsi="Times New Roman"/>
+                <w:b w:val="0"/>
+                <w:i w:val="0"/>
+                <w:sz w:val="20"/>
+              </w:rPr>
+              <w:t>—</w:t>
+            </w:r>
+          </w:p>
+        </w:tc>
+        <w:tc>
+          <w:tcPr>
+            <w:tcW w:type="dxa" w:w="5102"/>
+          </w:tcPr>
+          <w:p>
+            <w:pPr>
+              <w:spacing w:after="40"/>
+            </w:pPr>
+            <w:r/>
+            <w:r>
+              <w:rPr>
+                <w:rFonts w:ascii="Times New Roman" w:hAnsi="Times New Roman"/>
+                <w:b w:val="0"/>
+                <w:i w:val="0"/>
+                <w:sz w:val="20"/>
+              </w:rPr>
+              <w:t>200 para o funcionário cadastrado, 401 para CPF sem cadastro e 400 para dígito inválido</w:t>
+            </w:r>
+          </w:p>
+        </w:tc>
+      </w:tr>
+      <w:tr>
+        <w:tc>
+          <w:tcPr>
+            <w:tcW w:type="dxa" w:w="2551"/>
+          </w:tcPr>
+          <w:p>
+            <w:pPr>
+              <w:spacing w:after="40"/>
+            </w:pPr>
+            <w:r/>
+            <w:r>
+              <w:rPr>
+                <w:rFonts w:ascii="Times New Roman" w:hAnsi="Times New Roman"/>
+                <w:b w:val="0"/>
+                <w:i w:val="0"/>
+                <w:sz w:val="20"/>
+              </w:rPr>
+              <w:t>Rotas protegidas</w:t>
+            </w:r>
+          </w:p>
+        </w:tc>
+        <w:tc>
+          <w:tcPr>
+            <w:tcW w:type="dxa" w:w="1417"/>
+          </w:tcPr>
+          <w:p>
+            <w:pPr>
+              <w:spacing w:after="40"/>
+            </w:pPr>
+            <w:r/>
+            <w:r>
+              <w:rPr>
+                <w:rFonts w:ascii="Times New Roman" w:hAnsi="Times New Roman"/>
+                <w:b w:val="0"/>
+                <w:i w:val="0"/>
+                <w:sz w:val="20"/>
+              </w:rPr>
+              <w:t>—</w:t>
+            </w:r>
+          </w:p>
+        </w:tc>
+        <w:tc>
+          <w:tcPr>
+            <w:tcW w:type="dxa" w:w="5102"/>
+          </w:tcPr>
+          <w:p>
+            <w:pPr>
+              <w:spacing w:after="40"/>
+            </w:pPr>
+            <w:r/>
+            <w:r>
+              <w:rPr>
+                <w:rFonts w:ascii="Times New Roman" w:hAnsi="Times New Roman"/>
+                <w:b w:val="0"/>
+                <w:i w:val="0"/>
+                <w:sz w:val="20"/>
+              </w:rPr>
+              <w:t>401 sem token no gateway; 403 para o cliente nas rotas de gestão</w:t>
+            </w:r>
+          </w:p>
+        </w:tc>
+      </w:tr>
+      <w:tr>
+        <w:tc>
+          <w:tcPr>
+            <w:tcW w:type="dxa" w:w="2551"/>
+          </w:tcPr>
+          <w:p>
+            <w:pPr>
+              <w:spacing w:after="40"/>
+            </w:pPr>
+            <w:r/>
+            <w:r>
+              <w:rPr>
+                <w:rFonts w:ascii="Times New Roman" w:hAnsi="Times New Roman"/>
+                <w:b w:val="0"/>
+                <w:i w:val="0"/>
+                <w:sz w:val="20"/>
+              </w:rPr>
+              <w:t>Teste de carga</w:t>
+            </w:r>
+          </w:p>
+        </w:tc>
+        <w:tc>
+          <w:tcPr>
+            <w:tcW w:type="dxa" w:w="1417"/>
+          </w:tcPr>
+          <w:p>
+            <w:pPr>
+              <w:spacing w:after="40"/>
+            </w:pPr>
+            <w:r/>
+            <w:r>
+              <w:rPr>
+                <w:rFonts w:ascii="Times New Roman" w:hAnsi="Times New Roman"/>
+                <w:b w:val="0"/>
+                <w:i w:val="0"/>
+                <w:sz w:val="20"/>
+              </w:rPr>
+              <w:t>5 min</w:t>
+            </w:r>
+          </w:p>
+        </w:tc>
+        <w:tc>
+          <w:tcPr>
+            <w:tcW w:type="dxa" w:w="5102"/>
+          </w:tcPr>
+          <w:p>
+            <w:pPr>
+              <w:spacing w:after="40"/>
+            </w:pPr>
+            <w:r/>
+            <w:r>
+              <w:rPr>
+                <w:rFonts w:ascii="Times New Roman" w:hAnsi="Times New Roman"/>
+                <w:b w:val="0"/>
+                <w:i w:val="0"/>
+                <w:sz w:val="20"/>
+              </w:rPr>
+              <w:t>23.135 requisições, nenhuma falha, p95 de 323 ms</w:t>
+            </w:r>
+          </w:p>
+        </w:tc>
+      </w:tr>
+      <w:tr>
+        <w:tc>
+          <w:tcPr>
+            <w:tcW w:type="dxa" w:w="2551"/>
+          </w:tcPr>
+          <w:p>
+            <w:pPr>
+              <w:spacing w:after="40"/>
+            </w:pPr>
+            <w:r/>
+            <w:r>
+              <w:rPr>
+                <w:rFonts w:ascii="Times New Roman" w:hAnsi="Times New Roman"/>
+                <w:b w:val="0"/>
+                <w:i w:val="0"/>
+                <w:sz w:val="20"/>
+              </w:rPr>
+              <w:t>Escalabilidade</w:t>
+            </w:r>
+          </w:p>
+        </w:tc>
+        <w:tc>
+          <w:tcPr>
+            <w:tcW w:type="dxa" w:w="1417"/>
+          </w:tcPr>
+          <w:p>
+            <w:pPr>
+              <w:spacing w:after="40"/>
+            </w:pPr>
+            <w:r/>
+            <w:r>
+              <w:rPr>
+                <w:rFonts w:ascii="Times New Roman" w:hAnsi="Times New Roman"/>
+                <w:b w:val="0"/>
+                <w:i w:val="0"/>
+                <w:sz w:val="20"/>
+              </w:rPr>
+              <w:t>—</w:t>
+            </w:r>
+          </w:p>
+        </w:tc>
+        <w:tc>
+          <w:tcPr>
+            <w:tcW w:type="dxa" w:w="5102"/>
+          </w:tcPr>
+          <w:p>
+            <w:pPr>
+              <w:spacing w:after="40"/>
+            </w:pPr>
+            <w:r/>
+            <w:r>
+              <w:rPr>
+                <w:rFonts w:ascii="Times New Roman" w:hAnsi="Times New Roman"/>
+                <w:b w:val="0"/>
+                <w:i w:val="0"/>
+                <w:sz w:val="20"/>
+              </w:rPr>
+              <w:t>HPA de duas para quatro réplicas por CPU e retorno ao mínimo</w:t>
+            </w:r>
+          </w:p>
+        </w:tc>
+      </w:tr>
+      <w:tr>
+        <w:tc>
+          <w:tcPr>
+            <w:tcW w:type="dxa" w:w="2551"/>
+          </w:tcPr>
+          <w:p>
+            <w:pPr>
+              <w:spacing w:after="40"/>
+            </w:pPr>
+            <w:r/>
+            <w:r>
+              <w:rPr>
+                <w:rFonts w:ascii="Times New Roman" w:hAnsi="Times New Roman"/>
+                <w:b w:val="0"/>
+                <w:i w:val="0"/>
+                <w:sz w:val="20"/>
+              </w:rPr>
+              <w:t>Observabilidade</w:t>
+            </w:r>
+          </w:p>
+        </w:tc>
+        <w:tc>
+          <w:tcPr>
+            <w:tcW w:type="dxa" w:w="1417"/>
+          </w:tcPr>
+          <w:p>
+            <w:pPr>
+              <w:spacing w:after="40"/>
+            </w:pPr>
+            <w:r/>
+            <w:r>
+              <w:rPr>
+                <w:rFonts w:ascii="Times New Roman" w:hAnsi="Times New Roman"/>
+                <w:b w:val="0"/>
+                <w:i w:val="0"/>
+                <w:sz w:val="20"/>
+              </w:rPr>
+              <w:t>—</w:t>
+            </w:r>
+          </w:p>
+        </w:tc>
+        <w:tc>
+          <w:tcPr>
+            <w:tcW w:type="dxa" w:w="5102"/>
+          </w:tcPr>
+          <w:p>
+            <w:pPr>
+              <w:spacing w:after="40"/>
+            </w:pPr>
+            <w:r/>
+            <w:r>
+              <w:rPr>
+                <w:rFonts w:ascii="Times New Roman" w:hAnsi="Times New Roman"/>
+                <w:b w:val="0"/>
+                <w:i w:val="0"/>
+                <w:sz w:val="20"/>
+              </w:rPr>
+              <w:t>Transações no APM, métricas de pods, métricas de negócio e log com identificador de trace</w:t>
+            </w:r>
+          </w:p>
+        </w:tc>
+      </w:tr>
+      <w:tr>
+        <w:tc>
+          <w:tcPr>
+            <w:tcW w:type="dxa" w:w="2551"/>
+          </w:tcPr>
+          <w:p>
+            <w:pPr>
+              <w:spacing w:after="40"/>
+            </w:pPr>
+            <w:r/>
+            <w:r>
+              <w:rPr>
+                <w:rFonts w:ascii="Times New Roman" w:hAnsi="Times New Roman"/>
+                <w:b w:val="0"/>
+                <w:i w:val="0"/>
+                <w:sz w:val="20"/>
+              </w:rPr>
+              <w:t>Destruição</w:t>
+            </w:r>
+          </w:p>
+        </w:tc>
+        <w:tc>
+          <w:tcPr>
+            <w:tcW w:type="dxa" w:w="1417"/>
+          </w:tcPr>
+          <w:p>
+            <w:pPr>
+              <w:spacing w:after="40"/>
+            </w:pPr>
+            <w:r/>
+            <w:r>
+              <w:rPr>
+                <w:rFonts w:ascii="Times New Roman" w:hAnsi="Times New Roman"/>
+                <w:b w:val="0"/>
+                <w:i w:val="0"/>
+                <w:sz w:val="20"/>
+              </w:rPr>
+              <w:t>22 min</w:t>
+            </w:r>
+          </w:p>
+        </w:tc>
+        <w:tc>
+          <w:tcPr>
+            <w:tcW w:type="dxa" w:w="5102"/>
+          </w:tcPr>
+          <w:p>
+            <w:pPr>
+              <w:spacing w:after="40"/>
+            </w:pPr>
+            <w:r/>
+            <w:r>
+              <w:rPr>
+                <w:rFonts w:ascii="Times New Roman" w:hAnsi="Times New Roman"/>
+                <w:b w:val="0"/>
+                <w:i w:val="0"/>
+                <w:sz w:val="20"/>
+              </w:rPr>
+              <w:t>Nenhum recurso remanescente no console</w:t>
+            </w:r>
+          </w:p>
+        </w:tc>
+      </w:tr>
+    </w:tbl>
+    <w:p>
+      <w:pPr>
+        <w:spacing w:after="80"/>
+      </w:pPr>
+    </w:p>
+    <w:p>
+      <w:pPr>
+        <w:spacing w:before="0" w:after="120"/>
+        <w:ind w:firstLine="709"/>
+        <w:jc w:val="both"/>
+      </w:pPr>
+      <w:r>
+        <w:rPr>
+          <w:rFonts w:ascii="Times New Roman" w:hAnsi="Times New Roman"/>
+          <w:b w:val="0"/>
+          <w:i w:val="0"/>
+          <w:sz w:val="24"/>
+        </w:rPr>
+        <w:t>O exercício encontrou defeitos que os testes automatizados não alcançavam, entre eles o envio do nome do stage no caminho pela integração do gateway, que fazia toda rota da aplicação responder 403, e a escala permanente no teto de réplicas pela métrica de memória, tratada na ADR-015. As correções estão nos repositórios correspondentes.</w:t>
+      </w:r>
+    </w:p>
+    <w:p>
+      <w:r>
+        <w:br w:type="page"/>
+      </w:r>
+    </w:p>
+    <w:p>
+      <w:pPr>
+        <w:pStyle w:val="Heading3"/>
+        <w:keepNext/>
+        <w:spacing w:before="240" w:after="160"/>
+        <w:jc w:val="left"/>
+      </w:pPr>
+      <w:r>
+        <w:rPr>
+          <w:rFonts w:ascii="Times New Roman" w:hAnsi="Times New Roman"/>
+          <w:b/>
+          <w:i w:val="0"/>
+          <w:color w:val="1F3A5F"/>
+          <w:sz w:val="24"/>
+        </w:rPr>
+        <w:t>9.2 Validação de CPF em dois repositórios</w:t>
       </w:r>
     </w:p>
     <w:p>

</xml_diff>

<commit_message>
docs: add delivery pdfs and public openapi link
</commit_message>
<xml_diff>
--- a/docs/tech-challenge-3/documento_entrega.docx
+++ b/docs/tech-challenge-3/documento_entrega.docx
@@ -574,7 +574,7 @@
                 <w:i w:val="0"/>
                 <w:sz w:val="20"/>
               </w:rPr>
-              <w:t>Vídeo de demonstração (até 15 min)</w:t>
+              <w:t>Vídeo de demonstração</w:t>
             </w:r>
           </w:p>
         </w:tc>
@@ -594,49 +594,7 @@
                 <w:i w:val="0"/>
                 <w:sz w:val="20"/>
               </w:rPr>
-              <w:t>&lt;preencher antes da entrega&gt;</w:t>
-            </w:r>
-          </w:p>
-        </w:tc>
-      </w:tr>
-      <w:tr>
-        <w:tc>
-          <w:tcPr>
-            <w:tcW w:type="dxa" w:w="3969"/>
-          </w:tcPr>
-          <w:p>
-            <w:pPr>
-              <w:spacing w:after="40"/>
-            </w:pPr>
-            <w:r/>
-            <w:r>
-              <w:rPr>
-                <w:rFonts w:ascii="Times New Roman" w:hAnsi="Times New Roman"/>
-                <w:b w:val="0"/>
-                <w:i w:val="0"/>
-                <w:sz w:val="20"/>
-              </w:rPr>
-              <w:t>Deploy ativo em homologação (API Gateway)</w:t>
-            </w:r>
-          </w:p>
-        </w:tc>
-        <w:tc>
-          <w:tcPr>
-            <w:tcW w:type="dxa" w:w="5102"/>
-          </w:tcPr>
-          <w:p>
-            <w:pPr>
-              <w:spacing w:after="40"/>
-            </w:pPr>
-            <w:r/>
-            <w:r>
-              <w:rPr>
-                <w:rFonts w:ascii="Times New Roman" w:hAnsi="Times New Roman"/>
-                <w:b w:val="0"/>
-                <w:i w:val="0"/>
-                <w:sz w:val="20"/>
-              </w:rPr>
-              <w:t>&lt;preencher com o output api_gateway_url&gt;</w:t>
+              <w:t>https://youtu.be/hT5m2dWdpwI</w:t>
             </w:r>
           </w:p>
         </w:tc>
@@ -678,49 +636,7 @@
                 <w:i w:val="0"/>
                 <w:sz w:val="20"/>
               </w:rPr>
-              <w:t>&lt;api_gateway_url&gt;/swagger-ui.html</w:t>
-            </w:r>
-          </w:p>
-        </w:tc>
-      </w:tr>
-      <w:tr>
-        <w:tc>
-          <w:tcPr>
-            <w:tcW w:type="dxa" w:w="3969"/>
-          </w:tcPr>
-          <w:p>
-            <w:pPr>
-              <w:spacing w:after="40"/>
-            </w:pPr>
-            <w:r/>
-            <w:r>
-              <w:rPr>
-                <w:rFonts w:ascii="Times New Roman" w:hAnsi="Times New Roman"/>
-                <w:b w:val="0"/>
-                <w:i w:val="0"/>
-                <w:sz w:val="20"/>
-              </w:rPr>
-              <w:t>Dashboard de negócio (New Relic)</w:t>
-            </w:r>
-          </w:p>
-        </w:tc>
-        <w:tc>
-          <w:tcPr>
-            <w:tcW w:type="dxa" w:w="5102"/>
-          </w:tcPr>
-          <w:p>
-            <w:pPr>
-              <w:spacing w:after="40"/>
-            </w:pPr>
-            <w:r/>
-            <w:r>
-              <w:rPr>
-                <w:rFonts w:ascii="Times New Roman" w:hAnsi="Times New Roman"/>
-                <w:b w:val="0"/>
-                <w:i w:val="0"/>
-                <w:sz w:val="20"/>
-              </w:rPr>
-              <w:t>&lt;preencher&gt;</w:t>
+              <w:t>https://redocly.github.io/redoc/?url=https://raw.githubusercontent.com/Guilherme-Fumagali/tech-challenge-1/develop/docs/openapi.json</w:t>
             </w:r>
           </w:p>
         </w:tc>

</xml_diff>